<commit_message>
Update project evolution report with recent metrics and manual application management enhancements
</commit_message>
<xml_diff>
--- a/docs/informes/Informe_cronologico_Batch-Downloader_2026-07-28.docx
+++ b/docs/informes/Informe_cronologico_Batch-Downloader_2026-07-28.docx
@@ -92,13 +92,7 @@
         <w:jc w:val="center"/>
       </w:pPr>
       <w:r>
-        <w:rPr>
-          <w:rFonts w:ascii="Calibri" w:hAnsi="Calibri"/>
-          <w:b/>
-          <w:color w:val="202A35"/>
-          <w:sz w:val="23"/>
-        </w:rPr>
-        <w:t>Periodo analizado: 16 de junio - 28 de julio de 2026</w:t>
+        <w:t>Periodo analizado: 16 de junio - 29 de julio de 2026</w:t>
       </w:r>
     </w:p>
     <w:p>
@@ -107,13 +101,7 @@
         <w:jc w:val="center"/>
       </w:pPr>
       <w:r>
-        <w:rPr>
-          <w:rFonts w:ascii="Calibri" w:hAnsi="Calibri"/>
-          <w:i/>
-          <w:color w:val="5F6B78"/>
-          <w:sz w:val="19"/>
-        </w:rPr>
-        <w:t>Elaborado a partir de 17 conversaciones recuperadas, el historial Git y la documentación actual</w:t>
+        <w:t>Elaborado a partir de 18 conversaciones recuperadas, el historial Git y la documentación actual</w:t>
       </w:r>
     </w:p>
     <w:p>
@@ -142,13 +130,7 @@
     </w:p>
     <w:p>
       <w:r>
-        <w:rPr>
-          <w:rFonts w:ascii="Calibri" w:hAnsi="Calibri"/>
-          <w:i w:val="0"/>
-          <w:color w:val="202A35"/>
-          <w:sz w:val="22"/>
-        </w:rPr>
-        <w:t>El resultado actual es un monorepo en la rama development con 110 commits visibles, un Compose de 16 servicios, MySQL como autoridad transaccional del catálogo, PostgreSQL/pgvector como proyección reconstruible, RabbitMQ para eventos, MinIO para ZIP y artefactos, y una interfaz React/Vite servida por Nginx. La búsqueda semántica y la administración de modelos están integradas, aunque la evaluación completa que podría justificar la promoción de un modelo sigue pendiente de métricas finales.</w:t>
+        <w:t>El resultado actual es un monorepo en la rama development con 111 commits visibles, un Compose de 16 servicios, MySQL como autoridad transaccional del catálogo, PostgreSQL/pgvector como proyección reconstruible, RabbitMQ para eventos, MinIO para ZIP y artefactos, y una interfaz React/Vite servida por Nginx. La búsqueda semántica y la administración de modelos están integradas, aunque la evaluación completa que podría justificar la promoción de un modelo sigue pendiente de métricas finales. La administración de aplicaciones añade ahora resolución manual multinstalador y alta asistida desde la web oficial.</w:t>
       </w:r>
     </w:p>
     <w:p>
@@ -224,7 +206,7 @@
                 <w:color w:val="FFFFFF"/>
                 <w:sz w:val="36"/>
               </w:rPr>
-              <w:t>110</w:t>
+              <w:t>111</w:t>
             </w:r>
           </w:p>
         </w:tc>
@@ -252,7 +234,7 @@
                 <w:color w:val="FFFFFF"/>
                 <w:sz w:val="36"/>
               </w:rPr>
-              <w:t>17</w:t>
+              <w:t>18</w:t>
             </w:r>
           </w:p>
         </w:tc>
@@ -439,13 +421,7 @@
     </w:p>
     <w:p>
       <w:r>
-        <w:rPr>
-          <w:rFonts w:ascii="Calibri" w:hAnsi="Calibri"/>
-          <w:i w:val="0"/>
-          <w:color w:val="202A35"/>
-          <w:sz w:val="22"/>
-        </w:rPr>
-        <w:t>Este informe combina cuatro fuentes: historiales de tareas de Codex vinculadas al checkout principal, conversaciones del repositorio hermano de la memoria LaTeX, una tarea de organización del proyecto en GitHub y el historial Git local hasta el commit f54d477 del 28 de julio de 2026. También se contrastaron README.md, .github/copilot-instructions.md, los dos Compose y las fechas de los PDF de la memoria.</w:t>
+        <w:t>Este informe combina cuatro fuentes: historiales de tareas de Codex vinculadas al checkout principal, conversaciones del repositorio hermano de la memoria LaTeX, una tarea de organización del proyecto en GitHub y el historial Git local hasta el commit 814f0e8 del 28 de julio de 2026, verificado el 29 de julio. También se contrastaron README.md, .github/copilot-instructions.md, los dos Compose y el estado y las fechas de los PDF de la memoria.</w:t>
       </w:r>
     </w:p>
     <w:p>
@@ -1395,7 +1371,7 @@
                 <w:color w:val="202A35"/>
                 <w:sz w:val="18"/>
               </w:rPr>
-              <w:t>Correcciones recientes</w:t>
+              <w:t>Administración asistida y correcciones</w:t>
             </w:r>
           </w:p>
         </w:tc>
@@ -1420,7 +1396,7 @@
                 <w:color w:val="202A35"/>
                 <w:sz w:val="18"/>
               </w:rPr>
-              <w:t>Snapshots de evaluación, benchmark semántico sin ranking literal, estado vacío y serialización UUID.</w:t>
+              <w:t>Snapshots de evaluación, UUID, resolución manual multinstalador y alta desde web oficial.</w:t>
             </w:r>
           </w:p>
         </w:tc>
@@ -1894,18 +1870,30 @@
         <w:pStyle w:val="Heading2"/>
       </w:pPr>
       <w:r>
-        <w:t>28 de julio - Ajustes recientes</w:t>
+        <w:t>28 de julio - Administración asistida y ajustes recientes</w:t>
       </w:r>
     </w:p>
     <w:p>
       <w:r>
-        <w:rPr>
-          <w:rFonts w:ascii="Calibri" w:hAnsi="Calibri"/>
-          <w:i w:val="0"/>
-          <w:color w:val="202A35"/>
-          <w:sz w:val="22"/>
-        </w:rPr>
-        <w:t>Se integraron snapshots de evaluación y manejo de consultas semánticas, se corrigió el estado vacío del panel de detalle y se resolvió un fallo al crear bundles: owner_id llegaba a MySQL como objeto Java serializado en vez de UUID textual. La rama development quedó limpia en el commit f54d477 después de 110 commits visibles.</w:t>
+        <w:t>Se integraron snapshots de evaluación y manejo de consultas semánticas, se corrigió el estado vacío del panel de detalle y se resolvió un fallo al crear bundles: owner_id llegaba a MySQL como objeto Java serializado en vez de UUID textual.</w:t>
+      </w:r>
+    </w:p>
+    <w:p>
+      <w:pPr/>
+      <w:r>
+        <w:t>La administración incorporó un banco de resolución para aplicaciones review o missing. El operador aporta una página de origen y una o varias URI opcionales para Windows, macOS y Linux; cada URI se valida contra su plataforma, se cifra por separado y la cola transporta únicamente el identificador de inspección. La previsualización no modifica el catálogo y la publicación revalida y crea o reutiliza las fuentes en una sola transacción.</w:t>
+      </w:r>
+    </w:p>
+    <w:p>
+      <w:pPr/>
+      <w:r>
+        <w:t>El alta de una aplicación nueva se redujo a su web oficial, con URI por sistema operativo opcionales. Un trabajo persistente extrae metadatos permitidos, genera la descripción larga, busca instaladores y presenta una previsualización editable sin revelar enlaces ejecutables. Si no queda ningún candidato fiable tras la revalidación, la aplicación se conserva como missing en lugar de publicar una descarga dudosa.</w:t>
+      </w:r>
+    </w:p>
+    <w:p>
+      <w:pPr/>
+      <w:r>
+        <w:t>La conversación final registró 189 pruebas del scraper, incluida integración MySQL, 59 de Core, 76 del frontend y build de producción, además de Ruff, compileall, Redocly, traducciones, ambos Compose y git diff --check. Son resultados históricos de esa implementación; este informe no arrancó ni volvió a ejecutar la aplicación completa. Los dos commits posteriores al corte anterior dejaron HEAD en 814f0e8 y 111 commits visibles.</w:t>
       </w:r>
     </w:p>
     <w:p>
@@ -2692,6 +2680,50 @@
     </w:p>
     <w:p>
       <w:pPr>
+        <w:pStyle w:val="Heading2"/>
+      </w:pPr>
+      <w:r>
+        <w:t>10. Alta y resolución manual seguras</w:t>
+      </w:r>
+    </w:p>
+    <w:p>
+      <w:pPr/>
+      <w:r>
+        <w:rPr>
+          <w:b/>
+        </w:rPr>
+        <w:t xml:space="preserve">Problema: </w:t>
+      </w:r>
+      <w:r>
+        <w:t>una aplicación sin fuente fiable exigía completar muchos campos a mano, y una respuesta tardía podía restaurar una previsualización que el operador había descartado con «Nueva». Algunas páginas oficiales, como una variante de FileZilla, también respondían 403 solo por parámetros no sensibles.</w:t>
+      </w:r>
+    </w:p>
+    <w:p>
+      <w:pPr/>
+      <w:r>
+        <w:rPr>
+          <w:b/>
+        </w:rPr>
+        <w:t xml:space="preserve">Solución: </w:t>
+      </w:r>
+      <w:r>
+        <w:t>trabajos persistentes manual_installer_enrichment y website_app_discovery, URI cifradas por sistema operativo, recuperación separada del descarte explícito, fallback limitado sin query únicamente tras 401/403 seguro, y apply atómico con revalidación de binarios y versión esperada.</w:t>
+      </w:r>
+    </w:p>
+    <w:p>
+      <w:pPr/>
+      <w:r>
+        <w:rPr>
+          <w:b/>
+        </w:rPr>
+        <w:t xml:space="preserve">Impacto: </w:t>
+      </w:r>
+      <w:r>
+        <w:t>la administración puede recuperar aplicaciones review/missing y crear altas desde una web oficial sin exponer URL ejecutables ni rebajar las garantías SSRF. Las respuestas tardías ya no repueblan una alta nueva.</w:t>
+      </w:r>
+    </w:p>
+    <w:p>
+      <w:pPr>
         <w:pStyle w:val="Heading1"/>
       </w:pPr>
       <w:r>
@@ -2718,12 +2750,7 @@
         <w:spacing w:after="160" w:line="280" w:lineRule="auto"/>
       </w:pPr>
       <w:r>
-        <w:rPr>
-          <w:rFonts w:ascii="Calibri" w:hAnsi="Calibri"/>
-          <w:color w:val="202A35"/>
-          <w:sz w:val="22"/>
-        </w:rPr>
-        <w:t>Winstall y páginas oficiales alimentan el pipeline persistente searcher_filter -&gt; filter_scraper -&gt; scraper_so_filter -&gt; so_filter_descriptor.</w:t>
+        <w:t>Winstall y páginas oficiales alimentan el pipeline persistente searcher_filter -&gt; filter_scraper -&gt; scraper_so_filter -&gt; so_filter_descriptor. Los trabajos manual_installer_enrichment y website_app_discovery se ejecutan aparte con concurrencia uno y conservan las mismas reglas de leases, cifrado y revalidación.</w:t>
       </w:r>
     </w:p>
     <w:p>
@@ -2833,7 +2860,7 @@
         <w:pStyle w:val="Heading1"/>
       </w:pPr>
       <w:r>
-        <w:t>Estado actual al 28 de julio de 2026</w:t>
+        <w:t>Estado actual al 29 de julio de 2026</w:t>
       </w:r>
     </w:p>
     <w:tbl>
@@ -3043,7 +3070,7 @@
                 <w:color w:val="202A35"/>
                 <w:sz w:val="17"/>
               </w:rPr>
-              <w:t>development, HEAD f54d477, 110 commits visibles y árbol limpio.</w:t>
+              <w:t>development, HEAD 814f0e8, 111 commits visibles y estado versionado limpio antes de editar este informe.</w:t>
             </w:r>
           </w:p>
         </w:tc>
@@ -3247,7 +3274,7 @@
                 <w:color w:val="202A35"/>
                 <w:sz w:val="17"/>
               </w:rPr>
-              <w:t>Pipeline persistente, validación multi-estrategia, leases, reintentos y controles admin.</w:t>
+              <w:t>Pipeline persistente, validación multi-estrategia, resolución manual, alta desde web oficial, leases, reintentos y controles admin.</w:t>
             </w:r>
           </w:p>
         </w:tc>
@@ -3272,7 +3299,7 @@
                 <w:color w:val="202A35"/>
                 <w:sz w:val="17"/>
               </w:rPr>
-              <w:t>Los bloqueos externos reales seguirán produciendo review/missing.</w:t>
+              <w:t>Reconstruir y verificar en despliegue las migraciones 0012-0015 y los nuevos flujos.</w:t>
             </w:r>
           </w:p>
         </w:tc>
@@ -3655,7 +3682,7 @@
                 <w:color w:val="202A35"/>
                 <w:sz w:val="17"/>
               </w:rPr>
-              <w:t>Memoria, anexos, diagramas, README, contratos e instrucciones actualizados.</w:t>
+              <w:t>Memoria, anexos, diagramas, README, contratos e instrucciones actualizados en distinto grado; README y Copilot ya recogen los flujos administrativos nuevos.</w:t>
             </w:r>
           </w:p>
         </w:tc>
@@ -3680,7 +3707,7 @@
                 <w:color w:val="202A35"/>
                 <w:sz w:val="17"/>
               </w:rPr>
-              <w:t>El árbol LaTeX está modificado; memoria.pdf y anexos.pdf tienen fechas distintas y falta una verificación final conjunta.</w:t>
+              <w:t>LaTeX aún conserva semántica híbrida/RRF y no refleja la pantalla de modelos ni la nueva administración; los PDF requieren reconstrucción conjunta.</w:t>
             </w:r>
           </w:p>
         </w:tc>
@@ -3827,12 +3854,19 @@
         <w:spacing w:after="160" w:line="280" w:lineRule="auto"/>
       </w:pPr>
       <w:r>
-        <w:rPr>
-          <w:rFonts w:ascii="Calibri" w:hAnsi="Calibri"/>
-          <w:color w:val="202A35"/>
-          <w:sz w:val="22"/>
-        </w:rPr>
-        <w:t>Recompilar y revisar visualmente memoria.pdf y anexos.pdf desde el mismo estado actual del árbol LaTeX; hoy sus fechas no coinciden y existen cambios sin consolidar.</w:t>
+        <w:t>Actualizar las fuentes LaTeX que aún describen búsqueda híbrida/RRF y ausencia de pantalla administrativa de modelos, incorporar los nuevos flujos de alta/resolución y después recompilar y revisar visualmente memoria.pdf y anexos.pdf. Los PDF actuales siguen fechados el 23 y el 21 de julio, respectivamente.</w:t>
+      </w:r>
+    </w:p>
+    <w:p>
+      <w:pPr>
+        <w:numPr>
+          <w:ilvl w:val="0"/>
+          <w:numId w:val="10"/>
+        </w:numPr>
+        <w:spacing w:after="160" w:line="280" w:lineRule="auto"/>
+      </w:pPr>
+      <w:r>
+        <w:t>Reconstruir el despliegue y verificar manualmente las migraciones 0012-0015 y los flujos administrativos de resolución multinstalador y alta desde web oficial; el código y las pruebas están confirmados, pero la conversación no arrancó ni reinició la aplicación completa.</w:t>
       </w:r>
     </w:p>
     <w:p>
@@ -5482,6 +5516,83 @@
           </w:p>
         </w:tc>
       </w:tr>
+      <w:tr>
+        <w:tc>
+          <w:tcPr>
+            <w:tcW w:type="dxa" w:w="1200"/>
+            <w:tcMar>
+              <w:top w:w="80" w:type="dxa"/>
+              <w:start w:w="120" w:type="dxa"/>
+              <w:bottom w:w="80" w:type="dxa"/>
+              <w:end w:w="120" w:type="dxa"/>
+            </w:tcMar>
+            <w:vAlign w:val="center"/>
+          </w:tcPr>
+          <w:p>
+            <w:pPr>
+              <w:spacing w:after="0" w:line="252" w:lineRule="auto"/>
+            </w:pPr>
+            <w:r>
+              <w:rPr>
+                <w:rFonts w:ascii="Calibri" w:hAnsi="Calibri"/>
+                <w:color w:val="202A35"/>
+                <w:sz w:val="17"/>
+              </w:rPr>
+              <w:t>28 jul</w:t>
+            </w:r>
+          </w:p>
+        </w:tc>
+        <w:tc>
+          <w:tcPr>
+            <w:tcW w:type="dxa" w:w="4200"/>
+            <w:tcMar>
+              <w:top w:w="80" w:type="dxa"/>
+              <w:start w:w="120" w:type="dxa"/>
+              <w:bottom w:w="80" w:type="dxa"/>
+              <w:end w:w="120" w:type="dxa"/>
+            </w:tcMar>
+            <w:vAlign w:val="center"/>
+          </w:tcPr>
+          <w:p>
+            <w:pPr>
+              <w:spacing w:after="0" w:line="252" w:lineRule="auto"/>
+            </w:pPr>
+            <w:r>
+              <w:rPr>
+                <w:rFonts w:ascii="Calibri" w:hAnsi="Calibri"/>
+                <w:color w:val="202A35"/>
+                <w:sz w:val="17"/>
+              </w:rPr>
+              <w:t>Mejora edición manual de apps</w:t>
+            </w:r>
+          </w:p>
+        </w:tc>
+        <w:tc>
+          <w:tcPr>
+            <w:tcW w:type="dxa" w:w="3960"/>
+            <w:tcMar>
+              <w:top w:w="80" w:type="dxa"/>
+              <w:start w:w="120" w:type="dxa"/>
+              <w:bottom w:w="80" w:type="dxa"/>
+              <w:end w:w="120" w:type="dxa"/>
+            </w:tcMar>
+            <w:vAlign w:val="center"/>
+          </w:tcPr>
+          <w:p>
+            <w:pPr>
+              <w:spacing w:after="0" w:line="252" w:lineRule="auto"/>
+            </w:pPr>
+            <w:r>
+              <w:rPr>
+                <w:rFonts w:ascii="Calibri" w:hAnsi="Calibri"/>
+                <w:color w:val="202A35"/>
+                <w:sz w:val="17"/>
+              </w:rPr>
+              <w:t>019fa81c-b869-7813-9591-4ae4ac4522e3</w:t>
+            </w:r>
+          </w:p>
+        </w:tc>
+      </w:tr>
     </w:tbl>
     <w:p>
       <w:pPr>
@@ -5622,7 +5733,7 @@
                 <w:color w:val="202A35"/>
                 <w:sz w:val="18"/>
               </w:rPr>
-              <w:t>110 commits visibles entre 16 de junio y 28 de julio; HEAD f54d477; rama development; árbol limpio durante la elaboración.</w:t>
+              <w:t>111 commits visibles entre 16 de junio y 28 de julio; HEAD 814f0e8; rama development; estado versionado limpio antes de editar el informe.</w:t>
             </w:r>
           </w:p>
         </w:tc>
@@ -5674,7 +5785,7 @@
                 <w:color w:val="202A35"/>
                 <w:sz w:val="18"/>
               </w:rPr>
-              <w:t>Describe Compose local/GHCR, búsqueda lexical|semantic, administración de modelos y CPython 3.14t.</w:t>
+              <w:t>Describe Compose local/GHCR, búsqueda lexical|semantic, administración de modelos, CPython 3.14t, banco de resolución manual y alta desde web oficial.</w:t>
             </w:r>
           </w:p>
         </w:tc>
@@ -5726,7 +5837,7 @@
                 <w:color w:val="202A35"/>
                 <w:sz w:val="18"/>
               </w:rPr>
-              <w:t>Consolida propietarios de datos, pipeline actual, contratos, seguridad, estados públicos y reglas de promoción semántica.</w:t>
+              <w:t>Consolida propietarios de datos, pipeline actual, contratos, seguridad, estados públicos, reglas de promoción semántica y garantías de los dos nuevos flujos administrativos.</w:t>
             </w:r>
           </w:p>
         </w:tc>
@@ -5778,7 +5889,7 @@
                 <w:color w:val="202A35"/>
                 <w:sz w:val="18"/>
               </w:rPr>
-              <w:t>El comando config --services enumeró 16 servicios en la configuración normal.</w:t>
+              <w:t>docker compose config --services volvió a enumerar 16 servicios tanto en la configuración local como en GHCR.</w:t>
             </w:r>
           </w:p>
         </w:tc>
@@ -5830,7 +5941,7 @@
                 <w:color w:val="202A35"/>
                 <w:sz w:val="18"/>
               </w:rPr>
-              <w:t>El árbol hermano mantiene cambios sin consolidar; build/memoria.pdf es del 23 de julio y build/anexos.pdf del 21 de julio.</w:t>
+              <w:t>El árbol hermano mantiene 20 archivos versionados modificados y nuevos diagramas; build/memoria.pdf es del 23 de julio y build/anexos.pdf del 21. Las fuentes aún describen búsqueda híbrida/RRF y ausencia de pantalla administrativa de modelos.</w:t>
             </w:r>
           </w:p>
         </w:tc>
@@ -5851,13 +5962,7 @@
     </w:p>
     <w:p>
       <w:r>
-        <w:rPr>
-          <w:rFonts w:ascii="Calibri" w:hAnsi="Calibri"/>
-          <w:i w:val="0"/>
-          <w:color w:val="202A35"/>
-          <w:sz w:val="22"/>
-        </w:rPr>
-        <w:t>Batch-Downloader ya no es solo un descargador por lotes. Es una plataforma de catálogo y resolución de software con trazabilidad, administración, descargas asíncronas y búsqueda semántica local. El siguiente salto de madurez no depende tanto de añadir nuevos componentes como de cerrar la evaluación semántica completa, sincronizar la documentación final y seguir preservando las invariantes operativas que surgieron de los problemas reales.</w:t>
+        <w:t>Batch-Downloader ya no es solo un descargador por lotes. Es una plataforma de catálogo y resolución de software con trazabilidad, administración asistida, descargas asíncronas y búsqueda semántica local. El siguiente salto de madurez no depende tanto de añadir nuevos componentes como de validar en despliegue los flujos recién incorporados, cerrar la evaluación semántica completa, sincronizar la documentación final y seguir preservando las invariantes operativas que surgieron de los problemas reales.</w:t>
       </w:r>
     </w:p>
     <w:sectPr>

</xml_diff>

<commit_message>
Añadidos comentarios de cabecera a todas las clases y funciones. (creo)
</commit_message>
<xml_diff>
--- a/docs/informes/Informe_cronologico_Batch-Downloader_2026-07-28.docx
+++ b/docs/informes/Informe_cronologico_Batch-Downloader_2026-07-28.docx
@@ -92,7 +92,7 @@
         <w:jc w:val="center"/>
       </w:pPr>
       <w:r>
-        <w:t>Periodo analizado: 16 de junio - 29 de julio de 2026</w:t>
+        <w:t>Periodo analizado: 16 de junio - 30 de julio de 2026</w:t>
       </w:r>
     </w:p>
     <w:p>
@@ -101,7 +101,7 @@
         <w:jc w:val="center"/>
       </w:pPr>
       <w:r>
-        <w:t>Elaborado a partir de 18 conversaciones recuperadas, el historial Git y la documentación actual</w:t>
+        <w:t>Elaborado a partir de 20 conversaciones recuperadas, el historial Git y la documentación actual</w:t>
       </w:r>
     </w:p>
     <w:p>
@@ -130,7 +130,7 @@
     </w:p>
     <w:p>
       <w:r>
-        <w:t>El resultado actual es un monorepo en la rama development con 111 commits visibles, un Compose de 16 servicios, MySQL como autoridad transaccional del catálogo, PostgreSQL/pgvector como proyección reconstruible, RabbitMQ para eventos, MinIO para ZIP y artefactos, y una interfaz React/Vite servida por Nginx. La búsqueda semántica y la administración de modelos están integradas, aunque la evaluación completa que podría justificar la promoción de un modelo sigue pendiente de métricas finales. La administración de aplicaciones añade ahora resolución manual multinstalador y alta asistida desde la web oficial.</w:t>
+        <w:t>El resultado actual es un monorepo en la rama development con 115 commits visibles y un Compose de 16 servicios. MySQL mantiene la autoridad transaccional del catálogo y PostgreSQL/pgvector sigue siendo una proyección reconstruible. La descarga por lotes publica ahora cada resultado al terminar, separa el empaquetado real, conserva fallos por aplicación y puede incluir accesos seguros a páginas oficiales. La búsqueda semántica respeta el orden elegido por el usuario y usa la relevancia como desempate. La evaluación completa que podría justificar la promoción de un modelo sigue pendiente de métricas finales.</w:t>
       </w:r>
     </w:p>
     <w:p>
@@ -206,7 +206,7 @@
                 <w:color w:val="FFFFFF"/>
                 <w:sz w:val="36"/>
               </w:rPr>
-              <w:t>111</w:t>
+              <w:t>115</w:t>
             </w:r>
           </w:p>
         </w:tc>
@@ -234,7 +234,7 @@
                 <w:color w:val="FFFFFF"/>
                 <w:sz w:val="36"/>
               </w:rPr>
-              <w:t>18</w:t>
+              <w:t>20</w:t>
             </w:r>
           </w:p>
         </w:tc>
@@ -421,7 +421,7 @@
     </w:p>
     <w:p>
       <w:r>
-        <w:t>Este informe combina cuatro fuentes: historiales de tareas de Codex vinculadas al checkout principal, conversaciones del repositorio hermano de la memoria LaTeX, una tarea de organización del proyecto en GitHub y el historial Git local hasta el commit 814f0e8 del 28 de julio de 2026, verificado el 29 de julio. También se contrastaron README.md, .github/copilot-instructions.md, los dos Compose y el estado y las fechas de los PDF de la memoria.</w:t>
+        <w:t>Este informe combina cuatro fuentes: historiales de tareas de Codex vinculadas al checkout principal, conversaciones del repositorio hermano de la memoria LaTeX, una tarea de organización del proyecto en GitHub y el historial Git local hasta el commit 4703841 del 29 de julio de 2026, verificado el 30 de julio. También se contrastaron README.md, .github/copilot-instructions.md, los dos Compose, los cambios locales y el estado y las fechas de los PDF de la memoria.</w:t>
       </w:r>
     </w:p>
     <w:p>
@@ -489,7 +489,7 @@
           <w:color w:val="202A35"/>
           <w:sz w:val="22"/>
         </w:rPr>
-        <w:t>No se arrancó de nuevo la aplicación completa para preparar este informe. El estado actual se verificó mediante Git, configuración y documentación, respetando la preferencia del proyecto de reservar la prueba manual de la aplicación al usuario.</w:t>
+        <w:t>No se arrancó ni reinició la aplicación completa para preparar este informe. La tarea de descargas sí dejó evidencia histórica de pruebas en navegador sobre el despliegue ya activo y de una reparación concreta de las fuentes de itch; esos resultados se distinguen del código que todavía requiere reconstrucción. El resto del estado actual se verificó mediante Git, configuración, pruebas focalizadas y documentación.</w:t>
       </w:r>
     </w:p>
     <w:p>
@@ -1401,6 +1401,83 @@
           </w:p>
         </w:tc>
       </w:tr>
+      <w:tr>
+        <w:tc>
+          <w:tcPr>
+            <w:tcW w:type="dxa" w:w="1500"/>
+            <w:tcMar>
+              <w:top w:w="80" w:type="dxa"/>
+              <w:start w:w="120" w:type="dxa"/>
+              <w:bottom w:w="80" w:type="dxa"/>
+              <w:end w:w="120" w:type="dxa"/>
+            </w:tcMar>
+            <w:vAlign w:val="center"/>
+          </w:tcPr>
+          <w:p>
+            <w:pPr>
+              <w:spacing w:after="0" w:line="252" w:lineRule="auto"/>
+            </w:pPr>
+            <w:r>
+              <w:rPr>
+                <w:rFonts w:ascii="Calibri" w:hAnsi="Calibri"/>
+                <w:color w:val="202A35"/>
+                <w:sz w:val="18"/>
+              </w:rPr>
+              <w:t>29-30 jul</w:t>
+            </w:r>
+          </w:p>
+        </w:tc>
+        <w:tc>
+          <w:tcPr>
+            <w:tcW w:type="dxa" w:w="2100"/>
+            <w:tcMar>
+              <w:top w:w="80" w:type="dxa"/>
+              <w:start w:w="120" w:type="dxa"/>
+              <w:bottom w:w="80" w:type="dxa"/>
+              <w:end w:w="120" w:type="dxa"/>
+            </w:tcMar>
+            <w:vAlign w:val="center"/>
+          </w:tcPr>
+          <w:p>
+            <w:pPr>
+              <w:spacing w:after="0" w:line="252" w:lineRule="auto"/>
+            </w:pPr>
+            <w:r>
+              <w:rPr>
+                <w:rFonts w:ascii="Calibri" w:hAnsi="Calibri"/>
+                <w:color w:val="202A35"/>
+                <w:sz w:val="18"/>
+              </w:rPr>
+              <w:t>Descargas y documentación</w:t>
+            </w:r>
+          </w:p>
+        </w:tc>
+        <w:tc>
+          <w:tcPr>
+            <w:tcW w:type="dxa" w:w="5760"/>
+            <w:tcMar>
+              <w:top w:w="80" w:type="dxa"/>
+              <w:start w:w="120" w:type="dxa"/>
+              <w:bottom w:w="80" w:type="dxa"/>
+              <w:end w:w="120" w:type="dxa"/>
+            </w:tcMar>
+            <w:vAlign w:val="center"/>
+          </w:tcPr>
+          <w:p>
+            <w:pPr>
+              <w:spacing w:after="0" w:line="252" w:lineRule="auto"/>
+            </w:pPr>
+            <w:r>
+              <w:rPr>
+                <w:rFonts w:ascii="Calibri" w:hAnsi="Calibri"/>
+                <w:color w:val="202A35"/>
+                <w:sz w:val="18"/>
+              </w:rPr>
+              <w:t>Progreso por item, overlay global, MANUAL_ONLY, accesos .url, orden respetado y cobertura documental Java/Python.</w:t>
+            </w:r>
+          </w:p>
+        </w:tc>
+      </w:tr>
     </w:tbl>
     <w:p>
       <w:pPr>
@@ -1894,6 +1971,39 @@
       <w:pPr/>
       <w:r>
         <w:t>La conversación final registró 189 pruebas del scraper, incluida integración MySQL, 59 de Core, 76 del frontend y build de producción, además de Ruff, compileall, Redocly, traducciones, ambos Compose y git diff --check. Son resultados históricos de esa implementación; este informe no arrancó ni volvió a ejecutar la aplicación completa. Los dos commits posteriores al corte anterior dejaron HEAD en 814f0e8 y 111 commits visibles.</w:t>
+      </w:r>
+    </w:p>
+    <w:p>
+      <w:pPr>
+        <w:pStyle w:val="Heading2"/>
+      </w:pPr>
+      <w:r>
+        <w:t>29-30 de julio - Descargas progresivas, orden y documentación interna</w:t>
+      </w:r>
+    </w:p>
+    <w:p>
+      <w:r>
+        <w:t>La descarga por lotes se convirtió en un flujo progresivo: cada item publica COMPLETED o FAILED cuando termina, el progreso de aplicaciones alcanza el 90 %, PACKAGING representa la generación real del ZIP y READY, PARTIAL o MANUAL_ONLY habilitan la entrega. La interfaz centraliza trabajos simultáneos en un overlay global, los recupera tras navegar o recargar, intenta la descarga automática una sola vez y mantiene siempre el enlace manual.</w:t>
+      </w:r>
+    </w:p>
+    <w:p>
+      <w:r>
+        <w:t>Los fallos muestran ahora la aplicación afectada y el worker consulta a Core una sola vez para obtener nombre y página oficial cuando necesita crear Descargas manuales/&lt;aplicación&gt;.url. RabbitMQ conserva únicamente identificadores; las páginas deben ser HTTPS públicas y las URL resueltas de instaladores no llegan a eventos, manifests ni logs. También se añadió MANUAL_ONLY para trabajos sin instalador pero con al menos un acceso manual válido, y un recuperador publica el fallo global antes de la DLQ.</w:t>
+      </w:r>
+    </w:p>
+    <w:p>
+      <w:r>
+        <w:t>Las pruebas sobre el despliegue activo distinguieron dos defectos de proveedores: itch conservaba una fuente caducada y Paradox había cambiado tamaño y MIME sin cambiar el enlace. itch quedó reparado en vivo con sus endpoints oficiales de Windows, macOS y Linux; el código dejó de rechazar cambios históricos de tamaño/MIME sin SHA-256 fijado. La segunda descarga observada terminó 16/17; el arreglo de Paradox quedó pendiente de reconstruir el worker desplegado.</w:t>
+      </w:r>
+    </w:p>
+    <w:p>
+      <w:r>
+        <w:t>El orden del catálogo se corrigió para búsquedas literales y semánticas: más descargadas, actualizadas o nombre es ahora el criterio principal en MySQL y la relevancia solo desempata. La URL y el frontend ya enviaban sort correctamente, por lo que la corrección quedó localizada en Core y en sus contratos y pruebas.</w:t>
+      </w:r>
+    </w:p>
+    <w:p>
+      <w:r>
+        <w:t>Por último se completó una campaña documental sobre 310 ficheros versionados: 189 Java y 121 Python. Se documentaron módulos, tipos, métodos, campos, componentes record, funciones y atributos con prosa española, sin cambiar la semántica salvo un marcador de migración y su prueba. El resultado sigue como cambio local no confirmado; la equivalencia AST/bytecode y las suites documentadas reducen el riesgo, pero no sustituyen su revisión y commit.</w:t>
       </w:r>
     </w:p>
     <w:p>
@@ -2724,6 +2834,138 @@
     </w:p>
     <w:p>
       <w:pPr>
+        <w:pStyle w:val="Heading2"/>
+      </w:pPr>
+      <w:r>
+        <w:t>11. Progreso, fallos y entrega de descargas</w:t>
+      </w:r>
+    </w:p>
+    <w:p>
+      <w:pPr/>
+      <w:r>
+        <w:rPr>
+          <w:b/>
+        </w:rPr>
+        <w:t xml:space="preserve">Problema: </w:t>
+      </w:r>
+      <w:r>
+        <w:t>el contador saltaba de cero al total, el empaquetado no tenía una fase real, un fallo individual era poco explicativo y el navegador exigía una acción manual adicional.</w:t>
+      </w:r>
+    </w:p>
+    <w:p>
+      <w:pPr/>
+      <w:r>
+        <w:rPr>
+          <w:b/>
+        </w:rPr>
+        <w:t xml:space="preserve">Solución: </w:t>
+      </w:r>
+      <w:r>
+        <w:t>finalización por orden real, PACKAGING hasta cerrar el ZIP, overlay global recuperable, descarga automática idempotente, errores por aplicación y accesos .url seguros a páginas oficiales.</w:t>
+      </w:r>
+    </w:p>
+    <w:p>
+      <w:pPr/>
+      <w:r>
+        <w:rPr>
+          <w:b/>
+        </w:rPr>
+        <w:t xml:space="preserve">Impacto: </w:t>
+      </w:r>
+      <w:r>
+        <w:t>el usuario ve avance útil, conserva una vía manual y un proveedor defectuoso no oculta ni bloquea el resultado del resto del lote.</w:t>
+      </w:r>
+    </w:p>
+    <w:p>
+      <w:pPr>
+        <w:pStyle w:val="Heading2"/>
+      </w:pPr>
+      <w:r>
+        <w:t>12. Orden solicitado frente a relevancia</w:t>
+      </w:r>
+    </w:p>
+    <w:p>
+      <w:pPr/>
+      <w:r>
+        <w:rPr>
+          <w:b/>
+        </w:rPr>
+        <w:t xml:space="preserve">Problema: </w:t>
+      </w:r>
+      <w:r>
+        <w:t>al buscar, la relevancia literal o semántica se imponía a «Más descargadas», «Actualizadas» o «Nombre».</w:t>
+      </w:r>
+    </w:p>
+    <w:p>
+      <w:pPr/>
+      <w:r>
+        <w:rPr>
+          <w:b/>
+        </w:rPr>
+        <w:t xml:space="preserve">Solución: </w:t>
+      </w:r>
+      <w:r>
+        <w:t>MySQL aplica el criterio solicitado como orden principal y usa la relevancia únicamente como desempate, tanto en modo lexical como semantic.</w:t>
+      </w:r>
+    </w:p>
+    <w:p>
+      <w:pPr/>
+      <w:r>
+        <w:rPr>
+          <w:b/>
+        </w:rPr>
+        <w:t xml:space="preserve">Impacto: </w:t>
+      </w:r>
+      <w:r>
+        <w:t>el selector vuelve a describir el orden visible sin perder el conjunto de candidatos semánticos.</w:t>
+      </w:r>
+    </w:p>
+    <w:p>
+      <w:pPr>
+        <w:pStyle w:val="Heading2"/>
+      </w:pPr>
+      <w:r>
+        <w:t>13. Cobertura documental del código</w:t>
+      </w:r>
+    </w:p>
+    <w:p>
+      <w:pPr/>
+      <w:r>
+        <w:rPr>
+          <w:b/>
+        </w:rPr>
+        <w:t xml:space="preserve">Problema: </w:t>
+      </w:r>
+      <w:r>
+        <w:t>clases, funciones y variables mezclaban documentación parcial, inglés, placeholders o excepciones que no podían propagarse.</w:t>
+      </w:r>
+    </w:p>
+    <w:p>
+      <w:pPr/>
+      <w:r>
+        <w:rPr>
+          <w:b/>
+        </w:rPr>
+        <w:t xml:space="preserve">Solución: </w:t>
+      </w:r>
+      <w:r>
+        <w:t>cobertura estructural de 310 ficheros Java/Python, Javadoc y docstrings en español, validación PEP 257/doclint y comparación semántica mediante AST y bytecode.</w:t>
+      </w:r>
+    </w:p>
+    <w:p>
+      <w:pPr/>
+      <w:r>
+        <w:rPr>
+          <w:b/>
+        </w:rPr>
+        <w:t xml:space="preserve">Impacto: </w:t>
+      </w:r>
+      <w:r>
+        <w:t>el código resulta más navegable y los hovers son útiles, aunque el lote permanece sin confirmar en Git y debe revisarse como cambio local.</w:t>
+      </w:r>
+    </w:p>
+    <w:p>
+      <w:pPr>
         <w:pStyle w:val="Heading1"/>
       </w:pPr>
       <w:r>
@@ -2857,10 +3099,44 @@
     </w:p>
     <w:p>
       <w:pPr>
+        <w:numPr>
+          <w:ilvl w:val="0"/>
+          <w:numId w:val="11"/>
+        </w:numPr>
+        <w:spacing w:after="160" w:line="280" w:lineRule="auto"/>
+      </w:pPr>
+      <w:r>
+        <w:rPr>
+          <w:rFonts w:ascii="Calibri" w:hAnsi="Calibri"/>
+          <w:color w:val="202A35"/>
+          <w:sz w:val="22"/>
+        </w:rPr>
+        <w:t>Core expone además un endpoint interno autenticado de metadatos de items. El worker lo usa solo cuando hay fallos, valida la página oficial y puede construir accesos manuales sin transportar URLs ejecutables por RabbitMQ.</w:t>
+      </w:r>
+    </w:p>
+    <w:p>
+      <w:pPr>
+        <w:numPr>
+          <w:ilvl w:val="0"/>
+          <w:numId w:val="11"/>
+        </w:numPr>
+        <w:spacing w:after="160" w:line="280" w:lineRule="auto"/>
+      </w:pPr>
+      <w:r>
+        <w:rPr>
+          <w:rFonts w:ascii="Calibri" w:hAnsi="Calibri"/>
+          <w:color w:val="202A35"/>
+          <w:sz w:val="22"/>
+        </w:rPr>
+        <w:t>El frontend mantiene los trabajos de descarga en un proveedor global fuera de las rutas. sessionStorage conserva contexto e intentos automáticos y cada job mantiene una única conexión SSE recuperable durante la sesión.</w:t>
+      </w:r>
+    </w:p>
+    <w:p>
+      <w:pPr>
         <w:pStyle w:val="Heading1"/>
       </w:pPr>
       <w:r>
-        <w:t>Estado actual al 29 de julio de 2026</w:t>
+        <w:t>Estado actual al 30 de julio de 2026</w:t>
       </w:r>
     </w:p>
     <w:tbl>
@@ -3045,7 +3321,7 @@
                 <w:color w:val="202A35"/>
                 <w:sz w:val="17"/>
               </w:rPr>
-              <w:t>Confirmado</w:t>
+              <w:t>Confirmado con cambios locales</w:t>
             </w:r>
           </w:p>
         </w:tc>
@@ -3070,7 +3346,7 @@
                 <w:color w:val="202A35"/>
                 <w:sz w:val="17"/>
               </w:rPr>
-              <w:t>development, HEAD 814f0e8, 111 commits visibles y estado versionado limpio antes de editar este informe.</w:t>
+              <w:t>development, HEAD 4703841, 115 commits visibles y 310 ficheros modificados localmente por la campaña documental.</w:t>
             </w:r>
           </w:p>
         </w:tc>
@@ -3095,7 +3371,7 @@
                 <w:color w:val="202A35"/>
                 <w:sz w:val="17"/>
               </w:rPr>
-              <w:t>Mantener entregas documentales coordinadas con el código.</w:t>
+              <w:t>Revisar y confirmar el lote documental sin mezclarlo con cambios funcionales.</w:t>
             </w:r>
           </w:p>
         </w:tc>
@@ -3172,7 +3448,7 @@
                 <w:color w:val="202A35"/>
                 <w:sz w:val="17"/>
               </w:rPr>
-              <w:t>docker-compose.yml y docker-compose.ghcr.yml; 16 servicios en el Compose normal.</w:t>
+              <w:t>docker-compose.yml y docker-compose.ghcr.yml; 16 servicios. El worker declara Core como dependencia service_started y recibe URL/timeout internos.</w:t>
             </w:r>
           </w:p>
         </w:tc>
@@ -3274,7 +3550,7 @@
                 <w:color w:val="202A35"/>
                 <w:sz w:val="17"/>
               </w:rPr>
-              <w:t>Pipeline persistente, validación multi-estrategia, resolución manual, alta desde web oficial, leases, reintentos y controles admin.</w:t>
+              <w:t>Pipeline persistente, resolución manual, alta desde web oficial y reparación de fuentes conocidas; itch usa endpoints oficiales para tres plataformas.</w:t>
             </w:r>
           </w:p>
         </w:tc>
@@ -3299,7 +3575,7 @@
                 <w:color w:val="202A35"/>
                 <w:sz w:val="17"/>
               </w:rPr>
-              <w:t>Reconstruir y verificar en despliegue las migraciones 0012-0015 y los nuevos flujos.</w:t>
+              <w:t>Reconstruir y comprobar migraciones y reparación automática sobre un despliegue actualizado.</w:t>
             </w:r>
           </w:p>
         </w:tc>
@@ -3376,7 +3652,7 @@
                 <w:color w:val="202A35"/>
                 <w:sz w:val="17"/>
               </w:rPr>
-              <w:t>available/review/missing, contadores proyectados, filtros, facetas y URLs por UUID.</w:t>
+              <w:t>available/review/missing, filtros y facetas en MySQL; el orden solicitado es principal y la relevancia solo desempata.</w:t>
             </w:r>
           </w:p>
         </w:tc>
@@ -3478,7 +3754,7 @@
                 <w:color w:val="202A35"/>
                 <w:sz w:val="17"/>
               </w:rPr>
-              <w:t>Jobs asíncronos, revalidación JIT, resultados PARTIAL, ZIP en MinIO y cancelación.</w:t>
+              <w:t>Progreso por item, PACKAGING real, READY/PARTIAL/MANUAL_ONLY, overlay recuperable, descarga automática idempotente y .url seguros.</w:t>
             </w:r>
           </w:p>
         </w:tc>
@@ -3503,7 +3779,7 @@
                 <w:color w:val="202A35"/>
                 <w:sz w:val="17"/>
               </w:rPr>
-              <w:t>La fase de empaquetado grande aún puede parecer sin progreso incremental.</w:t>
+              <w:t>Reconstruir Core/worker/frontend y repetir el caso completo; Paradox no quedó confirmado en el worker desplegado.</w:t>
             </w:r>
           </w:p>
         </w:tc>
@@ -3682,7 +3958,7 @@
                 <w:color w:val="202A35"/>
                 <w:sz w:val="17"/>
               </w:rPr>
-              <w:t>Memoria, anexos, diagramas, README, contratos e instrucciones actualizados en distinto grado; README y Copilot ya recogen los flujos administrativos nuevos.</w:t>
+              <w:t>README, contratos, Copilot y Compose recogen las descargas progresivas y el nuevo orden. La campaña Java/Python cubre 310 ficheros y pasó sus auditorías.</w:t>
             </w:r>
           </w:p>
         </w:tc>
@@ -3707,7 +3983,7 @@
                 <w:color w:val="202A35"/>
                 <w:sz w:val="17"/>
               </w:rPr>
-              <w:t>LaTeX aún conserva semántica híbrida/RRF y no refleja la pantalla de modelos ni la nueva administración; los PDF requieren reconstrucción conjunta.</w:t>
+              <w:t>El lote documental sigue sin confirmar; LaTeX conserva contratos híbridos y de descarga antiguos, y los PDF requieren reconstrucción conjunta.</w:t>
             </w:r>
           </w:p>
         </w:tc>
@@ -3854,7 +4130,7 @@
         <w:spacing w:after="160" w:line="280" w:lineRule="auto"/>
       </w:pPr>
       <w:r>
-        <w:t>Actualizar las fuentes LaTeX que aún describen búsqueda híbrida/RRF y ausencia de pantalla administrativa de modelos, incorporar los nuevos flujos de alta/resolución y después recompilar y revisar visualmente memoria.pdf y anexos.pdf. Los PDF actuales siguen fechados el 23 y el 21 de julio, respectivamente.</w:t>
+        <w:t>Actualizar las fuentes LaTeX que aún describen búsqueda híbrida/RRF, ausencia de pantalla administrativa de modelos y un flujo de descargas anterior a MANUAL_ONLY, los accesos .url y el overlay progresivo. Después debe recompilarse y revisarse visualmente memoria.pdf y anexos.pdf; los PDF actuales siguen fechados el 23 y el 21 de julio, respectivamente.</w:t>
       </w:r>
     </w:p>
     <w:p>
@@ -3866,7 +4142,7 @@
         <w:spacing w:after="160" w:line="280" w:lineRule="auto"/>
       </w:pPr>
       <w:r>
-        <w:t>Reconstruir el despliegue y verificar manualmente las migraciones 0012-0015 y los flujos administrativos de resolución multinstalador y alta desde web oficial; el código y las pruebas están confirmados, pero la conversación no arrancó ni reinició la aplicación completa.</w:t>
+        <w:t>Reconstruir Core, download-worker y frontend en el orden documentado; verificar las migraciones 0012-0015 y V7, el avance item a item, PACKAGING, MANUAL_ONLY, la descarga automática y el arreglo de Paradox. La evidencia en navegador llegó a 16/17 con itch reparado, pero el worker activo no contenía todavía todas las correcciones.</w:t>
       </w:r>
     </w:p>
     <w:p>
@@ -3883,7 +4159,7 @@
           <w:color w:val="202A35"/>
           <w:sz w:val="22"/>
         </w:rPr>
-        <w:t>Añadir o exponer progreso incremental durante empaquetados/subidas grandes para reducir la percepción de bloqueo en bundles voluminosos.</w:t>
+        <w:t>Revisar y confirmar en Git el lote documental de 310 ficheros. Está validado como cambio no funcional, pero el working tree continúa modificado y no debe confundirse con una entrega ya integrada.</w:t>
       </w:r>
     </w:p>
     <w:p>
@@ -5593,6 +5869,160 @@
           </w:p>
         </w:tc>
       </w:tr>
+      <w:tr>
+        <w:tc>
+          <w:tcPr>
+            <w:tcW w:type="dxa" w:w="1200"/>
+            <w:tcMar>
+              <w:top w:w="80" w:type="dxa"/>
+              <w:start w:w="120" w:type="dxa"/>
+              <w:bottom w:w="80" w:type="dxa"/>
+              <w:end w:w="120" w:type="dxa"/>
+            </w:tcMar>
+            <w:vAlign w:val="center"/>
+          </w:tcPr>
+          <w:p>
+            <w:pPr>
+              <w:spacing w:after="0" w:line="252" w:lineRule="auto"/>
+            </w:pPr>
+            <w:r>
+              <w:rPr>
+                <w:rFonts w:ascii="Calibri" w:hAnsi="Calibri"/>
+                <w:color w:val="202A35"/>
+                <w:sz w:val="17"/>
+              </w:rPr>
+              <w:t>29 jul</w:t>
+            </w:r>
+          </w:p>
+        </w:tc>
+        <w:tc>
+          <w:tcPr>
+            <w:tcW w:type="dxa" w:w="4200"/>
+            <w:tcMar>
+              <w:top w:w="80" w:type="dxa"/>
+              <w:start w:w="120" w:type="dxa"/>
+              <w:bottom w:w="80" w:type="dxa"/>
+              <w:end w:w="120" w:type="dxa"/>
+            </w:tcMar>
+            <w:vAlign w:val="center"/>
+          </w:tcPr>
+          <w:p>
+            <w:pPr>
+              <w:spacing w:after="0" w:line="252" w:lineRule="auto"/>
+            </w:pPr>
+            <w:r>
+              <w:rPr>
+                <w:rFonts w:ascii="Calibri" w:hAnsi="Calibri"/>
+                <w:color w:val="202A35"/>
+                <w:sz w:val="17"/>
+              </w:rPr>
+              <w:t>Optimiza el flujo de descargas</w:t>
+            </w:r>
+          </w:p>
+        </w:tc>
+        <w:tc>
+          <w:tcPr>
+            <w:tcW w:type="dxa" w:w="3960"/>
+            <w:tcMar>
+              <w:top w:w="80" w:type="dxa"/>
+              <w:start w:w="120" w:type="dxa"/>
+              <w:bottom w:w="80" w:type="dxa"/>
+              <w:end w:w="120" w:type="dxa"/>
+            </w:tcMar>
+            <w:vAlign w:val="center"/>
+          </w:tcPr>
+          <w:p>
+            <w:pPr>
+              <w:spacing w:after="0" w:line="252" w:lineRule="auto"/>
+            </w:pPr>
+            <w:r>
+              <w:rPr>
+                <w:rFonts w:ascii="Calibri" w:hAnsi="Calibri"/>
+                <w:color w:val="202A35"/>
+                <w:sz w:val="17"/>
+              </w:rPr>
+              <w:t>019fad74-ebde-7ba0-a686-cb748324d727</w:t>
+            </w:r>
+          </w:p>
+        </w:tc>
+      </w:tr>
+      <w:tr>
+        <w:tc>
+          <w:tcPr>
+            <w:tcW w:type="dxa" w:w="1200"/>
+            <w:tcMar>
+              <w:top w:w="80" w:type="dxa"/>
+              <w:start w:w="120" w:type="dxa"/>
+              <w:bottom w:w="80" w:type="dxa"/>
+              <w:end w:w="120" w:type="dxa"/>
+            </w:tcMar>
+            <w:vAlign w:val="center"/>
+          </w:tcPr>
+          <w:p>
+            <w:pPr>
+              <w:spacing w:after="0" w:line="252" w:lineRule="auto"/>
+            </w:pPr>
+            <w:r>
+              <w:rPr>
+                <w:rFonts w:ascii="Calibri" w:hAnsi="Calibri"/>
+                <w:color w:val="202A35"/>
+                <w:sz w:val="17"/>
+              </w:rPr>
+              <w:t>29-30 jul</w:t>
+            </w:r>
+          </w:p>
+        </w:tc>
+        <w:tc>
+          <w:tcPr>
+            <w:tcW w:type="dxa" w:w="4200"/>
+            <w:tcMar>
+              <w:top w:w="80" w:type="dxa"/>
+              <w:start w:w="120" w:type="dxa"/>
+              <w:bottom w:w="80" w:type="dxa"/>
+              <w:end w:w="120" w:type="dxa"/>
+            </w:tcMar>
+            <w:vAlign w:val="center"/>
+          </w:tcPr>
+          <w:p>
+            <w:pPr>
+              <w:spacing w:after="0" w:line="252" w:lineRule="auto"/>
+            </w:pPr>
+            <w:r>
+              <w:rPr>
+                <w:rFonts w:ascii="Calibri" w:hAnsi="Calibri"/>
+                <w:color w:val="202A35"/>
+                <w:sz w:val="17"/>
+              </w:rPr>
+              <w:t>Documentar clases y funciones</w:t>
+            </w:r>
+          </w:p>
+        </w:tc>
+        <w:tc>
+          <w:tcPr>
+            <w:tcW w:type="dxa" w:w="3960"/>
+            <w:tcMar>
+              <w:top w:w="80" w:type="dxa"/>
+              <w:start w:w="120" w:type="dxa"/>
+              <w:bottom w:w="80" w:type="dxa"/>
+              <w:end w:w="120" w:type="dxa"/>
+            </w:tcMar>
+            <w:vAlign w:val="center"/>
+          </w:tcPr>
+          <w:p>
+            <w:pPr>
+              <w:spacing w:after="0" w:line="252" w:lineRule="auto"/>
+            </w:pPr>
+            <w:r>
+              <w:rPr>
+                <w:rFonts w:ascii="Calibri" w:hAnsi="Calibri"/>
+                <w:color w:val="202A35"/>
+                <w:sz w:val="17"/>
+              </w:rPr>
+              <w:t>019faf60-5470-7fe3-8d73-c3096b92ff33</w:t>
+            </w:r>
+          </w:p>
+        </w:tc>
+      </w:tr>
     </w:tbl>
     <w:p>
       <w:pPr>
@@ -5733,7 +6163,7 @@
                 <w:color w:val="202A35"/>
                 <w:sz w:val="18"/>
               </w:rPr>
-              <w:t>111 commits visibles entre 16 de junio y 28 de julio; HEAD 814f0e8; rama development; estado versionado limpio antes de editar el informe.</w:t>
+              <w:t>115 commits visibles entre 16 de junio y 29 de julio; HEAD 47038416a1baac7262c743a71205dd3f8aa6b4dd; rama development; 310 ficheros modificados localmente por documentación.</w:t>
             </w:r>
           </w:p>
         </w:tc>
@@ -5785,7 +6215,7 @@
                 <w:color w:val="202A35"/>
                 <w:sz w:val="18"/>
               </w:rPr>
-              <w:t>Describe Compose local/GHCR, búsqueda lexical|semantic, administración de modelos, CPython 3.14t, banco de resolución manual y alta desde web oficial.</w:t>
+              <w:t>Describe Compose local/GHCR, búsqueda lexical|semantic, administración de modelos, flujos administrativos y descargas progresivas con PACKAGING, MANUAL_ONLY, overlay y accesos .url.</w:t>
             </w:r>
           </w:p>
         </w:tc>
@@ -5837,7 +6267,7 @@
                 <w:color w:val="202A35"/>
                 <w:sz w:val="18"/>
               </w:rPr>
-              <w:t>Consolida propietarios de datos, pipeline actual, contratos, seguridad, estados públicos, reglas de promoción semántica y garantías de los dos nuevos flujos administrativos.</w:t>
+              <w:t>Consolida propietarios de datos, seguridad, estados públicos, reglas de promoción, nuevos flujos administrativos, metadatos internos de descarga y orden solicitado con relevancia como desempate.</w:t>
             </w:r>
           </w:p>
         </w:tc>
@@ -5889,7 +6319,7 @@
                 <w:color w:val="202A35"/>
                 <w:sz w:val="18"/>
               </w:rPr>
-              <w:t>docker compose config --services volvió a enumerar 16 servicios tanto en la configuración local como en GHCR.</w:t>
+              <w:t>docker compose config --services volvió a enumerar 16 servicios en local y GHCR; el worker depende de Core con service_started y recibe URL/timeout.</w:t>
             </w:r>
           </w:p>
         </w:tc>
@@ -5941,7 +6371,7 @@
                 <w:color w:val="202A35"/>
                 <w:sz w:val="18"/>
               </w:rPr>
-              <w:t>El árbol hermano mantiene 20 archivos versionados modificados y nuevos diagramas; build/memoria.pdf es del 23 de julio y build/anexos.pdf del 21. Las fuentes aún describen búsqueda híbrida/RRF y ausencia de pantalla administrativa de modelos.</w:t>
+              <w:t>El árbol hermano mantiene 20 archivos versionados modificados y seis no versionados; memoria.pdf es del 23 de julio y anexos.pdf del 21. Las fuentes siguen describiendo búsqueda híbrida/RRF, ausencia de pantalla de modelos y un flujo de descarga anterior.</w:t>
             </w:r>
           </w:p>
         </w:tc>
@@ -5962,12 +6392,14 @@
     </w:p>
     <w:p>
       <w:r>
-        <w:t>Batch-Downloader ya no es solo un descargador por lotes. Es una plataforma de catálogo y resolución de software con trazabilidad, administración asistida, descargas asíncronas y búsqueda semántica local. El siguiente salto de madurez no depende tanto de añadir nuevos componentes como de validar en despliegue los flujos recién incorporados, cerrar la evaluación semántica completa, sincronizar la documentación final y seguir preservando las invariantes operativas que surgieron de los problemas reales.</w:t>
+        <w:t>Batch-Downloader ya no es solo un descargador por lotes. Es una plataforma de catálogo y resolución de software con trazabilidad, administración asistida, descargas progresivas y búsqueda semántica local. El siguiente salto de madurez consiste en desplegar y verificar el nuevo flujo de entrega, revisar y confirmar la documentación técnica pendiente, cerrar la evaluación semántica completa y sincronizar la memoria LaTeX sin rebajar las invariantes operativas que surgieron de problemas reales.</w:t>
       </w:r>
     </w:p>
     <w:sectPr>
       <w:headerReference w:type="default" r:id="rId9"/>
       <w:footerReference w:type="default" r:id="rId10"/>
+      <w:footerReference w:type="first" r:id="rId12"/>
+      <w:footerReference w:type="even" r:id="rId13"/>
       <w:pgSz w:w="12240" w:h="15840"/>
       <w:pgMar w:top="1440" w:right="1440" w:bottom="1440" w:left="1440" w:header="708" w:footer="708" w:gutter="0"/>
       <w:cols w:space="720"/>
@@ -5991,7 +6423,7 @@
         <w:color w:val="5F6B78"/>
         <w:sz w:val="17"/>
       </w:rPr>
-      <w:t xml:space="preserve">28 de julio de 2026  |  </w:t>
+      <w:t xml:space="preserve">30 de julio de 2026  |  </w:t>
     </w:r>
     <w:r>
       <w:rPr>
@@ -6005,6 +6437,26 @@
       <w:t>1</w:t>
       <w:fldChar w:fldCharType="end"/>
     </w:r>
+  </w:p>
+</w:ftr>
+</file>
+
+<file path=word/footer2.xml><?xml version="1.0" encoding="utf-8"?>
+<w:ftr xmlns:m="http://schemas.openxmlformats.org/officeDocument/2006/math" xmlns:mc="http://schemas.openxmlformats.org/markup-compatibility/2006" xmlns:mo="http://schemas.microsoft.com/office/mac/office/2008/main" xmlns:mv="urn:schemas-microsoft-com:mac:vml" xmlns:o="urn:schemas-microsoft-com:office:office" xmlns:r="http://schemas.openxmlformats.org/officeDocument/2006/relationships" xmlns:v="urn:schemas-microsoft-com:vml" xmlns:w10="urn:schemas-microsoft-com:office:word" xmlns:w14="http://schemas.microsoft.com/office/word/2010/wordml" xmlns:w="http://schemas.openxmlformats.org/wordprocessingml/2006/main" xmlns:wne="http://schemas.microsoft.com/office/word/2006/wordml" xmlns:wp14="http://schemas.microsoft.com/office/word/2010/wordprocessingDrawing" xmlns:wp="http://schemas.openxmlformats.org/drawingml/2006/wordprocessingDrawing" xmlns:wpc="http://schemas.microsoft.com/office/word/2010/wordprocessingCanvas" xmlns:wpg="http://schemas.microsoft.com/office/word/2010/wordprocessingGroup" xmlns:wpi="http://schemas.microsoft.com/office/word/2010/wordprocessingInk" xmlns:wps="http://schemas.microsoft.com/office/word/2010/wordprocessingShape" mc:Ignorable="w14 wp14">
+  <w:p>
+    <w:pPr>
+      <w:pStyle w:val="Footer"/>
+    </w:pPr>
+  </w:p>
+</w:ftr>
+</file>
+
+<file path=word/footer3.xml><?xml version="1.0" encoding="utf-8"?>
+<w:ftr xmlns:m="http://schemas.openxmlformats.org/officeDocument/2006/math" xmlns:mc="http://schemas.openxmlformats.org/markup-compatibility/2006" xmlns:mo="http://schemas.microsoft.com/office/mac/office/2008/main" xmlns:mv="urn:schemas-microsoft-com:mac:vml" xmlns:o="urn:schemas-microsoft-com:office:office" xmlns:r="http://schemas.openxmlformats.org/officeDocument/2006/relationships" xmlns:v="urn:schemas-microsoft-com:vml" xmlns:w10="urn:schemas-microsoft-com:office:word" xmlns:w14="http://schemas.microsoft.com/office/word/2010/wordml" xmlns:w="http://schemas.openxmlformats.org/wordprocessingml/2006/main" xmlns:wne="http://schemas.microsoft.com/office/word/2006/wordml" xmlns:wp14="http://schemas.microsoft.com/office/word/2010/wordprocessingDrawing" xmlns:wp="http://schemas.openxmlformats.org/drawingml/2006/wordprocessingDrawing" xmlns:wpc="http://schemas.microsoft.com/office/word/2010/wordprocessingCanvas" xmlns:wpg="http://schemas.microsoft.com/office/word/2010/wordprocessingGroup" xmlns:wpi="http://schemas.microsoft.com/office/word/2010/wordprocessingInk" xmlns:wps="http://schemas.microsoft.com/office/word/2010/wordprocessingShape" mc:Ignorable="w14 wp14">
+  <w:p>
+    <w:pPr>
+      <w:pStyle w:val="Footer"/>
+    </w:pPr>
   </w:p>
 </w:ftr>
 </file>

</xml_diff>

<commit_message>
feat: update project evolution report with latest metrics and improvements
</commit_message>
<xml_diff>
--- a/docs/informes/Informe_cronologico_Batch-Downloader_2026-07-28.docx
+++ b/docs/informes/Informe_cronologico_Batch-Downloader_2026-07-28.docx
@@ -92,7 +92,7 @@
         <w:jc w:val="center"/>
       </w:pPr>
       <w:r>
-        <w:t>Periodo analizado: 16 de junio - 30 de julio de 2026</w:t>
+        <w:t>Periodo analizado: 16 de junio - 31 de julio de 2026</w:t>
       </w:r>
     </w:p>
     <w:p>
@@ -101,7 +101,7 @@
         <w:jc w:val="center"/>
       </w:pPr>
       <w:r>
-        <w:t>Elaborado a partir de 20 conversaciones recuperadas, el historial Git y la documentación actual</w:t>
+        <w:t>Elaborado a partir de 21 conversaciones recuperadas, el historial Git y la documentación actual</w:t>
       </w:r>
     </w:p>
     <w:p>
@@ -130,7 +130,7 @@
     </w:p>
     <w:p>
       <w:r>
-        <w:t>El resultado actual es un monorepo en la rama development con 115 commits visibles y un Compose de 16 servicios. MySQL mantiene la autoridad transaccional del catálogo y PostgreSQL/pgvector sigue siendo una proyección reconstruible. La descarga por lotes publica ahora cada resultado al terminar, separa el empaquetado real, conserva fallos por aplicación y puede incluir accesos seguros a páginas oficiales. La búsqueda semántica respeta el orden elegido por el usuario y usa la relevancia como desempate. La evaluación completa que podría justificar la promoción de un modelo sigue pendiente de métricas finales.</w:t>
+        <w:t>El resultado actual es un monorepo en la rama development con 119 commits visibles y un Compose de 16 servicios. MySQL mantiene la autoridad transaccional del catálogo y PostgreSQL/pgvector sigue siendo una proyección reconstruible. La descarga por lotes publica cada resultado al terminar, separa el empaquetado real, conserva fallos por aplicación y puede incluir accesos seguros a páginas oficiales. El catálogo combina ahora todas las tags con AND, admite un único editor y recalcula las facetas con el conjunto completo de filtros. La evaluación semántica que podría justificar la promoción de un modelo sigue pendiente de métricas finales.</w:t>
       </w:r>
     </w:p>
     <w:p>
@@ -206,7 +206,7 @@
                 <w:color w:val="FFFFFF"/>
                 <w:sz w:val="36"/>
               </w:rPr>
-              <w:t>115</w:t>
+              <w:t>119</w:t>
             </w:r>
           </w:p>
         </w:tc>
@@ -234,7 +234,7 @@
                 <w:color w:val="FFFFFF"/>
                 <w:sz w:val="36"/>
               </w:rPr>
-              <w:t>20</w:t>
+              <w:t>21</w:t>
             </w:r>
           </w:p>
         </w:tc>
@@ -421,7 +421,7 @@
     </w:p>
     <w:p>
       <w:r>
-        <w:t>Este informe combina cuatro fuentes: historiales de tareas de Codex vinculadas al checkout principal, conversaciones del repositorio hermano de la memoria LaTeX, una tarea de organización del proyecto en GitHub y el historial Git local hasta el commit 4703841 del 29 de julio de 2026, verificado el 30 de julio. También se contrastaron README.md, .github/copilot-instructions.md, los dos Compose, los cambios locales y el estado y las fechas de los PDF de la memoria.</w:t>
+        <w:t>Este informe combina cuatro fuentes: historiales de tareas de Codex vinculadas al checkout principal, conversaciones del repositorio hermano de la memoria LaTeX, la organización del proyecto en GitHub y el historial Git local hasta el commit 03bf30f del 30 de julio de 2026, verificado el 31 de julio. También se contrastaron README.md, .github/copilot-instructions.md, OpenAPI, los dos Compose, el estado del working tree y el estado y las fechas de los PDF de la memoria.</w:t>
       </w:r>
     </w:p>
     <w:p>
@@ -438,7 +438,7 @@
           <w:color w:val="202A35"/>
           <w:sz w:val="22"/>
         </w:rPr>
-        <w:t>Se recuperaron todas las conversaciones relevantes visibles dentro de las 50 tareas recientes que la aplicación permite listar en esta sesión.</w:t>
+        <w:t>Se recuperaron todas las conversaciones relevantes visibles dentro de las 50 tareas recientes que la aplicación permite listar en esta sesión. Desde el corte anterior apareció una tarea nueva del checkout principal; no hubo tareas nuevas del árbol LaTeX ni de gestión de GitHub.</w:t>
       </w:r>
     </w:p>
     <w:p>
@@ -1423,7 +1423,7 @@
                 <w:color w:val="202A35"/>
                 <w:sz w:val="18"/>
               </w:rPr>
-              <w:t>29-30 jul</w:t>
+              <w:t>29-31 jul</w:t>
             </w:r>
           </w:p>
         </w:tc>
@@ -1448,7 +1448,7 @@
                 <w:color w:val="202A35"/>
                 <w:sz w:val="18"/>
               </w:rPr>
-              <w:t>Descargas y documentación</w:t>
+              <w:t>Descargas, catálogo y documentación</w:t>
             </w:r>
           </w:p>
         </w:tc>
@@ -1473,7 +1473,7 @@
                 <w:color w:val="202A35"/>
                 <w:sz w:val="18"/>
               </w:rPr>
-              <w:t>Progreso por item, overlay global, MANUAL_ONLY, accesos .url, orden respetado y cobertura documental Java/Python.</w:t>
+              <w:t>Progreso por item, MANUAL_ONLY, orden respetado, documentación integrada, panel 6 x 3 y filtros AND con editor único.</w:t>
             </w:r>
           </w:p>
         </w:tc>
@@ -1978,7 +1978,7 @@
         <w:pStyle w:val="Heading2"/>
       </w:pPr>
       <w:r>
-        <w:t>29-30 de julio - Descargas progresivas, orden y documentación interna</w:t>
+        <w:t>29-31 de julio - Descargas, catálogo y documentación integrada</w:t>
       </w:r>
     </w:p>
     <w:p>
@@ -2003,7 +2003,17 @@
     </w:p>
     <w:p>
       <w:r>
-        <w:t>Por último se completó una campaña documental sobre 310 ficheros versionados: 189 Java y 121 Python. Se documentaron módulos, tipos, métodos, campos, componentes record, funciones y atributos con prosa española, sin cambiar la semántica salvo un marcador de migración y su prueba. El resultado sigue como cambio local no confirmado; la equivalencia AST/bytecode y las suites documentadas reducen el riesgo, pero no sustituyen su revisión y commit.</w:t>
+        <w:t>Por último se completó una campaña documental sobre 310 ficheros versionados: 189 Java y 121 Python. Se documentaron módulos, tipos, métodos, campos, componentes record, funciones y atributos con prosa española, sin cambiar la semántica salvo un marcador de migración y su prueba. La equivalencia AST/bytecode y las suites documentadas se conservaron como evidencia; el lote dejó de ser un cambio local al integrarse en f3287ea.</w:t>
+      </w:r>
+    </w:p>
+    <w:p>
+      <w:r>
+        <w:t>Una nueva tarea rediseñó la selección temporal del catálogo: rejilla adaptable de 6 columnas por 3 filas, 17 iconos visibles y un hueco final +X, orden desde la incorporación más reciente, nombre en hover y retirada directa. El ancho fijo que desbordaba el fieldset se sustituyó por columnas proporcionales. La tarjeta pública de bundles también recibió cabecera, franja de miniaturas y pie simétricos.</w:t>
+      </w:r>
+    </w:p>
+    <w:p>
+      <w:r>
+        <w:t>El contrato público de filtros se simplificó: todas las tags se combinan con AND, solo existe un editor activo y las facetas literales o semánticas se calculan tras aplicar búsqueda, estado, SO, arquitectura, tags y editor. Se retiraron tagMatchMin, tagMode público, coincidencias mínimas y el bloque de filtros activos; las URL antiguas se canonicalizan y existen controles para limpiar tags o editor. La tarea registró 87/87 pruebas frontend, 68/68 de Core, OpenAPI válido y build correcto; el cierre visual posterior llegó a 90/90 pruebas frontend, sin iniciar ni reiniciar la aplicación.</w:t>
       </w:r>
     </w:p>
     <w:p>
@@ -2958,10 +2968,42 @@
         <w:rPr>
           <w:b/>
         </w:rPr>
-        <w:t xml:space="preserve">Impacto: </w:t>
+        <w:t>Impacto: el código resulta más navegable y los hovers son útiles. El lote ya forma parte de development mediante f3287ea; la revisión pendiente dejó de ser confirmar el working tree y pasó a mantener esta cobertura en cambios posteriores.</w:t>
       </w:r>
+    </w:p>
+    <w:p>
+      <w:pPr>
+        <w:pStyle w:val="Heading2"/>
+      </w:pPr>
       <w:r>
-        <w:t>el código resulta más navegable y los hovers son útiles, aunque el lote permanece sin confirmar en Git y debe revisarse como cambio local.</w:t>
+        <w:t>14. Selección y filtros del catálogo</w:t>
+      </w:r>
+    </w:p>
+    <w:p>
+      <w:pPr/>
+      <w:r>
+        <w:rPr>
+          <w:b/>
+        </w:rPr>
+        <w:t>Problema: la selección no mostraba qué aplicaciones componían el lote, una rejilla de ancho fijo podía desbordar el panel y la combinación de coincidencias mínimas, varias tags y varios editores hacía difícil anticipar resultados y facetas.</w:t>
+      </w:r>
+    </w:p>
+    <w:p>
+      <w:pPr/>
+      <w:r>
+        <w:rPr>
+          <w:b/>
+        </w:rPr>
+        <w:t>Solución: panel adaptable 6 x 3 con retirada por icono y +X, tags públicas siempre con AND, editor singular, facetas condicionadas por todos los filtros, canonicalización de URL y controles accesibles para limpiar tags o editor. La tarjeta de bundles se reorganizó con zonas visuales estables.</w:t>
+      </w:r>
+    </w:p>
+    <w:p>
+      <w:pPr/>
+      <w:r>
+        <w:rPr>
+          <w:b/>
+        </w:rPr>
+        <w:t>Impacto: la selección temporal es visible y reversible y el filtro público tiene una semántica única entre Core, OpenAPI y frontend. Las suites, builds y el detector de layout pasaron; la comprobación final sobre una instancia reconstruida sigue pendiente.</w:t>
       </w:r>
     </w:p>
     <w:p>
@@ -3132,11 +3174,16 @@
       </w:r>
     </w:p>
     <w:p>
+      <w:r>
+        <w:t>El catálogo público ya no expone tagMatchMin ni tagMode: las tags repetidas significan AND y publisher es singular. MySQL calcula lista y facetas con el mismo conjunto completo de filtros, incluso cuando los candidatos proceden del servicio semántico; tagMode any|all se conserva únicamente para administración.</w:t>
+      </w:r>
+    </w:p>
+    <w:p>
       <w:pPr>
         <w:pStyle w:val="Heading1"/>
       </w:pPr>
       <w:r>
-        <w:t>Estado actual al 30 de julio de 2026</w:t>
+        <w:t>Estado actual al 31 de julio de 2026</w:t>
       </w:r>
     </w:p>
     <w:tbl>
@@ -3321,7 +3368,7 @@
                 <w:color w:val="202A35"/>
                 <w:sz w:val="17"/>
               </w:rPr>
-              <w:t>Confirmado con cambios locales</w:t>
+              <w:t>Confirmado e integrado</w:t>
             </w:r>
           </w:p>
         </w:tc>
@@ -3346,7 +3393,7 @@
                 <w:color w:val="202A35"/>
                 <w:sz w:val="17"/>
               </w:rPr>
-              <w:t>development, HEAD 4703841, 115 commits visibles y 310 ficheros modificados localmente por la campaña documental.</w:t>
+              <w:t>development, HEAD 03bf30f, 119 commits visibles y working tree limpio. La campaña documental quedó integrada en f3287ea.</w:t>
             </w:r>
           </w:p>
         </w:tc>
@@ -3371,7 +3418,7 @@
                 <w:color w:val="202A35"/>
                 <w:sz w:val="17"/>
               </w:rPr>
-              <w:t>Revisar y confirmar el lote documental sin mezclarlo con cambios funcionales.</w:t>
+              <w:t>Mantener la cobertura documental al evolucionar código y contratos.</w:t>
             </w:r>
           </w:p>
         </w:tc>
@@ -3627,7 +3674,7 @@
                 <w:color w:val="202A35"/>
                 <w:sz w:val="17"/>
               </w:rPr>
-              <w:t>Consolidado</w:t>
+              <w:t>Consolidado con filtros simples</w:t>
             </w:r>
           </w:p>
         </w:tc>
@@ -3652,7 +3699,7 @@
                 <w:color w:val="202A35"/>
                 <w:sz w:val="17"/>
               </w:rPr>
-              <w:t>available/review/missing, filtros y facetas en MySQL; el orden solicitado es principal y la relevancia solo desempata.</w:t>
+              <w:t>available/review/missing; tags con AND, editor único y facetas calculadas con todos los filtros. MySQL conserva la autoridad y la relevancia solo desempata.</w:t>
             </w:r>
           </w:p>
         </w:tc>
@@ -3677,7 +3724,7 @@
                 <w:color w:val="202A35"/>
                 <w:sz w:val="17"/>
               </w:rPr>
-              <w:t>Preservar las invariantes al tocar migraciones o contratos.</w:t>
+              <w:t>Actualizar RF-03, README, instrucciones y memoria para retirar coincidencias mínimas.</w:t>
             </w:r>
           </w:p>
         </w:tc>
@@ -3933,7 +3980,7 @@
                 <w:color w:val="202A35"/>
                 <w:sz w:val="17"/>
               </w:rPr>
-              <w:t>Avanzada</w:t>
+              <w:t>Integrada con deriva externa</w:t>
             </w:r>
           </w:p>
         </w:tc>
@@ -3958,7 +4005,7 @@
                 <w:color w:val="202A35"/>
                 <w:sz w:val="17"/>
               </w:rPr>
-              <w:t>README, contratos, Copilot y Compose recogen las descargas progresivas y el nuevo orden. La campaña Java/Python cubre 310 ficheros y pasó sus auditorías.</w:t>
+              <w:t>La campaña Java/Python de 310 ficheros está en f3287ea. OpenAPI recoge tags AND, editor singular y facetas condicionadas.</w:t>
             </w:r>
           </w:p>
         </w:tc>
@@ -3983,7 +4030,7 @@
                 <w:color w:val="202A35"/>
                 <w:sz w:val="17"/>
               </w:rPr>
-              <w:t>El lote documental sigue sin confirmar; LaTeX conserva contratos híbridos y de descarga antiguos, y los PDF requieren reconstrucción conjunta.</w:t>
+              <w:t>LaTeX y RF-03 siguen desfasados; memoria.pdf y anexos.pdf requieren reconstrucción y revisión conjunta.</w:t>
             </w:r>
           </w:p>
         </w:tc>
@@ -4130,7 +4177,7 @@
         <w:spacing w:after="160" w:line="280" w:lineRule="auto"/>
       </w:pPr>
       <w:r>
-        <w:t>Actualizar las fuentes LaTeX que aún describen búsqueda híbrida/RRF, ausencia de pantalla administrativa de modelos y un flujo de descargas anterior a MANUAL_ONLY, los accesos .url y el overlay progresivo. Después debe recompilarse y revisarse visualmente memoria.pdf y anexos.pdf; los PDF actuales siguen fechados el 23 y el 21 de julio, respectivamente.</w:t>
+        <w:t>Actualizar las fuentes LaTeX que aún describen búsqueda híbrida/RRF, ausencia de pantalla administrativa de modelos, un flujo de descargas anterior y una UX de catálogo que no recoge el panel 6 x 3, las tags obligatorias con AND ni el editor único. Después debe recompilarse y revisarse visualmente memoria.pdf y anexos.pdf; los PDF actuales siguen fechados el 23 y el 21 de julio, respectivamente.</w:t>
       </w:r>
     </w:p>
     <w:p>
@@ -4142,7 +4189,7 @@
         <w:spacing w:after="160" w:line="280" w:lineRule="auto"/>
       </w:pPr>
       <w:r>
-        <w:t>Reconstruir Core, download-worker y frontend en el orden documentado; verificar las migraciones 0012-0015 y V7, el avance item a item, PACKAGING, MANUAL_ONLY, la descarga automática y el arreglo de Paradox. La evidencia en navegador llegó a 16/17 con itch reparado, pero el worker activo no contenía todavía todas las correcciones.</w:t>
+        <w:t>Reconstruir Core, download-worker y frontend en el orden documentado; verificar las migraciones 0012-0015 y V7, el avance item a item, PACKAGING, MANUAL_ONLY, la descarga automática y el arreglo de Paradox. En el mismo despliegue debe comprobarse visualmente el panel de selección adaptable, la limpieza de tags/editor y la nueva tarjeta de bundles; las pruebas y builds no demuestran por sí solos la instancia servida.</w:t>
       </w:r>
     </w:p>
     <w:p>
@@ -4159,7 +4206,7 @@
           <w:color w:val="202A35"/>
           <w:sz w:val="22"/>
         </w:rPr>
-        <w:t>Revisar y confirmar en Git el lote documental de 310 ficheros. Está validado como cambio no funcional, pero el working tree continúa modificado y no debe confundirse con una entrega ya integrada.</w:t>
+        <w:t>Actualizar el requisito RF-03 y su issue de GitHub: todavía permiten elegir coincidencia total o mínima, decisión sustituida por tags siempre combinadas con AND y un único editor en el catálogo público. Sincronizar también README, instrucciones de agentes y memoria cuando describan el contrato de filtros.</w:t>
       </w:r>
     </w:p>
     <w:p>
@@ -4210,7 +4257,7 @@
           <w:color w:val="202A35"/>
           <w:sz w:val="22"/>
         </w:rPr>
-        <w:t>Seguir verificando en despliegue los cambios visuales que las pruebas unitarias no pueden demostrar por sí solas.</w:t>
+        <w:t>Seguir verificando en despliegue los cambios visuales que las pruebas unitarias y el detector de layout no pueden demostrar por sí solos, especialmente anchos reales, foco, estados vacíos y persistencia entre páginas.</w:t>
       </w:r>
     </w:p>
     <w:p>
@@ -6023,6 +6070,83 @@
           </w:p>
         </w:tc>
       </w:tr>
+      <w:tr>
+        <w:tc>
+          <w:tcPr>
+            <w:tcW w:type="dxa" w:w="1200"/>
+            <w:tcMar>
+              <w:top w:w="80" w:type="dxa"/>
+              <w:start w:w="120" w:type="dxa"/>
+              <w:bottom w:w="80" w:type="dxa"/>
+              <w:end w:w="120" w:type="dxa"/>
+            </w:tcMar>
+            <w:vAlign w:val="center"/>
+          </w:tcPr>
+          <w:p>
+            <w:pPr>
+              <w:spacing w:after="0" w:line="252" w:lineRule="auto"/>
+            </w:pPr>
+            <w:r>
+              <w:rPr>
+                <w:rFonts w:ascii="Calibri" w:hAnsi="Calibri"/>
+                <w:color w:val="202A35"/>
+                <w:sz w:val="17"/>
+              </w:rPr>
+              <w:t>30 jul</w:t>
+            </w:r>
+          </w:p>
+        </w:tc>
+        <w:tc>
+          <w:tcPr>
+            <w:tcW w:type="dxa" w:w="4200"/>
+            <w:tcMar>
+              <w:top w:w="80" w:type="dxa"/>
+              <w:start w:w="120" w:type="dxa"/>
+              <w:bottom w:w="80" w:type="dxa"/>
+              <w:end w:w="120" w:type="dxa"/>
+            </w:tcMar>
+            <w:vAlign w:val="center"/>
+          </w:tcPr>
+          <w:p>
+            <w:pPr>
+              <w:spacing w:after="0" w:line="252" w:lineRule="auto"/>
+            </w:pPr>
+            <w:r>
+              <w:rPr>
+                <w:rFonts w:ascii="Calibri" w:hAnsi="Calibri"/>
+                <w:color w:val="202A35"/>
+                <w:sz w:val="17"/>
+              </w:rPr>
+              <w:t>Limita iconos seleccionadas a 17</w:t>
+            </w:r>
+          </w:p>
+        </w:tc>
+        <w:tc>
+          <w:tcPr>
+            <w:tcW w:type="dxa" w:w="3960"/>
+            <w:tcMar>
+              <w:top w:w="80" w:type="dxa"/>
+              <w:start w:w="120" w:type="dxa"/>
+              <w:bottom w:w="80" w:type="dxa"/>
+              <w:end w:w="120" w:type="dxa"/>
+            </w:tcMar>
+            <w:vAlign w:val="center"/>
+          </w:tcPr>
+          <w:p>
+            <w:pPr>
+              <w:spacing w:after="0" w:line="252" w:lineRule="auto"/>
+            </w:pPr>
+            <w:r>
+              <w:rPr>
+                <w:rFonts w:ascii="Calibri" w:hAnsi="Calibri"/>
+                <w:color w:val="202A35"/>
+                <w:sz w:val="17"/>
+              </w:rPr>
+              <w:t>019fb44e-6424-7da3-956f-d7140794da54</w:t>
+            </w:r>
+          </w:p>
+        </w:tc>
+      </w:tr>
     </w:tbl>
     <w:p>
       <w:pPr>
@@ -6163,7 +6287,7 @@
                 <w:color w:val="202A35"/>
                 <w:sz w:val="18"/>
               </w:rPr>
-              <w:t>115 commits visibles entre 16 de junio y 29 de julio; HEAD 47038416a1baac7262c743a71205dd3f8aa6b4dd; rama development; 310 ficheros modificados localmente por documentación.</w:t>
+              <w:t>119 commits visibles entre 16 de junio y 30 de julio; HEAD 03bf30f4c3fbdd0ad59649775c0652bf98ec7e4d; rama development; working tree limpio. Los cuatro commits nuevos son f3287ea, b6b906a, d0954f7 y 03bf30f.</w:t>
             </w:r>
           </w:p>
         </w:tc>
@@ -6215,7 +6339,7 @@
                 <w:color w:val="202A35"/>
                 <w:sz w:val="18"/>
               </w:rPr>
-              <w:t>Describe Compose local/GHCR, búsqueda lexical|semantic, administración de modelos, flujos administrativos y descargas progresivas con PACKAGING, MANUAL_ONLY, overlay y accesos .url.</w:t>
+              <w:t>Sin cambios desde 4703841; mantiene Compose local/GHCR, búsqueda lexical|semantic y el flujo progresivo con PACKAGING, MANUAL_ONLY, overlay y accesos .url. No documenta todavía el nuevo detalle de tags y editor.</w:t>
             </w:r>
           </w:p>
         </w:tc>
@@ -6267,7 +6391,7 @@
                 <w:color w:val="202A35"/>
                 <w:sz w:val="18"/>
               </w:rPr>
-              <w:t>Consolida propietarios de datos, seguridad, estados públicos, reglas de promoción, nuevos flujos administrativos, metadatos internos de descarga y orden solicitado con relevancia como desempate.</w:t>
+              <w:t>Sin cambios en los cuatro commits; conserva propietarios de datos, seguridad, estados públicos y orden solicitado. Debe sincronizar explícitamente la semántica pública de tags AND y editor único.</w:t>
             </w:r>
           </w:p>
         </w:tc>
@@ -6319,7 +6443,7 @@
                 <w:color w:val="202A35"/>
                 <w:sz w:val="18"/>
               </w:rPr>
-              <w:t>docker compose config --services volvió a enumerar 16 servicios en local y GHCR; el worker depende de Core con service_started y recibe URL/timeout.</w:t>
+              <w:t>docker compose config --services volvió a enumerar 16 servicios en local y GHCR; los Compose no cambiaron desde 4703841.</w:t>
             </w:r>
           </w:p>
         </w:tc>
@@ -6371,7 +6495,59 @@
                 <w:color w:val="202A35"/>
                 <w:sz w:val="18"/>
               </w:rPr>
-              <w:t>El árbol hermano mantiene 20 archivos versionados modificados y seis no versionados; memoria.pdf es del 23 de julio y anexos.pdf del 21. Las fuentes siguen describiendo búsqueda híbrida/RRF, ausencia de pantalla de modelos y un flujo de descarga anterior.</w:t>
+              <w:t>El árbol hermano mantiene 20 archivos versionados modificados y seis no versionados; memoria.pdf es del 23 de julio y anexos.pdf del 21. Las fuentes siguen describiendo búsqueda híbrida/RRF y no recogen la UX 6 x 3 ni el contrato simplificado de filtros.</w:t>
+            </w:r>
+          </w:p>
+        </w:tc>
+      </w:tr>
+      <w:tr>
+        <w:tc>
+          <w:tcPr>
+            <w:tcW w:type="dxa" w:w="2200"/>
+            <w:tcMar>
+              <w:top w:w="80" w:type="dxa"/>
+              <w:start w:w="120" w:type="dxa"/>
+              <w:bottom w:w="80" w:type="dxa"/>
+              <w:end w:w="120" w:type="dxa"/>
+            </w:tcMar>
+            <w:vAlign w:val="center"/>
+          </w:tcPr>
+          <w:p>
+            <w:pPr>
+              <w:spacing w:after="0" w:line="252" w:lineRule="auto"/>
+            </w:pPr>
+            <w:r>
+              <w:rPr>
+                <w:rFonts w:ascii="Calibri" w:hAnsi="Calibri"/>
+                <w:color w:val="202A35"/>
+                <w:sz w:val="18"/>
+              </w:rPr>
+              <w:t>OpenAPI y GitHub</w:t>
+            </w:r>
+          </w:p>
+        </w:tc>
+        <w:tc>
+          <w:tcPr>
+            <w:tcW w:type="dxa" w:w="7160"/>
+            <w:tcMar>
+              <w:top w:w="80" w:type="dxa"/>
+              <w:start w:w="120" w:type="dxa"/>
+              <w:bottom w:w="80" w:type="dxa"/>
+              <w:end w:w="120" w:type="dxa"/>
+            </w:tcMar>
+            <w:vAlign w:val="center"/>
+          </w:tcPr>
+          <w:p>
+            <w:pPr>
+              <w:spacing w:after="0" w:line="252" w:lineRule="auto"/>
+            </w:pPr>
+            <w:r>
+              <w:rPr>
+                <w:rFonts w:ascii="Calibri" w:hAnsi="Calibri"/>
+                <w:color w:val="202A35"/>
+                <w:sz w:val="18"/>
+              </w:rPr>
+              <w:t>OpenAPI valida tags repetidas con AND, publisher singular y facetas tras todos los filtros. GitHub conserva 48 requisitos; RF-03 todavía pide coincidencia total o mínima y queda como fuente desfasada.</w:t>
             </w:r>
           </w:p>
         </w:tc>
@@ -6392,7 +6568,7 @@
     </w:p>
     <w:p>
       <w:r>
-        <w:t>Batch-Downloader ya no es solo un descargador por lotes. Es una plataforma de catálogo y resolución de software con trazabilidad, administración asistida, descargas progresivas y búsqueda semántica local. El siguiente salto de madurez consiste en desplegar y verificar el nuevo flujo de entrega, revisar y confirmar la documentación técnica pendiente, cerrar la evaluación semántica completa y sincronizar la memoria LaTeX sin rebajar las invariantes operativas que surgieron de problemas reales.</w:t>
+        <w:t>Batch-Downloader ya no es solo un descargador por lotes. Es una plataforma de catálogo y resolución de software con trazabilidad, administración asistida, descargas progresivas y búsqueda semántica local. El siguiente salto de madurez consiste en desplegar y verificar conjuntamente el flujo de entrega y la nueva UX de selección y filtros, corregir la deriva de RF-03 y la memoria LaTeX, y cerrar la evaluación semántica completa sin rebajar las invariantes operativas surgidas de problemas reales.</w:t>
       </w:r>
     </w:p>
     <w:sectPr>

</xml_diff>

<commit_message>
Ahora el compose tiene gestión correcta de todos los posibles errores que puedan tener los servicios críticos u opcionales entre sí.
</commit_message>
<xml_diff>
--- a/docs/informes/Informe_cronologico_Batch-Downloader_2026-07-28.docx
+++ b/docs/informes/Informe_cronologico_Batch-Downloader_2026-07-28.docx
@@ -95,7 +95,7 @@
         <w:jc w:val="center"/>
       </w:pPr>
       <w:r>
-        <w:t xml:space="preserve">Periodo analizado: 16 de junio - 10 de agosto de 2026</w:t>
+        <w:t>Periodo analizado: 16 de junio - 18 de agosto de 2026</w:t>
       </w:r>
     </w:p>
     <w:p>
@@ -128,7 +128,7 @@
     </w:p>
     <w:p>
       <w:r>
-        <w:t xml:space="preserve">El resultado actual es un monorepo en la rama development con 133 commits visibles y dos Compose verificados de 16 servicios cada uno. MySQL mantiene la autoridad transaccional del catálogo y PostgreSQL/pgvector sigue siendo una proyección reconstruible. La descarga por lotes publica cada resultado al terminar, separa el empaquetado real, conserva fallos por aplicación y puede incluir accesos seguros a páginas oficiales. El catálogo combina ahora todas las tags con AND, admite un único editor y recalcula las facetas con el conjunto completo de filtros. El rediseño de identidad, sesiones, OAuth, cuenta, bundles propios e historial ya está integrado y sus suites focalizadas pasan; su validación desplegada sigue pendiente. La evaluación semántica que podría justificar la promoción de un modelo continúa sin métricas finales.</w:t>
+        <w:t>El resultado actual es un monorepo en la rama development con 134 commits visibles y dos Compose verificados de 16 servicios cada uno. MySQL mantiene la autoridad transaccional del catálogo y PostgreSQL/pgvector sigue siendo una proyección reconstruible. La descarga por lotes publica cada resultado al terminar, separa el empaquetado real, conserva fallos por aplicación y puede incluir accesos seguros a páginas oficiales. El catálogo combina ahora todas las tags con AND, admite un único editor y recalcula las facetas con el conjunto completo de filtros. El rediseño de identidad, sesiones, OAuth, cuenta, bundles propios e historial ya está integrado; Core puede arrancar sin credenciales de Google, responde 503 cuando OAuth no está configurado y Resend falla de forma explícita si se invoca sin configuración. Su validación desplegada sigue pendiente. En el working tree hay además una política de salud y degradación todavía no integrada para ambos Compose. La evaluación semántica que podría justificar la promoción de un modelo continúa sin métricas finales.</w:t>
       </w:r>
     </w:p>
     <w:p>
@@ -182,17 +182,8 @@
             <w:vAlign w:val="center"/>
           </w:tcPr>
           <w:p>
-            <w:pPr>
-              <w:spacing w:after="0"/>
-              <w:jc w:val="center"/>
-            </w:pPr>
             <w:r>
-              <w:rPr>
-                <w:b/>
-                <w:color w:val="FFFFFF"/>
-                <w:sz w:val="36"/>
-              </w:rPr>
-              <w:t xml:space="preserve">133</w:t>
+              <w:t>134</w:t>
             </w:r>
           </w:p>
         </w:tc>
@@ -346,7 +337,7 @@
     </w:p>
     <w:p>
       <w:r>
-        <w:t xml:space="preserve">Este informe combina cuatro fuentes: historiales de tareas de Codex vinculadas al checkout principal, conversaciones del repositorio hermano de la memoria LaTeX, la organización del proyecto en GitHub y el historial Git local hasta el commit 9de1e09 del 8 de agosto de 2026, verificado de nuevo el 10 de agosto. También se contrastaron README.md, .github/copilot-instructions.md, OpenAPI, los dos Compose, el estado del working tree y el estado documental conocido de la memoria LaTeX.</w:t>
+        <w:t>Este informe combina cuatro fuentes: historiales de tareas de Codex vinculadas al checkout principal, conversaciones del repositorio hermano de la memoria LaTeX, la organización del proyecto en GitHub y el historial Git local hasta el commit 7a38ac6 del 10 de agosto de 2026, verificado de nuevo el 18 de agosto. También se contrastaron README.md, .github/copilot-instructions.md, OpenAPI, los dos Compose, el estado del working tree y el estado documental conocido de la memoria LaTeX.</w:t>
       </w:r>
     </w:p>
     <w:p>
@@ -357,7 +348,7 @@
         </w:numPr>
       </w:pPr>
       <w:r>
-        <w:t xml:space="preserve">El apéndice conserva las 23 conversaciones previamente recuperadas y contrastadas. El 10 de agosto, la herramienta de tareas de Codex volvió a quedar sin respuesta en dos consultas acotadas, incluida una de 10 tareas; por ello no se añade ninguna conversación sin haberla recuperado y la cobertura nueva se limita a evidencia local verificable.</w:t>
+        <w:t>El apéndice conserva las 23 conversaciones previamente recuperadas y contrastadas. El 18 de agosto, la herramienta de tareas de Codex volvió a quedar sin respuesta en dos consultas acotadas, incluida una espera de dos minutos; por ello no se añade ninguna conversación sin haberla recuperado y la cobertura nueva se limita a evidencia local verificable.</w:t>
       </w:r>
     </w:p>
     <w:p>
@@ -1470,6 +1461,71 @@
           </w:p>
         </w:tc>
       </w:tr>
+      <w:tr>
+        <w:tc>
+          <w:tcPr>
+            <w:tcW w:w="1500" w:type="dxa"/>
+            <w:tcMar>
+              <w:top w:w="80" w:type="dxa"/>
+              <w:left w:w="120" w:type="dxa"/>
+              <w:bottom w:w="80" w:type="dxa"/>
+              <w:right w:w="120" w:type="dxa"/>
+            </w:tcMar>
+            <w:vAlign w:val="center"/>
+          </w:tcPr>
+          <w:p>
+            <w:pPr/>
+            <w:r>
+              <w:rPr>
+                <w:sz w:val="18"/>
+              </w:rPr>
+              <w:t>10-18 ago</w:t>
+            </w:r>
+          </w:p>
+        </w:tc>
+        <w:tc>
+          <w:tcPr>
+            <w:tcW w:w="2100" w:type="dxa"/>
+            <w:tcMar>
+              <w:top w:w="80" w:type="dxa"/>
+              <w:left w:w="120" w:type="dxa"/>
+              <w:bottom w:w="80" w:type="dxa"/>
+              <w:right w:w="120" w:type="dxa"/>
+            </w:tcMar>
+            <w:vAlign w:val="center"/>
+          </w:tcPr>
+          <w:p>
+            <w:pPr/>
+            <w:r>
+              <w:rPr>
+                <w:sz w:val="18"/>
+              </w:rPr>
+              <w:t>Configuración opcional y salud operativa</w:t>
+            </w:r>
+          </w:p>
+        </w:tc>
+        <w:tc>
+          <w:tcPr>
+            <w:tcW w:w="5760" w:type="dxa"/>
+            <w:tcMar>
+              <w:top w:w="80" w:type="dxa"/>
+              <w:left w:w="120" w:type="dxa"/>
+              <w:bottom w:w="80" w:type="dxa"/>
+              <w:right w:w="120" w:type="dxa"/>
+            </w:tcMar>
+            <w:vAlign w:val="center"/>
+          </w:tcPr>
+          <w:p>
+            <w:pPr/>
+            <w:r>
+              <w:rPr>
+                <w:sz w:val="18"/>
+              </w:rPr>
+              <w:t>OAuth/Resend opcionales quedan integrados; probes, dependencias y degradación por capacidades permanecen como trabajo local validado estáticamente.</w:t>
+            </w:r>
+          </w:p>
+        </w:tc>
+      </w:tr>
     </w:tbl>
     <w:p>
       <w:pPr>
@@ -2755,10 +2811,36 @@
     </w:p>
     <w:p>
       <w:pPr>
+        <w:pStyle w:val="Ttulo2"/>
+      </w:pPr>
+      <w:r>
+        <w:t>10-18 de agosto - Configuración opcional y salud operativa</w:t>
+      </w:r>
+    </w:p>
+    <w:p>
+      <w:pPr/>
+      <w:r>
+        <w:t>El commit 7a38ac6 integró el ajuste que el corte anterior describía como trabajo local: Core registra OAuth Google solo cuando existen credenciales, devuelve 503 cuando se solicita el inicio de sesión sin configuración y puede arrancar sin el proveedor; notification-service conserva Resend opcional y produce un error explícito si se invoca sin API key o remitente. Los secretos de ejemplo quedaron vacíos y se endureció la validación de tokens internos. HEAD pasó a 7a38ac6 con 134 commits visibles. Las 162 pruebas focalizadas citadas en el corte anterior son evidencia histórica anterior a este commit; en esta ejecución no se repitieron las suites Java ni se validaron proveedores reales.</w:t>
+      </w:r>
+    </w:p>
+    <w:p>
+      <w:pPr/>
+      <w:r>
+        <w:t>El working tree posterior introduce una política operativa todavía no integrada: healthchecks explícitos para todos los procesos persistentes, dependencias service_healthy o service_completed_successfully, reinicio unless-stopped para daemons y un orquestador scripts/compose_health.py que separa la cadena base de capacidades degradables. PostgreSQL/semántica puede degradar a búsqueda literal; RabbitMQ, MinIO y minio-init degradan descargas sin derribar la web; notificaciones, traducciones y trabajos de fondo se informan aparte. start conserva contenedores y logs ante fallos, nunca ejecuta down y permite exigir capacidades concretas con --require.</w:t>
+      </w:r>
+    </w:p>
+    <w:p>
+      <w:pPr/>
+      <w:r>
+        <w:t>La comprobación actual fue estática y focalizada, sin arrancar la aplicación: los Compose local y GHCR conservan 16 servicios, su topología de salud es válida y equivalente y pasaron 11/11 pruebas unitarias del orquestador. Dos suites Python nuevas de scraper y semantic-service no llegaron a recolectarse en el intérprete anfitrión por falta de aiomysql y colisión del paquete app; por tanto, esos healthchecks quedan sin validación de suite en esta ejecución. No se presenta ningún despliegue, benchmark, reinicio automático de contenedores unhealthy ni prueba funcional como completados.</w:t>
+      </w:r>
+    </w:p>
+    <w:p>
+      <w:pPr>
         <w:pStyle w:val="Ttulo1"/>
       </w:pPr>
       <w:r>
-        <w:t xml:space="preserve">Estado actual al 10 de agosto de 2026</w:t>
+        <w:t>Estado actual al 18 de agosto de 2026</w:t>
       </w:r>
     </w:p>
     <w:tbl>
@@ -2950,14 +3032,8 @@
             <w:vAlign w:val="center"/>
           </w:tcPr>
           <w:p>
-            <w:pPr>
-              <w:spacing w:after="0" w:line="252" w:lineRule="auto"/>
-            </w:pPr>
             <w:r>
-              <w:rPr>
-                <w:sz w:val="17"/>
-              </w:rPr>
-              <w:t xml:space="preserve">development, HEAD 9de1e09 y 133 commits visibles. El rediseño principal ya forma parte de HEAD. Durante la ejecución apareció un ajuste local posterior para configuración opcional de OAuth/Resend y secretos vacíos; sigue sin integrar ni revalidar.</w:t>
+              <w:t>development, HEAD 7a38ac6 y 134 commits visibles. El ajuste para OAuth/Resend opcionales, 503 sin Google y secretos de ejemplo vacíos ya forma parte de HEAD. La política de salud operativa posterior sigue sin integrar.</w:t>
             </w:r>
           </w:p>
         </w:tc>
@@ -2973,14 +3049,8 @@
             <w:vAlign w:val="center"/>
           </w:tcPr>
           <w:p>
-            <w:pPr>
-              <w:spacing w:after="0" w:line="252" w:lineRule="auto"/>
-            </w:pPr>
             <w:r>
-              <w:rPr>
-                <w:sz w:val="17"/>
-              </w:rPr>
-              <w:t xml:space="preserve">Validar migraciones V10/V11 y los flujos OAuth, Resend y cuenta sobre un despliegue actualizado.</w:t>
+              <w:t>Validar migraciones V10/V11 y los flujos OAuth, Resend y cuenta sobre un despliegue actualizado; integrar y revalidar por separado la política de salud.</w:t>
             </w:r>
           </w:p>
         </w:tc>
@@ -3021,14 +3091,8 @@
             <w:vAlign w:val="center"/>
           </w:tcPr>
           <w:p>
-            <w:pPr>
-              <w:spacing w:after="0" w:line="252" w:lineRule="auto"/>
-            </w:pPr>
             <w:r>
-              <w:rPr>
-                <w:sz w:val="17"/>
-              </w:rPr>
-              <w:t>Validado funcionalmente</w:t>
+              <w:t>Validado históricamente; endurecimiento local</w:t>
             </w:r>
           </w:p>
         </w:tc>
@@ -3044,14 +3108,8 @@
             <w:vAlign w:val="center"/>
           </w:tcPr>
           <w:p>
-            <w:pPr>
-              <w:spacing w:after="0" w:line="252" w:lineRule="auto"/>
-            </w:pPr>
             <w:r>
-              <w:rPr>
-                <w:sz w:val="17"/>
-              </w:rPr>
-              <w:t>Ambos Compose enumeran 16 servicios. La validación histórica del 5 de agosto dejó 15 servicios activos, minio-init completado, 14 rutas HTTP correctas, colas vacías y cero reinicios tras estabilizar.</w:t>
+              <w:t>Ambos Compose enumeran 16 servicios. La validación histórica del 5 de agosto dejó 15 servicios activos y minio-init completado. El working tree añade probes, dependencias condicionadas y degradación por capacidades; solo se validaron estáticamente la topología y 11 pruebas del orquestador.</w:t>
             </w:r>
           </w:p>
         </w:tc>
@@ -3067,14 +3125,8 @@
             <w:vAlign w:val="center"/>
           </w:tcPr>
           <w:p>
-            <w:pPr>
-              <w:spacing w:after="0" w:line="252" w:lineRule="auto"/>
-            </w:pPr>
             <w:r>
-              <w:rPr>
-                <w:sz w:val="17"/>
-              </w:rPr>
-              <w:t>Ejecutar k6 para medir capacidad y comprobar publicación/visibilidad GHCR en cada release.</w:t>
+              <w:t>Validar el arranque y los fallos reales por capacidad; completar las suites de healthchecks de scraper y semántica; ejecutar k6 y comprobar GHCR.</w:t>
             </w:r>
           </w:p>
         </w:tc>
@@ -3514,14 +3566,8 @@
             <w:vAlign w:val="center"/>
           </w:tcPr>
           <w:p>
-            <w:pPr>
-              <w:spacing w:after="0" w:line="252" w:lineRule="auto"/>
-            </w:pPr>
             <w:r>
-              <w:rPr>
-                <w:sz w:val="17"/>
-              </w:rPr>
-              <w:t>README y ejemplos de entorno por servicio actualizados; .github/copilot-instructions.md no cambió. LaTeX y sus PDF permanecen anteriores al corte.</w:t>
+              <w:t>README e instrucciones describen localmente compose_health.py, estados ready/starting/degraded/failed y diagnóstico con secretos censurados. LaTeX sigue en HEAD 6c0649c, 33 commits y con cambios locales históricos; no se verificó ningún PDF nuevo.</w:t>
             </w:r>
           </w:p>
         </w:tc>
@@ -3747,7 +3793,7 @@
     </w:p>
     <w:p>
       <w:r>
-        <w:t xml:space="preserve">Validar en un despliegue actualizado el rediseño de identidad ya integrado: migraciones V10/V11, registro por correo, principales por UUID, caminos separados de usuario/administrador, OAuth Google, bundles propios, caducidad/consumo de tokens e invalidación de sesiones. Revalidar además el ajuste local posterior que hace opcionales OAuth/Resend y devuelve 503 cuando Google no está configurado. Las suites focalizadas pasan sobre HEAD, pero son anteriores a ese ajuste y no sustituyen estas comprobaciones de integración.</w:t>
+        <w:t>Validar en un despliegue actualizado el rediseño de identidad ya integrado: migraciones V10/V11, registro por correo, principales por UUID, caminos separados de usuario/administrador, OAuth Google, bundles propios, caducidad/consumo de tokens e invalidación de sesiones. El ajuste que hace opcionales OAuth/Resend y devuelve 503 cuando Google no está configurado ya está integrado en HEAD, pero las suites focalizadas citadas son anteriores y no sustituyen estas comprobaciones de integración. Integrar y probar aparte la política local de salud, incluidos fallos de base, descargas y semántica.</w:t>
       </w:r>
     </w:p>
     <w:p>
@@ -5726,14 +5772,8 @@
             <w:vAlign w:val="center"/>
           </w:tcPr>
           <w:p>
-            <w:pPr>
-              <w:spacing w:after="0" w:line="252" w:lineRule="auto"/>
-            </w:pPr>
             <w:r>
-              <w:rPr>
-                <w:sz w:val="18"/>
-              </w:rPr>
-              <w:t xml:space="preserve">133 commits visibles; HEAD 9de1e090f9be0b3f4b3c7f86412c4afd8965f196; rama development. Seis commits integran identidad, OAuth, cuenta, historial y Resend. El working tree contiene un ajuste posterior no integrado sobre configuración opcional y secretos de ejemplo.</w:t>
+              <w:t>134 commits visibles; HEAD 7a38ac6f8d8393698161f52393ebcfbd255f3807; rama development. OAuth/Resend opcionales y la respuesta 503 sin Google ya están integrados. El working tree posterior contiene la política de salud operativa todavía no integrada.</w:t>
             </w:r>
           </w:p>
         </w:tc>
@@ -5774,14 +5814,8 @@
             <w:vAlign w:val="center"/>
           </w:tcPr>
           <w:p>
-            <w:pPr>
-              <w:spacing w:after="0" w:line="252" w:lineRule="auto"/>
-            </w:pPr>
             <w:r>
-              <w:rPr>
-                <w:sz w:val="18"/>
-              </w:rPr>
-              <w:t>Añade el contrato de .env.example por servicio, variantes de procesos y el script sync-service-env-files.ps1 sin copiar credenciales.</w:t>
+              <w:t>Añade localmente compose_health.py, sus comandos start/status/validate, capacidades requeribles y degradación segura; estos cambios todavía no pertenecen a HEAD.</w:t>
             </w:r>
           </w:p>
         </w:tc>
@@ -5822,14 +5856,8 @@
             <w:vAlign w:val="center"/>
           </w:tcPr>
           <w:p>
-            <w:pPr>
-              <w:spacing w:after="0" w:line="252" w:lineRule="auto"/>
-            </w:pPr>
             <w:r>
-              <w:rPr>
-                <w:sz w:val="18"/>
-              </w:rPr>
-              <w:t>Sin cambios desde el corte anterior; conserva propietarios de datos, seguridad y estados públicos, pero no documenta todavía los nuevos límites operativos.</w:t>
+              <w:t>Añade localmente los comandos de validación y estado de salud; mantiene propietarios de datos, seguridad y estados públicos.</w:t>
             </w:r>
           </w:p>
         </w:tc>
@@ -5870,14 +5898,8 @@
             <w:vAlign w:val="center"/>
           </w:tcPr>
           <w:p>
-            <w:pPr>
-              <w:spacing w:after="0" w:line="252" w:lineRule="auto"/>
-            </w:pPr>
             <w:r>
-              <w:rPr>
-                <w:sz w:val="18"/>
-              </w:rPr>
-              <w:t>docker compose config --services enumeró 16 servicios en local y GHCR. Los archivos añaden env_file por servicio, cpu_shares, conexiones limitadas y montajes de RabbitMQ/MinIO.</w:t>
+              <w:t>docker compose config --services enumeró 16 servicios en local y GHCR. La validación estática confirmó topología de salud válida y equivalente; no se arrancaron contenedores.</w:t>
             </w:r>
           </w:p>
         </w:tc>
@@ -5918,14 +5940,8 @@
             <w:vAlign w:val="center"/>
           </w:tcPr>
           <w:p>
-            <w:pPr>
-              <w:spacing w:after="0" w:line="252" w:lineRule="auto"/>
-            </w:pPr>
             <w:r>
-              <w:rPr>
-                <w:sz w:val="18"/>
-              </w:rPr>
-              <w:t>HEAD 6c0649c, 33 commits y el mismo conjunto local histórico: 20 archivos versionados modificados y seis recursos no versionados. memoria.pdf sigue fechado el 23 de julio; no se verificó un PDF nuevo.</w:t>
+              <w:t>HEAD 6c0649c, 33 commits y cambios locales históricos en fuentes y diagramas. No se encontró ni verificó un PDF nuevo durante esta ejecución.</w:t>
             </w:r>
           </w:p>
         </w:tc>
@@ -6039,17 +6055,8 @@
             <w:vAlign w:val="center"/>
           </w:tcPr>
           <w:p>
-            <w:pPr>
-              <w:spacing w:after="0" w:line="252" w:lineRule="auto"/>
-              <w:rPr>
-                <w:sz w:val="18"/>
-              </w:rPr>
-            </w:pPr>
             <w:r>
-              <w:rPr>
-                <w:sz w:val="18"/>
-              </w:rPr>
-              <w:t xml:space="preserve">Git y Maven (10 ago)</w:t>
+              <w:t>Git y validación focalizada (18 ago)</w:t>
             </w:r>
           </w:p>
         </w:tc>
@@ -6065,17 +6072,8 @@
             <w:vAlign w:val="center"/>
           </w:tcPr>
           <w:p>
-            <w:pPr>
-              <w:spacing w:after="0" w:line="252" w:lineRule="auto"/>
-              <w:rPr>
-                <w:sz w:val="18"/>
-              </w:rPr>
-            </w:pPr>
             <w:r>
-              <w:rPr>
-                <w:sz w:val="18"/>
-              </w:rPr>
-              <w:t xml:space="preserve">Los seis commits posteriores al corte acreditan la integración de identidad/OAuth, bundles propios, historial y correo Resend. La ejecución Maven focalizada del 10 de agosto completó 128 pruebas de Core y 34 de notification-service sin fallos. A continuación apareció un ajuste local no integrado sobre configuración opcional de OAuth/Resend y secretos de ejemplo; no se arrancó la aplicación ni se reejecutó la suite después de ese cambio externo.</w:t>
+              <w:t>HEAD 7a38ac6 integra la configuración opcional de OAuth/Resend descrita antes como local. scripts/compose_health.py validó la paridad estática de ambos Compose y completó 11/11 pruebas; las suites Python de healthchecks no recolectaron por dependencias/aislamiento del entorno y quedan sin verificación.</w:t>
             </w:r>
           </w:p>
         </w:tc>
@@ -6096,7 +6094,7 @@
     </w:p>
     <w:p>
       <w:r>
-        <w:t xml:space="preserve">Batch-Downloader ya no es solo un descargador por lotes. Es una plataforma de catálogo y resolución de software con trazabilidad, administración asistida, descargas progresivas, búsqueda semántica local, límites operativos explícitos y una identidad de usuario integrada con cuenta, OAuth y bundles propios. El despliegue y dos ZIP reales cuentan con una validación histórica completa; el siguiente salto de madurez consiste en validar el rediseño de identidad sobre un entorno actualizado, medir la capacidad con k6, verificar visualmente la UX reciente, corregir la deriva de RF-03 y la memoria LaTeX, y cerrar la evaluación semántica full sin rebajar las invariantes operativas surgidas de problemas reales.</w:t>
+        <w:t>Batch-Downloader ya no es solo un descargador por lotes. Es una plataforma de catálogo y resolución de software con trazabilidad, administración asistida, descargas progresivas, búsqueda semántica local, límites operativos explícitos y una identidad de usuario integrada con cuenta, OAuth y bundles propios. La configuración opcional de Google y Resend ya está integrada; el endurecimiento de salud y degradación permanece como trabajo local validado solo de forma estática. El despliegue y dos ZIP reales cuentan con una validación histórica completa; el siguiente salto de madurez consiste en validar el rediseño de identidad sobre un entorno actualizado, medir la capacidad con k6, verificar visualmente la UX reciente, corregir la deriva de RF-03 y la memoria LaTeX, y cerrar la evaluación semántica full sin rebajar las invariantes operativas surgidas de problemas reales.</w:t>
       </w:r>
     </w:p>
     <w:sectPr>
@@ -6163,7 +6161,7 @@
         <w:color w:val="5F6B78"/>
         <w:sz w:val="17"/>
       </w:rPr>
-      <w:t>8 de agosto de 2026</w:t>
+      <w:t>18 de agosto de 2026</w:t>
     </w:r>
     <w:r>
       <w:rPr>

</xml_diff>

<commit_message>
Eliminado el modelo de llama 70b de groq, ya que quedará en desuso en poco tiempo.
</commit_message>
<xml_diff>
--- a/docs/informes/Informe_cronologico_Batch-Downloader_2026-07-28.docx
+++ b/docs/informes/Informe_cronologico_Batch-Downloader_2026-07-28.docx
@@ -91,19 +91,19 @@
     </w:p>
     <w:p>
       <w:pPr>
-        <w:spacing w:after="80"/>
-        <w:jc w:val="center"/>
-      </w:pPr>
-      <w:r>
-        <w:t>Periodo analizado: 16 de junio - 18 de agosto de 2026</w:t>
-      </w:r>
-    </w:p>
-    <w:p>
-      <w:pPr>
         <w:spacing w:after="0"/>
         <w:jc w:val="center"/>
       </w:pPr>
       <w:r>
+        <w:t>Periodo analizado: 16 de junio - 19 de agosto de 2026</w:t>
+      </w:r>
+    </w:p>
+    <w:p>
+      <w:pPr>
+        <w:spacing w:after="0"/>
+        <w:jc w:val="center"/>
+      </w:pPr>
+      <w:r>
         <w:t>Elaborado a partir de 23 conversaciones recuperadas, el historial Git y la evidencia local verificada</w:t>
       </w:r>
     </w:p>
@@ -124,11 +124,6 @@
     <w:p>
       <w:r>
         <w:t>En seis semanas, Batch-Downloader pasó de una estructura inicial con documentación y servicios vacíos a una plataforma distribuida capaz de descubrir aplicaciones, resolver y validar instaladores, exponer un catálogo navegable, generar descargas individuales o agrupadas y mantener una proyección semántica local. La evolución no fue lineal: muchos avances nacieron al convertir fallos reales - URLs caducadas, MIME incorrectos, bloqueos, deadlocks, estados inconsistentes o trabajos atascados - en reglas explícitas, colas duraderas y pruebas de regresión.</w:t>
-      </w:r>
-    </w:p>
-    <w:p>
-      <w:r>
-        <w:t>El resultado actual es un monorepo en la rama development con 134 commits visibles y dos Compose verificados de 16 servicios cada uno. MySQL mantiene la autoridad transaccional del catálogo y PostgreSQL/pgvector sigue siendo una proyección reconstruible. La descarga por lotes publica cada resultado al terminar, separa el empaquetado real, conserva fallos por aplicación y puede incluir accesos seguros a páginas oficiales. El catálogo combina ahora todas las tags con AND, admite un único editor y recalcula las facetas con el conjunto completo de filtros. El rediseño de identidad, sesiones, OAuth, cuenta, bundles propios e historial ya está integrado; Core puede arrancar sin credenciales de Google, responde 503 cuando OAuth no está configurado y Resend falla de forma explícita si se invoca sin configuración. Su validación desplegada sigue pendiente. En el working tree hay además una política de salud y degradación todavía no integrada para ambos Compose. La evaluación semántica que podría justificar la promoción de un modelo continúa sin métricas finales.</w:t>
       </w:r>
     </w:p>
     <w:p>
@@ -138,11 +133,7 @@
         <w:ind w:left="259" w:right="173"/>
       </w:pPr>
       <w:r>
-        <w:rPr>
-          <w:b/>
-          <w:color w:val="B87918"/>
-        </w:rPr>
-        <w:t>Conclusión principal: El proyecto ha madurado sobre todo en fiabilidad operativa: a las invariantes de catálogo, leases y revalidación se suman ahora admisión serializada de trabajos, límites explícitos de CPU, conexiones y disco temporal, backpressure de autenticación y reclamación segura del outbox. Antes,  las incidencias ya no se resuelven con excepciones aisladas, sino mediante invariantes de catálogo, recuperación de leases, revalidación justo antes de descargar y degradación segura cuando un servicio auxiliar no está disponible.</w:t>
+        <w:t>El resultado actual es un monorepo en la rama development con 137 commits visibles y dos Compose de 16 servicios cada uno. La política de salud y degradación por capacidades ya está integrada. Un ajuste posterior corrigió la carga de datos del Compose y la contención del pool del scheduler. La arquitectura semántica sustituyó además la descarga de modelos desde Hugging Face por aprovisionamiento manual local y ejecución estrictamente offline. MySQL mantiene la autoridad transaccional del catálogo y PostgreSQL/pgvector sigue siendo una proyección reconstruible. El rediseño de identidad, sesiones, OAuth, cuenta, bundles propios e historial continúa integrado, aunque su validación desplegada sigue pendiente. La evaluación semántica que podría justificar la promoción de un modelo continúa sin métricas finales.</w:t>
       </w:r>
     </w:p>
     <w:tbl>
@@ -182,10 +173,26 @@
             <w:vAlign w:val="center"/>
           </w:tcPr>
           <w:p>
+            <w:pPr>
+              <w:rPr>
+                <w:b/>
+                <w:color w:val="B87918"/>
+              </w:rPr>
+            </w:pPr>
             <w:r>
-              <w:t>134</w:t>
+              <w:rPr>
+                <w:b/>
+                <w:color w:val="B87918"/>
+              </w:rPr>
+              <w:t>Conclusión principal: La salud operativa, la recuperación selectiva del scheduler y el aprovisionamiento local de modelos reducen fallos y superficie remota.</w:t>
             </w:r>
           </w:p>
+          <w:p>
+            <w:r>
+              <w:t>137</w:t>
+            </w:r>
+          </w:p>
+          <w:p/>
         </w:tc>
         <w:tc>
           <w:tcPr>
@@ -336,11 +343,6 @@
       </w:r>
     </w:p>
     <w:p>
-      <w:r>
-        <w:t>Este informe combina cuatro fuentes: historiales de tareas de Codex vinculadas al checkout principal, conversaciones del repositorio hermano de la memoria LaTeX, la organización del proyecto en GitHub y el historial Git local hasta el commit 7a38ac6 del 10 de agosto de 2026, verificado de nuevo el 18 de agosto. También se contrastaron README.md, .github/copilot-instructions.md, OpenAPI, los dos Compose, el estado del working tree y el estado documental conocido de la memoria LaTeX.</w:t>
-      </w:r>
-    </w:p>
-    <w:p>
       <w:pPr>
         <w:numPr>
           <w:ilvl w:val="0"/>
@@ -348,7 +350,7 @@
         </w:numPr>
       </w:pPr>
       <w:r>
-        <w:t>El apéndice conserva las 23 conversaciones previamente recuperadas y contrastadas. El 18 de agosto, la herramienta de tareas de Codex volvió a quedar sin respuesta en dos consultas acotadas, incluida una espera de dos minutos; por ello no se añade ninguna conversación sin haberla recuperado y la cobertura nueva se limita a evidencia local verificable.</w:t>
+        <w:t>Este informe combina cuatro fuentes: historiales de tareas de Codex vinculadas al checkout principal, conversaciones del repositorio hermano de la memoria LaTeX, la organización del proyecto en GitHub y el historial Git local hasta el commit 25235019 del 19 de agosto de 2026. También se contrastaron README.md, .github/copilot-instructions.md, OpenAPI, los dos Compose, el estado del working tree y el estado documental de la memoria LaTeX.</w:t>
       </w:r>
     </w:p>
     <w:p>
@@ -359,7 +361,7 @@
         </w:numPr>
       </w:pPr>
       <w:r>
-        <w:t>Las cifras históricas se presentan como hitos de verificación en la fecha en que se registraron; no se asume que sigan siendo idénticas hoy.</w:t>
+        <w:t>El apéndice conserva las 23 conversaciones previamente recuperadas y contrastadas. El 19 de agosto, la herramienta de tareas de Codex volvió a quedar sin respuesta durante una consulta de dos minutos; por ello no se añade ninguna conversación sin haberla recuperado y la cobertura nueva se limita a evidencia local verificable.</w:t>
       </w:r>
     </w:p>
     <w:p>
@@ -371,7 +373,7 @@
       </w:pPr>
       <w:r>
         <w:lastRenderedPageBreak/>
-        <w:t>Las decisiones sustituidas se señalan expresamente. Por ejemplo, el estado público pending fue introducido y después eliminado, y la redacción manual de descripciones fue reemplazada por una fase LLM persistente.</w:t>
+        <w:t>Las cifras históricas se presentan como hitos de verificación en la fecha en que se registraron; no se asume que sigan siendo idénticas hoy.</w:t>
       </w:r>
     </w:p>
     <w:p>
@@ -382,7 +384,18 @@
         </w:numPr>
       </w:pPr>
       <w:r>
-        <w:t xml:space="preserve">No se arrancó ni reinició la aplicación completa para preparar este informe. La tarea de capacidad sí dejó evidencia histórica del 5 de agosto sobre un despliegue reconstruido, servicios estables y dos ZIP reales; esos resultados se distinguen de la comprobación local de esta ejecución y de la prueba de carga k6 todavía pendiente. El 10 de agosto se ejecutó una validación Maven focalizada: Core completó 128/128 pruebas y notification-service 34/34, sin fallos. El resto del estado actual se verificó mediante Git, configuración y documentación.</w:t>
+        <w:t>Las decisiones sustituidas se señalan expresamente. Por ejemplo, el estado público pending fue introducido y después eliminado, y la redacción manual de descripciones fue reemplazada por una fase LLM persistente.</w:t>
+      </w:r>
+    </w:p>
+    <w:p>
+      <w:pPr>
+        <w:numPr>
+          <w:ilvl w:val="0"/>
+          <w:numId w:val="1"/>
+        </w:numPr>
+      </w:pPr>
+      <w:r>
+        <w:t>No se arrancó ni reinició la aplicación completa para preparar este informe. La tarea de capacidad sí dejó evidencia histórica del 5 de agosto sobre un despliegue reconstruido, servicios estables y dos ZIP reales; esos resultados se distinguen de la comprobación local de esta ejecución y de la prueba de carga k6 todavía pendiente. El 10 de agosto se ejecutó una validación Maven focalizada: Core completó 128/128 pruebas y notification-service 34/34, sin fallos. El resto del estado actual se verificó mediante Git, configuración y documentación.</w:t>
       </w:r>
     </w:p>
     <w:p>
@@ -1314,6 +1327,7 @@
               <w:rPr>
                 <w:sz w:val="18"/>
               </w:rPr>
+              <w:lastRenderedPageBreak/>
               <w:t>5 ago</w:t>
             </w:r>
           </w:p>
@@ -1337,14 +1351,7 @@
               <w:rPr>
                 <w:sz w:val="18"/>
               </w:rPr>
-              <w:t xml:space="preserve">Capacidad, seguridad y </w:t>
-            </w:r>
-            <w:r>
-              <w:rPr>
-                <w:sz w:val="18"/>
-              </w:rPr>
-              <w:lastRenderedPageBreak/>
-              <w:t>configuración</w:t>
+              <w:t>Capacidad, seguridad y configuración</w:t>
             </w:r>
           </w:p>
         </w:tc>
@@ -1367,15 +1374,7 @@
               <w:rPr>
                 <w:sz w:val="18"/>
               </w:rPr>
-              <w:lastRenderedPageBreak/>
-              <w:t xml:space="preserve">Admisión serializada, límites de disco y conexiones, outbox reclamable, </w:t>
-            </w:r>
-            <w:r>
-              <w:rPr>
-                <w:sz w:val="18"/>
-              </w:rPr>
-              <w:lastRenderedPageBreak/>
-              <w:t>caché HTTP, protección de autenticación y .env por servicio.</w:t>
+              <w:t>Admisión serializada, límites de disco y conexiones, outbox reclamable, caché HTTP, protección de autenticación y .env por servicio.</w:t>
             </w:r>
           </w:p>
         </w:tc>
@@ -1403,8 +1402,7 @@
               <w:rPr>
                 <w:sz w:val="18"/>
               </w:rPr>
-              <w:lastRenderedPageBreak/>
-              <w:t xml:space="preserve">8-10 ago</w:t>
+              <w:t>8-10 ago</w:t>
             </w:r>
           </w:p>
         </w:tc>
@@ -1430,7 +1428,7 @@
               <w:rPr>
                 <w:sz w:val="18"/>
               </w:rPr>
-              <w:t xml:space="preserve">Identidad integrada y validación focalizada</w:t>
+              <w:t>Identidad integrada y validación focalizada</w:t>
             </w:r>
           </w:p>
         </w:tc>
@@ -1456,7 +1454,7 @@
               <w:rPr>
                 <w:sz w:val="18"/>
               </w:rPr>
-              <w:t xml:space="preserve">Seis commits integran OAuth Google, área de cuenta, bundles propios, historial, Resend y migraciones; 162 pruebas focalizadas pasan.</w:t>
+              <w:t>Seis commits integran OAuth Google, área de cuenta, bundles propios, historial, Resend y migraciones; 162 pruebas focalizadas pasan.</w:t>
             </w:r>
           </w:p>
         </w:tc>
@@ -1474,14 +1472,19 @@
             <w:vAlign w:val="center"/>
           </w:tcPr>
           <w:p>
-            <w:pPr/>
+            <w:pPr>
+              <w:rPr>
+                <w:sz w:val="18"/>
+              </w:rPr>
+            </w:pPr>
             <w:r>
               <w:rPr>
                 <w:sz w:val="18"/>
               </w:rPr>
-              <w:t>10-18 ago</w:t>
+              <w:t>10-19 ago</w:t>
             </w:r>
           </w:p>
+          <w:p/>
         </w:tc>
         <w:tc>
           <w:tcPr>
@@ -1495,7 +1498,6 @@
             <w:vAlign w:val="center"/>
           </w:tcPr>
           <w:p>
-            <w:pPr/>
             <w:r>
               <w:rPr>
                 <w:sz w:val="18"/>
@@ -1516,14 +1518,19 @@
             <w:vAlign w:val="center"/>
           </w:tcPr>
           <w:p>
-            <w:pPr/>
+            <w:pPr>
+              <w:rPr>
+                <w:sz w:val="18"/>
+              </w:rPr>
+            </w:pPr>
             <w:r>
               <w:rPr>
                 <w:sz w:val="18"/>
               </w:rPr>
-              <w:t>OAuth/Resend opcionales quedan integrados; probes, dependencias y degradación por capacidades permanecen como trabajo local validado estáticamente.</w:t>
+              <w:t>OAuth/Resend opcionales y la política de salud quedan integrados; se corrige la carga de datos del Compose y se retira la descarga remota de modelos semánticos.</w:t>
             </w:r>
           </w:p>
+          <w:p/>
         </w:tc>
       </w:tr>
     </w:tbl>
@@ -1591,7 +1598,11 @@
     </w:p>
     <w:p>
       <w:r>
-        <w:t>En paralelo nació el frontend React/Vite/TypeScript con búsqueda, filtros, tabla, panel de detalle y descarga individual. También se añadieron locales en español, una plantilla vacía para nuevos idiomas, servicios mínimos en Spring/FastAPI y un Compose global. Los primeros errores de integración - localhost dentro de Docker, proxy Nginx y accesos lazy de SQLAlchemy - se corrigieron antes de validar un smoke de cinco aplicaciones.</w:t>
+        <w:t xml:space="preserve">En paralelo nació el frontend React/Vite/TypeScript con búsqueda, filtros, tabla, panel de detalle y descarga individual. También se añadieron locales en español, una plantilla vacía para nuevos idiomas, servicios mínimos en Spring/FastAPI y un Compose global. Los primeros errores de integración - </w:t>
+      </w:r>
+      <w:r>
+        <w:lastRenderedPageBreak/>
+        <w:t>localhost dentro de Docker, proxy Nginx y accesos lazy de SQLAlchemy - se corrigieron antes de validar un smoke de cinco aplicaciones.</w:t>
       </w:r>
     </w:p>
     <w:p>
@@ -1616,18 +1627,77 @@
         <w:pStyle w:val="Ttulo2"/>
       </w:pPr>
       <w:r>
+        <w:t>30 de junio - Descripciones y panel administrativo</w:t>
+      </w:r>
+    </w:p>
+    <w:p>
+      <w:r>
+        <w:t>Se añadió el enriquecimiento de descripciones largas mediante proveedores LLM, con Groq y DeepSeek, y se preparó el catálogo para futuros embeddings. La interfaz recibió páginas de inicio y administración, además de una vista del estado del scraper. En este momento la generación todavía era un proceso por lotes, anterior a la futura fase Descriptor.</w:t>
+      </w:r>
+    </w:p>
+    <w:p>
+      <w:r>
+        <w:t>También se ajustó el scraper para no reprocesar indiscriminadamente aplicaciones ya conocidas. Esta política se refinó varias veces: primero se saltaban solo fuentes válidas y después se llegó a ignorar cualquier winstall_id existente; más adelante se recuperó un criterio más preciso para reanalizar estados obsoletos, incompletos o en revisión.</w:t>
+      </w:r>
+    </w:p>
+    <w:p>
+      <w:pPr>
+        <w:pStyle w:val="Ttulo2"/>
+      </w:pPr>
+      <w:r>
+        <w:t>1 de julio - Catálogo compartible y descargas múltiples</w:t>
+      </w:r>
+    </w:p>
+    <w:p>
+      <w:r>
+        <w:t>La navegación por nombres se sustituyó por UUID, manteniendo aliases legacy. Se añadió la ruta compartible /catalog/app/&lt;uuid&gt;, WebSocket público para cambios de catálogo y un drawer capaz de cargar una aplicación aunque no esté en la página actual. La selección por checkbox permitió preparar descargas ZIP de hasta 100 aplicaciones.</w:t>
+      </w:r>
+    </w:p>
+    <w:p>
+      <w:r>
+        <w:t>El panel administrativo se rehízo para gestionar aplicaciones y bundles, generar descripciones, borrar registros y observar el scraper. Un fallo masivo StatementError reveló problemas de UUID binarios y JSON no serializable; se añadieron tipos tolerantes, saneado JSON y diagnósticos seguros visibles en el panel.</w:t>
+      </w:r>
+    </w:p>
+    <w:p>
+      <w:pPr>
+        <w:pStyle w:val="Ttulo2"/>
+      </w:pPr>
+      <w:r>
+        <w:t>3-4 de julio - Rendimiento, facetas e internacionalización</w:t>
+      </w:r>
+    </w:p>
+    <w:p>
+      <w:r>
+        <w:t>Un error MySQL Out of sort memory se trazó a SELECT DISTINCT a.* con columnas text/json. La solución fue paginar primero por ID y cargar después los registros completos, reduciendo memoria y estabilizando el catálogo. También se modernizó RabbitMQ y se confirmó que algunas alarmas de memoria eran transitorias.</w:t>
+      </w:r>
+    </w:p>
+    <w:p>
+      <w:r>
+        <w:t>El catálogo ganó filtros combinables por sistema operativo, arquitectura, etiquetas y editor, junto con páginas de facetas y persistencia en URL. Un 500 por SQL mal concatenado en una faceta se convirtió en una regresión automatizada. Las traducciones quedaron centralizadas en es.json y template.json, y se eliminaron textos visibles incrustados en React.</w:t>
+      </w:r>
+    </w:p>
+    <w:p>
+      <w:pPr>
+        <w:pStyle w:val="Ttulo2"/>
+      </w:pPr>
+      <w:r>
+        <w:t>7-8 de julio - Pipeline persistente y despliegue GHCR</w:t>
+      </w:r>
+    </w:p>
+    <w:p>
+      <w:r>
+        <w:t>El CSS monolítico se dividió en variables, estilos globales, componentes, páginas y responsive. TypeScript se actualizó a moduleResolution=bundler. En el backend, el scraper se refactorizó a Searcher -&gt; Filter -&gt; Scraper con colas persistentes, leases, backpressure, pausa, parada, reanudación y snapshots.</w:t>
+      </w:r>
+    </w:p>
+    <w:p>
+      <w:r>
         <w:lastRenderedPageBreak/>
-        <w:t>30 de junio - Descripciones y panel administrativo</w:t>
-      </w:r>
-    </w:p>
-    <w:p>
-      <w:r>
-        <w:t>Se añadió el enriquecimiento de descripciones largas mediante proveedores LLM, con Groq y DeepSeek, y se preparó el catálogo para futuros embeddings. La interfaz recibió páginas de inicio y administración, además de una vista del estado del scraper. En este momento la generación todavía era un proceso por lotes, anterior a la futura fase Descriptor.</w:t>
-      </w:r>
-    </w:p>
-    <w:p>
-      <w:r>
-        <w:t>También se ajustó el scraper para no reprocesar indiscriminadamente aplicaciones ya conocidas. Esta política se refinó varias veces: primero se saltaban solo fuentes válidas y después se llegó a ignorar cualquier winstall_id existente; más adelante se recuperó un criterio más preciso para reanalizar estados obsoletos, incompletos o en revisión.</w:t>
+        <w:t>Los deadlocks durante claim podían matar workers y aparentar que solo uno trabajaba. Se añadieron reintentos, marcadores de inicio y recuperación de leases caducados o ausentes. El panel administrativo recibió acciones para reparar atascadas, reintentar fallidas y limpiar finalizadas, además de métricas y WebSocket.</w:t>
+      </w:r>
+    </w:p>
+    <w:p>
+      <w:r>
+        <w:t>El despliegue se separó entre desarrollo y GHCR, con un workflow que construye en pull requests y publica desde main. README y .env.example documentaron ambos flujos. La nomenclatura cambió con el tiempo; el estado actual usa docker-compose.yml y docker-compose.ghcr.yml.</w:t>
       </w:r>
     </w:p>
     <w:p>
@@ -1635,17 +1705,22 @@
         <w:pStyle w:val="Ttulo2"/>
       </w:pPr>
       <w:r>
-        <w:t>1 de julio - Catálogo compartible y descargas múltiples</w:t>
-      </w:r>
-    </w:p>
-    <w:p>
-      <w:r>
-        <w:t>La navegación por nombres se sustituyó por UUID, manteniendo aliases legacy. Se añadió la ruta compartible /catalog/app/&lt;uuid&gt;, WebSocket público para cambios de catálogo y un drawer capaz de cargar una aplicación aunque no esté en la página actual. La selección por checkbox permitió preparar descargas ZIP de hasta 100 aplicaciones.</w:t>
-      </w:r>
-    </w:p>
-    <w:p>
-      <w:r>
-        <w:t>El panel administrativo se rehízo para gestionar aplicaciones y bundles, generar descripciones, borrar registros y observar el scraper. Un fallo masivo StatementError reveló problemas de UUID binarios y JSON no serializable; se añadieron tipos tolerantes, saneado JSON y diagnósticos seguros visibles en el panel.</w:t>
+        <w:t>9-10 de julio - Validación de fuentes y cuarta fase</w:t>
+      </w:r>
+    </w:p>
+    <w:p>
+      <w:r>
+        <w:t>Se incorporó exportación CSV administrativa y se endureció el resolver. El scraper aprendió a distinguir instaladores por firma real, aceptar MIME legítimos aunque fueran imprecisos, usar GET parcial, corregir SourceForge, soportar GitHub expanded_assets, recuperar directorios versionados y reconocer desafíos anti-bot estrictamente atestiguados.</w:t>
+      </w:r>
+    </w:p>
+    <w:p>
+      <w:r>
+        <w:t>El enriquecimiento de descripciones se convirtió en una fase persistente Descriptor. La cola separó solicitudes automáticas y administrativas, añadió prioridad y un limitador global en MySQL para espaciar las llamadas LLM al menos cinco segundos. La generación manual pasó a responder 202 y a completarse de forma asíncrona.</w:t>
+      </w:r>
+    </w:p>
+    <w:p>
+      <w:r>
+        <w:t>Una ejecución quedó marcada running/paused tras un reinicio. Se saneó como partial/force_stopped, se liberaron items en progreso y se añadieron controles de parada forzada y limpieza segura. El frontend pidió confirmación antes de vaciar todas las colas.</w:t>
       </w:r>
     </w:p>
     <w:p>
@@ -1653,17 +1728,22 @@
         <w:pStyle w:val="Ttulo2"/>
       </w:pPr>
       <w:r>
-        <w:t>3-4 de julio - Rendimiento, facetas e internacionalización</w:t>
-      </w:r>
-    </w:p>
-    <w:p>
-      <w:r>
-        <w:t>Un error MySQL Out of sort memory se trazó a SELECT DISTINCT a.* con columnas text/json. La solución fue paginar primero por ID y cargar después los registros completos, reduciendo memoria y estabilizando el catálogo. También se modernizó RabbitMQ y se confirmó que algunas alarmas de memoria eran transitorias.</w:t>
-      </w:r>
-    </w:p>
-    <w:p>
-      <w:r>
-        <w:t>El catálogo ganó filtros combinables por sistema operativo, arquitectura, etiquetas y editor, junto con páginas de facetas y persistencia en URL. Un 500 por SQL mal concatenado en una faceta se convirtió en una regresión automatizada. Las traducciones quedaron centralizadas en es.json y template.json, y se eliminaron textos visibles incrustados en React.</w:t>
+        <w:t>11-16 de julio - Plataforma completa de servicios</w:t>
+      </w:r>
+    </w:p>
+    <w:p>
+      <w:r>
+        <w:t>El refactor transversal completó autenticación, usuarios, bundles, jobs de descarga, outbox, RabbitMQ, worker de descargas, MinIO, notificaciones por correo, traducciones, SSE, cancelación y propiedad anónima mediante cookie HMAC. Los servicios dejaron de transportar URLs firmadas por eventos; el worker solicita una referencia y la revalida justo antes de descargar.</w:t>
+      </w:r>
+    </w:p>
+    <w:p>
+      <w:r>
+        <w:t>Se corrigieron incompatibilidades entre contratos antiguos y nuevos, problemas ETag, desconexiones SSE y una cookie Secure que impedía conservar sesión en http://localhost. La configuración se unificó en .env y se eliminaron DSN completos y defaults silenciosos de Spring.</w:t>
+      </w:r>
+    </w:p>
+    <w:p>
+      <w:r>
+        <w:t>Durante esta fase se generaron y verificaron PDF de memoria y anexos, diagramas y documentación reproducible. También se introdujo temporalmente el estado público pending para explicar aplicaciones no descargables en ese momento; esta decisión fue sustituida el 18 de julio.</w:t>
       </w:r>
     </w:p>
     <w:p>
@@ -1671,23 +1751,23 @@
         <w:pStyle w:val="Ttulo2"/>
       </w:pPr>
       <w:r>
-        <w:t>7-8 de julio - Pipeline persistente y despliegue GHCR</w:t>
-      </w:r>
-    </w:p>
-    <w:p>
-      <w:r>
-        <w:t>El CSS monolítico se dividió en variables, estilos globales, componentes, páginas y responsive. TypeScript se actualizó a moduleResolution=bundler. En el backend, el scraper se refactorizó a Searcher -&gt; Filter -&gt; Scraper con colas persistentes, leases, backpressure, pausa, parada, reanudación y snapshots.</w:t>
-      </w:r>
-    </w:p>
-    <w:p>
-      <w:r>
-        <w:t>Los deadlocks durante claim podían matar workers y aparentar que solo uno trabajaba. Se añadieron reintentos, marcadores de inicio y recuperación de leases caducados o ausentes. El panel administrativo recibió acciones para reparar atascadas, reintentar fallidas y limpiar finalizadas, además de métricas y WebSocket.</w:t>
+        <w:t>18 de julio - Estados públicos e invariantes de catálogo</w:t>
+      </w:r>
+    </w:p>
+    <w:p>
+      <w:r>
+        <w:t>Los filtros Revisión y Sin instalador mezclaban aplicaciones disponibles. La solución fue trasladar la clasificación a una proyección MySQL explícita, con columnas generadas, backfill, triggers, contadores singleton y comandos idempotentes check/repair. Los únicos estados públicos pasaron a ser available, review y missing; pending quedó reservado para colas internas.</w:t>
       </w:r>
     </w:p>
     <w:p>
       <w:r>
         <w:lastRenderedPageBreak/>
-        <w:t>El despliegue se separó entre desarrollo y GHCR, con un workflow que construye en pull requests y publica desde main. README y .env.example documentaron ambos flujos. La nomenclatura cambió con el tiempo; el estado actual usa docker-compose.yml y docker-compose.ghcr.yml.</w:t>
+        <w:t>Core, scraper, OpenAPI, frontend, traducciones y reglas de Copilot se alinearon con la misma semántica. La antigüedad de checked_at o expires_at dejó de cambiar por sí sola la clasificación: una fuente válida sigue visible y se revalida justo antes de entregarse al worker.</w:t>
+      </w:r>
+    </w:p>
+    <w:p>
+      <w:r>
+        <w:t>Las pruebas de código quedaron completadas, pero la conversación terminó con una imagen antigua todavía desplegada y sin la verificación visual final de la reconstrucción. Por eso el hito se considera completado en código y posteriormente integrado, pero aquella sesión concreta fue parcial.</w:t>
       </w:r>
     </w:p>
     <w:p>
@@ -1695,22 +1775,22 @@
         <w:pStyle w:val="Ttulo2"/>
       </w:pPr>
       <w:r>
-        <w:t>9-10 de julio - Validación de fuentes y cuarta fase</w:t>
-      </w:r>
-    </w:p>
-    <w:p>
-      <w:r>
-        <w:t>Se incorporó exportación CSV administrativa y se endureció el resolver. El scraper aprendió a distinguir instaladores por firma real, aceptar MIME legítimos aunque fueran imprecisos, usar GET parcial, corregir SourceForge, soportar GitHub expanded_assets, recuperar directorios versionados y reconocer desafíos anti-bot estrictamente atestiguados.</w:t>
-      </w:r>
-    </w:p>
-    <w:p>
-      <w:r>
-        <w:t>El enriquecimiento de descripciones se convirtió en una fase persistente Descriptor. La cola separó solicitudes automáticas y administrativas, añadió prioridad y un limitador global en MySQL para espaciar las llamadas LLM al menos cinco segundos. La generación manual pasó a responder 202 y a completarse de forma asíncrona.</w:t>
-      </w:r>
-    </w:p>
-    <w:p>
-      <w:r>
-        <w:t>Una ejecución quedó marcada running/paused tras un reinicio. Se saneó como partial/force_stopped, se liberaron items en progreso y se añadieron controles de parada forzada y limpieza segura. El frontend pidió confirmación antes de vaciar todas las colas.</w:t>
+        <w:t>23-24 de julio - Búsqueda semántica y CPython 3.14t</w:t>
+      </w:r>
+    </w:p>
+    <w:p>
+      <w:r>
+        <w:t>Se implementó semantic-service sobre PostgreSQL/pgvector y se integraron MiniLM multilingüe, multilingual-E5-base y BGE-M3. Core añadió searchMode lexical|semantic y aplicó los filtros, facetas y paginación finales en MySQL. Ante índice incompleto, timeout o error, la petición completa degrada a literal sin mezclar rankings parciales.</w:t>
+      </w:r>
+    </w:p>
+    <w:p>
+      <w:r>
+        <w:t>El scraper pasó a CPython 3.14.6 free-threaded. Solo las funciones puras de parseo, normalización, scoring y deduplicación cruzan al executor; clientes HTTP, SQLAlchemy y Playwright se mantienen en el event loop. Los benchmarks controlados mostraron mejoras cercanas a 3,1x-3,38x a ocho hilos con checksums idénticos.</w:t>
+      </w:r>
+    </w:p>
+    <w:p>
+      <w:r>
+        <w:t>El smoke semántico verificó descarga, LoRA, evaluación e informes, pero no fue elegible para promover un modelo. E5-base zero-shot permaneció activo. Las fuentes LaTeX se actualizaron, aunque la conversación no verificó ambos PDF finales después de esos cambios.</w:t>
       </w:r>
     </w:p>
     <w:p>
@@ -1718,22 +1798,22 @@
         <w:pStyle w:val="Ttulo2"/>
       </w:pPr>
       <w:r>
-        <w:t>11-16 de julio - Plataforma completa de servicios</w:t>
-      </w:r>
-    </w:p>
-    <w:p>
-      <w:r>
-        <w:t>El refactor transversal completó autenticación, usuarios, bundles, jobs de descarga, outbox, RabbitMQ, worker de descargas, MinIO, notificaciones por correo, traducciones, SSE, cancelación y propiedad anónima mediante cookie HMAC. Los servicios dejaron de transportar URLs firmadas por eventos; el worker solicita una referencia y la revalida justo antes de descargar.</w:t>
-      </w:r>
-    </w:p>
-    <w:p>
-      <w:r>
-        <w:t>Se corrigieron incompatibilidades entre contratos antiguos y nuevos, problemas ETag, desconexiones SSE y una cookie Secure que impedía conservar sesión en http://localhost. La configuración se unificó en .env y se eliminaron DSN completos y defaults silenciosos de Spring.</w:t>
-      </w:r>
-    </w:p>
-    <w:p>
-      <w:r>
-        <w:t>Durante esta fase se generaron y verificaron PDF de memoria y anexos, diagramas y documentación reproducible. También se introdujo temporalmente el estado público pending para explicar aplicaciones no descargables en ese momento; esta decisión fue sustituida el 18 de julio.</w:t>
+        <w:t>26 de julio - Bundles, administración semántica y recuperación</w:t>
+      </w:r>
+    </w:p>
+    <w:p>
+      <w:r>
+        <w:t>La interfaz evitó duplicados ocultando del selector las aplicaciones ya presentes en un bundle y restaurándolas al eliminarlas. Los bundles mostraron sistemas operativos comunes, añadieron filtros por SO y orden Más descargadas. El catálogo pasó a seleccionar available por defecto y el modo de búsqueda visible evolucionó de híbrido a semántico.</w:t>
+      </w:r>
+    </w:p>
+    <w:p>
+      <w:r>
+        <w:t>Un bundle Launchers parecía bloqueado porque una URL temporal de itch había caducado. El worker reintentaba el bundle completo ante un 503 de revalidación. La solución fue aislar el fallo por aplicación: el job terminó PARTIAL al 100 %, con 16 de 17 instaladores y un ZIP aproximado de 1,1 GB.</w:t>
+      </w:r>
+    </w:p>
+    <w:p>
+      <w:r>
+        <w:t>La administración de modelos añadió operaciones duraderas con leases. Un benchmark semántico repetía un dataset de 75.682 consultas y calculaba ranking literal para más de 200 millones de comparaciones innecesarias por modelo. Se implementó reutilización segura de snapshots y se eliminó el ranking literal en evaluaciones semánticas. La operación continuó, pero sus métricas finales no quedaron verificadas.</w:t>
       </w:r>
     </w:p>
     <w:p>
@@ -1741,22 +1821,31 @@
         <w:pStyle w:val="Ttulo2"/>
       </w:pPr>
       <w:r>
-        <w:t>18 de julio - Estados públicos e invariantes de catálogo</w:t>
-      </w:r>
-    </w:p>
-    <w:p>
-      <w:r>
-        <w:t>Los filtros Revisión y Sin instalador mezclaban aplicaciones disponibles. La solución fue trasladar la clasificación a una proyección MySQL explícita, con columnas generadas, backfill, triggers, contadores singleton y comandos idempotentes check/repair. Los únicos estados públicos pasaron a ser available, review y missing; pending quedó reservado para colas internas.</w:t>
-      </w:r>
-    </w:p>
-    <w:p>
-      <w:r>
-        <w:t>Core, scraper, OpenAPI, frontend, traducciones y reglas de Copilot se alinearon con la misma semántica. La antigüedad de checked_at o expires_at dejó de cambiar por sí sola la clasificación: una fuente válida sigue visible y se revalida justo antes de entregarse al worker.</w:t>
-      </w:r>
-    </w:p>
-    <w:p>
-      <w:r>
-        <w:t>Las pruebas de código quedaron completadas, pero la conversación terminó con una imagen antigua todavía desplegada y sin la verificación visual final de la reconstrucción. Por eso el hito se considera completado en código y posteriormente integrado, pero aquella sesión concreta fue parcial.</w:t>
+        <w:t>28 de julio - Administración asistida y ajustes recientes</w:t>
+      </w:r>
+    </w:p>
+    <w:p>
+      <w:r>
+        <w:t>Se integraron snapshots de evaluación y manejo de consultas semánticas, se corrigió el estado vacío del panel de detalle y se resolvió un fallo al crear bundles: owner_id llegaba a MySQL como objeto Java serializado en vez de UUID textual.</w:t>
+      </w:r>
+    </w:p>
+    <w:p>
+      <w:r>
+        <w:t xml:space="preserve">La administración incorporó un banco de resolución para aplicaciones review o missing. El operador aporta una página de origen y una o varias URI opcionales para Windows, macOS y Linux; cada URI se </w:t>
+      </w:r>
+      <w:r>
+        <w:lastRenderedPageBreak/>
+        <w:t>valida contra su plataforma, se cifra por separado y la cola transporta únicamente el identificador de inspección. La previsualización no modifica el catálogo y la publicación revalida y crea o reutiliza las fuentes en una sola transacción.</w:t>
+      </w:r>
+    </w:p>
+    <w:p>
+      <w:r>
+        <w:t>El alta de una aplicación nueva se redujo a su web oficial, con URI por sistema operativo opcionales. Un trabajo persistente extrae metadatos permitidos, genera la descripción larga, busca instaladores y presenta una previsualización editable sin revelar enlaces ejecutables. Si no queda ningún candidato fiable tras la revalidación, la aplicación se conserva como missing en lugar de publicar una descarga dudosa.</w:t>
+      </w:r>
+    </w:p>
+    <w:p>
+      <w:r>
+        <w:t>La conversación final registró 189 pruebas del scraper, incluida integración MySQL, 59 de Core, 76 del frontend y build de producción, además de Ruff, compileall, Redocly, traducciones, ambos Compose y git diff --check. Son resultados históricos de esa implementación; este informe no arrancó ni volvió a ejecutar la aplicación completa. Los dos commits posteriores al corte anterior dejaron HEAD en 814f0e8 y 111 commits visibles.</w:t>
       </w:r>
     </w:p>
     <w:p>
@@ -1764,80 +1853,6 @@
         <w:pStyle w:val="Ttulo2"/>
       </w:pPr>
       <w:r>
-        <w:t>23-24 de julio - Búsqueda semántica y CPython 3.14t</w:t>
-      </w:r>
-    </w:p>
-    <w:p>
-      <w:r>
-        <w:t>Se implementó semantic-service sobre PostgreSQL/pgvector y se integraron MiniLM multilingüe, multilingual-E5-base y BGE-M3. Core añadió searchMode lexical|semantic y aplicó los filtros, facetas y paginación finales en MySQL. Ante índice incompleto, timeout o error, la petición completa degrada a literal sin mezclar rankings parciales.</w:t>
-      </w:r>
-    </w:p>
-    <w:p>
-      <w:r>
-        <w:t>El scraper pasó a CPython 3.14.6 free-threaded. Solo las funciones puras de parseo, normalización, scoring y deduplicación cruzan al executor; clientes HTTP, SQLAlchemy y Playwright se mantienen en el event loop. Los benchmarks controlados mostraron mejoras cercanas a 3,1x-3,38x a ocho hilos con checksums idénticos.</w:t>
-      </w:r>
-    </w:p>
-    <w:p>
-      <w:r>
-        <w:t>El smoke semántico verificó descarga, LoRA, evaluación e informes, pero no fue elegible para promover un modelo. E5-base zero-shot permaneció activo. Las fuentes LaTeX se actualizaron, aunque la conversación no verificó ambos PDF finales después de esos cambios.</w:t>
-      </w:r>
-    </w:p>
-    <w:p>
-      <w:pPr>
-        <w:pStyle w:val="Ttulo2"/>
-      </w:pPr>
-      <w:r>
-        <w:t>26 de julio - Bundles, administración semántica y recuperación</w:t>
-      </w:r>
-    </w:p>
-    <w:p>
-      <w:r>
-        <w:t>La interfaz evitó duplicados ocultando del selector las aplicaciones ya presentes en un bundle y restaurándolas al eliminarlas. Los bundles mostraron sistemas operativos comunes, añadieron filtros por SO y orden Más descargadas. El catálogo pasó a seleccionar available por defecto y el modo de búsqueda visible evolucionó de híbrido a semántico.</w:t>
-      </w:r>
-    </w:p>
-    <w:p>
-      <w:r>
-        <w:t>Un bundle Launchers parecía bloqueado porque una URL temporal de itch había caducado. El worker reintentaba el bundle completo ante un 503 de revalidación. La solución fue aislar el fallo por aplicación: el job terminó PARTIAL al 100 %, con 16 de 17 instaladores y un ZIP aproximado de 1,1 GB.</w:t>
-      </w:r>
-    </w:p>
-    <w:p>
-      <w:r>
-        <w:t>La administración de modelos añadió operaciones duraderas con leases. Un benchmark semántico repetía un dataset de 75.682 consultas y calculaba ranking literal para más de 200 millones de comparaciones innecesarias por modelo. Se implementó reutilización segura de snapshots y se eliminó el ranking literal en evaluaciones semánticas. La operación continuó, pero sus métricas finales no quedaron verificadas.</w:t>
-      </w:r>
-    </w:p>
-    <w:p>
-      <w:pPr>
-        <w:pStyle w:val="Ttulo2"/>
-      </w:pPr>
-      <w:r>
-        <w:t>28 de julio - Administración asistida y ajustes recientes</w:t>
-      </w:r>
-    </w:p>
-    <w:p>
-      <w:r>
-        <w:t>Se integraron snapshots de evaluación y manejo de consultas semánticas, se corrigió el estado vacío del panel de detalle y se resolvió un fallo al crear bundles: owner_id llegaba a MySQL como objeto Java serializado en vez de UUID textual.</w:t>
-      </w:r>
-    </w:p>
-    <w:p>
-      <w:r>
-        <w:t>La administración incorporó un banco de resolución para aplicaciones review o missing. El operador aporta una página de origen y una o varias URI opcionales para Windows, macOS y Linux; cada URI se valida contra su plataforma, se cifra por separado y la cola transporta únicamente el identificador de inspección. La previsualización no modifica el catálogo y la publicación revalida y crea o reutiliza las fuentes en una sola transacción.</w:t>
-      </w:r>
-    </w:p>
-    <w:p>
-      <w:r>
-        <w:t>El alta de una aplicación nueva se redujo a su web oficial, con URI por sistema operativo opcionales. Un trabajo persistente extrae metadatos permitidos, genera la descripción larga, busca instaladores y presenta una previsualización editable sin revelar enlaces ejecutables. Si no queda ningún candidato fiable tras la revalidación, la aplicación se conserva como missing en lugar de publicar una descarga dudosa.</w:t>
-      </w:r>
-    </w:p>
-    <w:p>
-      <w:r>
-        <w:t>La conversación final registró 189 pruebas del scraper, incluida integración MySQL, 59 de Core, 76 del frontend y build de producción, además de Ruff, compileall, Redocly, traducciones, ambos Compose y git diff --check. Son resultados históricos de esa implementación; este informe no arrancó ni volvió a ejecutar la aplicación completa. Los dos commits posteriores al corte anterior dejaron HEAD en 814f0e8 y 111 commits visibles.</w:t>
-      </w:r>
-    </w:p>
-    <w:p>
-      <w:pPr>
-        <w:pStyle w:val="Ttulo2"/>
-      </w:pPr>
-      <w:r>
         <w:t>29-31 de julio - Descargas, catálogo y documentación integrada</w:t>
       </w:r>
     </w:p>
@@ -1868,6 +1883,7 @@
     </w:p>
     <w:p>
       <w:r>
+        <w:lastRenderedPageBreak/>
         <w:t>Una nueva tarea rediseñó la selección temporal del catálogo: rejilla adaptable de 6 columnas por 3 filas, 17 iconos visibles y un hueco final +X, orden desde la incorporación más reciente, nombre en hover y retirada directa. El ancho fijo que desbordaba el fieldset se sustituyó por columnas proporcionales. La tarjeta pública de bundles también recibió cabecera, franja de miniaturas y pie simétricos.</w:t>
       </w:r>
     </w:p>
@@ -2066,6 +2082,7 @@
         <w:pStyle w:val="Ttulo2"/>
       </w:pPr>
       <w:r>
+        <w:lastRenderedPageBreak/>
         <w:t>4. Integridad y rendimiento de MySQL</w:t>
       </w:r>
     </w:p>
@@ -2669,22 +2686,22 @@
         <w:pStyle w:val="Ttulo2"/>
       </w:pPr>
       <w:r>
-        <w:t xml:space="preserve">8 de agosto - Rediseño de identidad integrado y pendiente de despliegue</w:t>
-      </w:r>
-    </w:p>
-    <w:p>
-      <w:r>
-        <w:t xml:space="preserve">Se integró en seis commits el rediseño material de identidad: el registro público parte del correo con username generado y editable; el acceso administrativo queda separado; el principal de sesión conserva el UUID estable; y las cuentas sin contraseña pueden enlazarse a Google por subject OIDC mediante oauth_identities, con retorno interno validado y manejadores de éxito/fallo. También se incorporaron políticas compartidas de username y contraseña, respuestas 403/410 con códigos públicos, invalidación de sesiones y una vista que enumera los métodos de autenticación.</w:t>
-      </w:r>
-    </w:p>
-    <w:p>
-      <w:r>
-        <w:t xml:space="preserve">Los tokens de verificación y restablecimiento quedaron endurecidos con consumo lógico, bloqueo pesimista, distinción entre token inválido, caducado o ya usado y revocación de sesiones tras cambiar la contraseña. Los correos de identidad se enrutan por Resend, con token cifrado, idempotencia, clasificación de errores y purga del dato sensible del outbox tras publicar; las notificaciones de descargas conservan SMTP. Las migraciones V10 y V11 incorporan la nulabilidad de password_hash, la versión de tokens, identidades OAuth y un historial de descargas por usuario.</w:t>
-      </w:r>
-    </w:p>
-    <w:p>
-      <w:r>
-        <w:t xml:space="preserve">El mismo bloque incorpora un CRUD de bundles propios bajo /api/v1/users/me/bundles, acotado por owner_id, con visibilidad, concurrencia optimista, máximo de aplicaciones y resolución de IDs contra el catálogo. El área de cuenta permite cambiar username actualizando el snapshot de propietario y la sesión, consultar dashboard, bundles e historial paginado; la recepción de eventos READY/PARTIAL/MANUAL_ONLY inserta el historial de forma idempotente. HEAD quedó en 9de1e09 con 133 commits. La validación focalizada del 10 de agosto ejecutó 128 pruebas de Core y 34 de notification-service, todas correctas. Después de esa suite apareció un ajuste local todavía no integrado para permitir OAuth y Resend sin configuración, devolver 503 cuando Google no está disponible y dejar secretos de ejemplo vacíos; no se atribuyen a HEAD ni a la suite anterior.</w:t>
+        <w:t>8 de agosto - Rediseño de identidad integrado y pendiente de despliegue</w:t>
+      </w:r>
+    </w:p>
+    <w:p>
+      <w:r>
+        <w:t>Se integró en seis commits el rediseño material de identidad: el registro público parte del correo con username generado y editable; el acceso administrativo queda separado; el principal de sesión conserva el UUID estable; y las cuentas sin contraseña pueden enlazarse a Google por subject OIDC mediante oauth_identities, con retorno interno validado y manejadores de éxito/fallo. También se incorporaron políticas compartidas de username y contraseña, respuestas 403/410 con códigos públicos, invalidación de sesiones y una vista que enumera los métodos de autenticación.</w:t>
+      </w:r>
+    </w:p>
+    <w:p>
+      <w:r>
+        <w:t>Los tokens de verificación y restablecimiento quedaron endurecidos con consumo lógico, bloqueo pesimista, distinción entre token inválido, caducado o ya usado y revocación de sesiones tras cambiar la contraseña. Los correos de identidad se enrutan por Resend, con token cifrado, idempotencia, clasificación de errores y purga del dato sensible del outbox tras publicar; las notificaciones de descargas conservan SMTP. Las migraciones V10 y V11 incorporan la nulabilidad de password_hash, la versión de tokens, identidades OAuth y un historial de descargas por usuario.</w:t>
+      </w:r>
+    </w:p>
+    <w:p>
+      <w:r>
+        <w:t>El mismo bloque incorpora un CRUD de bundles propios bajo /api/v1/users/me/bundles, acotado por owner_id, con visibilidad, concurrencia optimista, máximo de aplicaciones y resolución de IDs contra el catálogo. El área de cuenta permite cambiar username actualizando el snapshot de propietario y la sesión, consultar dashboard, bundles e historial paginado; la recepción de eventos READY/PARTIAL/MANUAL_ONLY inserta el historial de forma idempotente. HEAD quedó en 9de1e09 con 133 commits. La validación focalizada del 10 de agosto ejecutó 128 pruebas de Core y 34 de notification-service, todas correctas. Después de esa suite apareció un ajuste local todavía no integrado para permitir OAuth y Resend sin configuración, devolver 503 cuando Google no está disponible y dejar secretos de ejemplo vacíos; no se atribuyen a HEAD ni a la suite anterior.</w:t>
       </w:r>
     </w:p>
     <w:p>
@@ -2806,7 +2823,10 @@
     </w:p>
     <w:p>
       <w:r>
-        <w:t xml:space="preserve">Desde HEAD 9de1e09, Core integra una identidad separada para usuarios y administradores, principales por UUID, OAuth Google, tokens de un solo uso, área de cuenta, bundles propios e historial de descargas; notification-service separa Resend para identidad de SMTP para descargas. La arquitectura forma parte de development y sus suites focalizadas pasan, pero todavía requiere validación de migraciones, proveedores externos y recorridos completos en un despliegue actualizado.</w:t>
+        <w:t>Desde HEAD 9de1e09, Core integra una identidad separada para usuarios y administradores, principales por UUID, OAuth Google, tokens de un solo uso, área de cuenta, bundles propios e historial de descargas; notification-service separa Resend para identidad de SMTP para descargas. La arquitectura forma parte de development y sus suites focalizadas pasan, pero todavía requiere validación de migraciones, proveedores externos y recorridos completos en un despliegue actualizado.</w:t>
+      </w:r>
+      <w:r>
+        <w:t xml:space="preserve"> El corte del 19 de agosto confirma además: 2996cfa integró healthchecks, dependencias condicionadas y compose_health.py; a481fcf corrigió la carga de datos del Compose y el timeout del pool del scheduler; y 25235019 sustituyó la descarga desde Hugging Face por aprovisionamiento local y ejecución offline, con la migración 0006. La paridad local/GHCR y 11/11 pruebas del orquestador son evidencia estática; no demuestran recuperación dinámica, benchmark full ni activación manual completa.</w:t>
       </w:r>
     </w:p>
     <w:p>
@@ -2814,33 +2834,7 @@
         <w:pStyle w:val="Ttulo2"/>
       </w:pPr>
       <w:r>
-        <w:t>10-18 de agosto - Configuración opcional y salud operativa</w:t>
-      </w:r>
-    </w:p>
-    <w:p>
-      <w:pPr/>
-      <w:r>
-        <w:t>El commit 7a38ac6 integró el ajuste que el corte anterior describía como trabajo local: Core registra OAuth Google solo cuando existen credenciales, devuelve 503 cuando se solicita el inicio de sesión sin configuración y puede arrancar sin el proveedor; notification-service conserva Resend opcional y produce un error explícito si se invoca sin API key o remitente. Los secretos de ejemplo quedaron vacíos y se endureció la validación de tokens internos. HEAD pasó a 7a38ac6 con 134 commits visibles. Las 162 pruebas focalizadas citadas en el corte anterior son evidencia histórica anterior a este commit; en esta ejecución no se repitieron las suites Java ni se validaron proveedores reales.</w:t>
-      </w:r>
-    </w:p>
-    <w:p>
-      <w:pPr/>
-      <w:r>
-        <w:t>El working tree posterior introduce una política operativa todavía no integrada: healthchecks explícitos para todos los procesos persistentes, dependencias service_healthy o service_completed_successfully, reinicio unless-stopped para daemons y un orquestador scripts/compose_health.py que separa la cadena base de capacidades degradables. PostgreSQL/semántica puede degradar a búsqueda literal; RabbitMQ, MinIO y minio-init degradan descargas sin derribar la web; notificaciones, traducciones y trabajos de fondo se informan aparte. start conserva contenedores y logs ante fallos, nunca ejecuta down y permite exigir capacidades concretas con --require.</w:t>
-      </w:r>
-    </w:p>
-    <w:p>
-      <w:pPr/>
-      <w:r>
-        <w:t>La comprobación actual fue estática y focalizada, sin arrancar la aplicación: los Compose local y GHCR conservan 16 servicios, su topología de salud es válida y equivalente y pasaron 11/11 pruebas unitarias del orquestador. Dos suites Python nuevas de scraper y semantic-service no llegaron a recolectarse en el intérprete anfitrión por falta de aiomysql y colisión del paquete app; por tanto, esos healthchecks quedan sin validación de suite en esta ejecución. No se presenta ningún despliegue, benchmark, reinicio automático de contenedores unhealthy ni prueba funcional como completados.</w:t>
-      </w:r>
-    </w:p>
-    <w:p>
-      <w:pPr>
-        <w:pStyle w:val="Ttulo1"/>
-      </w:pPr>
-      <w:r>
-        <w:t>Estado actual al 18 de agosto de 2026</w:t>
+        <w:t>10-19 de agosto - Configuración opcional y salud operativa</w:t>
       </w:r>
     </w:p>
     <w:tbl>
@@ -2885,11 +2879,6 @@
               <w:spacing w:after="0"/>
             </w:pPr>
             <w:r>
-              <w:rPr>
-                <w:b/>
-                <w:color w:val="123A63"/>
-                <w:sz w:val="17"/>
-              </w:rPr>
               <w:t>Área</w:t>
             </w:r>
           </w:p>
@@ -3016,7 +3005,7 @@
               <w:rPr>
                 <w:sz w:val="17"/>
               </w:rPr>
-              <w:t xml:space="preserve">Integrado; despliegue pendiente</w:t>
+              <w:t>Integrado; despliegue pendiente</w:t>
             </w:r>
           </w:p>
         </w:tc>
@@ -3033,9 +3022,10 @@
           </w:tcPr>
           <w:p>
             <w:r>
-              <w:t>development, HEAD 7a38ac6 y 134 commits visibles. El ajuste para OAuth/Resend opcionales, 503 sin Google y secretos de ejemplo vacíos ya forma parte de HEAD. La política de salud operativa posterior sigue sin integrar.</w:t>
+              <w:t>development, HEAD 25235019 y 137 commits visibles. La política de salud ya está integrada; el ajuste de carga de datos del Compose y la retirada de descargas remotas de modelos también forman parte de HEAD.</w:t>
             </w:r>
           </w:p>
+          <w:p/>
         </w:tc>
         <w:tc>
           <w:tcPr>
@@ -3050,9 +3040,10 @@
           </w:tcPr>
           <w:p>
             <w:r>
-              <w:t>Validar migraciones V10/V11 y los flujos OAuth, Resend y cuenta sobre un despliegue actualizado; integrar y revalidar por separado la política de salud.</w:t>
+              <w:t>Validar migraciones V10/V11 y los flujos OAuth, Resend y cuenta sobre un despliegue actualizado; validar dinámicamente la degradación por capacidades y la recuperación ante contención del scheduler.</w:t>
             </w:r>
           </w:p>
+          <w:p/>
         </w:tc>
       </w:tr>
       <w:tr>
@@ -3109,9 +3100,10 @@
           </w:tcPr>
           <w:p>
             <w:r>
-              <w:t>Ambos Compose enumeran 16 servicios. La validación histórica del 5 de agosto dejó 15 servicios activos y minio-init completado. El working tree añade probes, dependencias condicionadas y degradación por capacidades; solo se validaron estáticamente la topología y 11 pruebas del orquestador.</w:t>
+              <w:t>Ambos Compose enumeran 16 servicios. La política de healthchecks y dependencias condicionadas ya está integrada. La validación histórica del 5 de agosto dejó 15 servicios activos y minio-init completado; la comprobación del 18 de agosto confirmó paridad estática y 11 pruebas del orquestador.</w:t>
             </w:r>
           </w:p>
+          <w:p/>
         </w:tc>
         <w:tc>
           <w:tcPr>
@@ -3126,9 +3118,10 @@
           </w:tcPr>
           <w:p>
             <w:r>
-              <w:t>Validar el arranque y los fallos reales por capacidad; completar las suites de healthchecks de scraper y semántica; ejecutar k6 y comprobar GHCR.</w:t>
+              <w:t>Validar el arranque y los fallos reales por capacidad, incluido el reinicio de contenedores unhealthy y la recuperación del scheduler ante agotamiento transitorio del pool; ejecutar k6 y comprobar GHCR.</w:t>
             </w:r>
           </w:p>
+          <w:p/>
         </w:tc>
       </w:tr>
       <w:tr>
@@ -3474,13 +3467,21 @@
           <w:p>
             <w:pPr>
               <w:spacing w:after="0" w:line="252" w:lineRule="auto"/>
+              <w:rPr>
+                <w:sz w:val="17"/>
+              </w:rPr>
             </w:pPr>
             <w:r>
               <w:rPr>
                 <w:sz w:val="17"/>
               </w:rPr>
-              <w:t>E5-base zero-shot activo; modelos y administración disponibles.</w:t>
+              <w:t>E5-base zero-shot activo. La descarga remota de modelos fue retirada: los artefactos deben aprovisionarse manualmente en almacenamiento local y el runtime usa modo offline.</w:t>
             </w:r>
+          </w:p>
+          <w:p>
+            <w:pPr>
+              <w:spacing w:after="0" w:line="252" w:lineRule="auto"/>
+            </w:pPr>
           </w:p>
         </w:tc>
         <w:tc>
@@ -3497,13 +3498,21 @@
           <w:p>
             <w:pPr>
               <w:spacing w:after="0" w:line="252" w:lineRule="auto"/>
+              <w:rPr>
+                <w:sz w:val="17"/>
+              </w:rPr>
             </w:pPr>
             <w:r>
               <w:rPr>
                 <w:sz w:val="17"/>
               </w:rPr>
-              <w:t>Benchmark semántico full final y elegible todavía no confirmado; no hay ganador promovido.</w:t>
+              <w:t>Benchmark semántico full final y elegible todavía no confirmado; no hay ganador promovido. Verificar la migración 0006 y el flujo local de registro, preparación, activación y rollback sin acceso remoto.</w:t>
             </w:r>
+          </w:p>
+          <w:p>
+            <w:pPr>
+              <w:spacing w:after="0" w:line="252" w:lineRule="auto"/>
+            </w:pPr>
           </w:p>
         </w:tc>
       </w:tr>
@@ -3567,9 +3576,10 @@
           </w:tcPr>
           <w:p>
             <w:r>
-              <w:t>README e instrucciones describen localmente compose_health.py, estados ready/starting/degraded/failed y diagnóstico con secretos censurados. LaTeX sigue en HEAD 6c0649c, 33 commits y con cambios locales históricos; no se verificó ningún PDF nuevo.</w:t>
+              <w:t>README e instrucciones describen compose_health.py, sus estados y la degradación segura ya integrada, además del aprovisionamiento manual y offline de modelos. LaTeX sigue en HEAD 6c0649c, 33 commits y con cambios locales históricos; no se verificó ningún PDF nuevo.</w:t>
             </w:r>
           </w:p>
+          <w:p/>
         </w:tc>
         <w:tc>
           <w:tcPr>
@@ -3798,7 +3808,7 @@
     </w:p>
     <w:p>
       <w:r>
-        <w:t xml:space="preserve">Validar con proveedores y secretos reales notification-service y el enrutamiento Resend/SMTP, incluido cifrado y purga de tokens, idempotencia y clasificación retryable/permanent. Verificar además conversiones UUID, escritura idempotente, paginación y dashboard sobre user_download_history después de aplicar V10/V11.</w:t>
+        <w:t>Validar con proveedores y secretos reales notification-service y el enrutamiento Resend/SMTP, incluido cifrado y purga de tokens, idempotencia y clasificación retryable/permanent. Verificar además conversiones UUID, escritura idempotente, paginación y dashboard sobre user_download_history después de aplicar V10/V11.</w:t>
       </w:r>
     </w:p>
     <w:p>
@@ -5773,9 +5783,10 @@
           </w:tcPr>
           <w:p>
             <w:r>
-              <w:t>134 commits visibles; HEAD 7a38ac6f8d8393698161f52393ebcfbd255f3807; rama development. OAuth/Resend opcionales y la respuesta 503 sin Google ya están integrados. El working tree posterior contiene la política de salud operativa todavía no integrada.</w:t>
+              <w:t>137 commits visibles; HEAD 25235019a40bf4bc7cd1cff96a8c3afa61dfcc39; rama development. La política de salud, la corrección de carga de datos del Compose y el modo semántico exclusivamente local/offline están integrados.</w:t>
             </w:r>
           </w:p>
+          <w:p/>
         </w:tc>
       </w:tr>
       <w:tr>
@@ -5815,9 +5826,10 @@
           </w:tcPr>
           <w:p>
             <w:r>
-              <w:t>Añade localmente compose_health.py, sus comandos start/status/validate, capacidades requeribles y degradación segura; estos cambios todavía no pertenecen a HEAD.</w:t>
+              <w:t>Documenta compose_health.py y su integración, la corrección del scheduler y el aprovisionamiento manual de modelos semánticos sin descarga remota.</w:t>
             </w:r>
           </w:p>
+          <w:p/>
         </w:tc>
       </w:tr>
       <w:tr>
@@ -5857,9 +5869,10 @@
           </w:tcPr>
           <w:p>
             <w:r>
-              <w:t>Añade localmente los comandos de validación y estado de salud; mantiene propietarios de datos, seguridad y estados públicos.</w:t>
+              <w:t>Mantiene los comandos de validación y estado de salud ya integrados, junto con propietarios de datos, seguridad y estados públicos.</w:t>
             </w:r>
           </w:p>
+          <w:p/>
         </w:tc>
       </w:tr>
       <w:tr>
@@ -6073,9 +6086,10 @@
           </w:tcPr>
           <w:p>
             <w:r>
-              <w:t>HEAD 7a38ac6 integra la configuración opcional de OAuth/Resend descrita antes como local. scripts/compose_health.py validó la paridad estática de ambos Compose y completó 11/11 pruebas; las suites Python de healthchecks no recolectaron por dependencias/aislamiento del entorno y quedan sin verificación.</w:t>
+              <w:t>HEAD 25235019 integra la configuración opcional, la política de salud, la corrección del pool del scheduler y la retirada de descargas remotas de modelos. La verificación actual confirmó 16 servicios en ambos Compose; no se arrancó la aplicación ni se repitieron las suites.</w:t>
             </w:r>
           </w:p>
+          <w:p/>
         </w:tc>
       </w:tr>
     </w:tbl>
@@ -6094,9 +6108,10 @@
     </w:p>
     <w:p>
       <w:r>
-        <w:t>Batch-Downloader ya no es solo un descargador por lotes. Es una plataforma de catálogo y resolución de software con trazabilidad, administración asistida, descargas progresivas, búsqueda semántica local, límites operativos explícitos y una identidad de usuario integrada con cuenta, OAuth y bundles propios. La configuración opcional de Google y Resend ya está integrada; el endurecimiento de salud y degradación permanece como trabajo local validado solo de forma estática. El despliegue y dos ZIP reales cuentan con una validación histórica completa; el siguiente salto de madurez consiste en validar el rediseño de identidad sobre un entorno actualizado, medir la capacidad con k6, verificar visualmente la UX reciente, corregir la deriva de RF-03 y la memoria LaTeX, y cerrar la evaluación semántica full sin rebajar las invariantes operativas surgidas de problemas reales.</w:t>
-      </w:r>
-    </w:p>
+        <w:t>Batch-Downloader ya no es solo un descargador por lotes. Es una plataforma de catálogo y resolución de software con trazabilidad, administración asistida, descargas progresivas, búsqueda semántica local, límites operativos explícitos y una identidad de usuario integrada. La degradación por capacidades ya está integrada; la contención temporal del pool del scheduler se recupera de forma selectiva; y los modelos semánticos deben aprovisionarse localmente y cargarse offline. El despliegue y dos ZIP reales cuentan con validación histórica, pero siguen pendientes la validación dinámica del endurecimiento operativo, el rediseño de identidad en un entorno actualizado, k6, la UX reciente, la deriva de RF-03 y LaTeX, y una evaluación semántica full elegible.</w:t>
+      </w:r>
+    </w:p>
+    <w:p/>
     <w:sectPr>
       <w:headerReference w:type="even" r:id="rId9"/>
       <w:headerReference w:type="default" r:id="rId10"/>
@@ -6161,7 +6176,7 @@
         <w:color w:val="5F6B78"/>
         <w:sz w:val="17"/>
       </w:rPr>
-      <w:t>18 de agosto de 2026</w:t>
+      <w:t>19 de agosto de 2026</w:t>
     </w:r>
     <w:r>
       <w:rPr>

</xml_diff>

<commit_message>
feat: implement lazy loading for named routes and add i18n support
- Added `lazyNamed` function to load named components lazily.
- Created tests for `lazyNamed` to ensure fallback visibility during loading.
- Introduced `I18nProvider` for internationalization with local storage caching.
- Implemented translation functionality with bundled messages and remote fetching.
- Added utility function `formatDate` for formatting dates in Spanish.
- Created Java contracts for notification token encryption and worker heartbeat state management.
- Added unit tests for `NotificationTokenEnvelope` and `WorkerHeartbeatState` to validate functionality.
</commit_message>
<xml_diff>
--- a/docs/informes/Informe_cronologico_Batch-Downloader_2026-07-28.docx
+++ b/docs/informes/Informe_cronologico_Batch-Downloader_2026-07-28.docx
@@ -95,7 +95,7 @@
         <w:jc w:val="center"/>
       </w:pPr>
       <w:r>
-        <w:t>Periodo analizado: 16 de junio - 19 de agosto de 2026</w:t>
+        <w:t>Periodo analizado: 16 de junio - 24 de agosto de 2026</w:t>
       </w:r>
     </w:p>
     <w:p>
@@ -133,7 +133,7 @@
         <w:ind w:left="259" w:right="173"/>
       </w:pPr>
       <w:r>
-        <w:t>El resultado actual es un monorepo en la rama development con 137 commits visibles y dos Compose de 16 servicios cada uno. La política de salud y degradación por capacidades ya está integrada. Un ajuste posterior corrigió la carga de datos del Compose y la contención del pool del scheduler. La arquitectura semántica sustituyó además la descarga de modelos desde Hugging Face por aprovisionamiento manual local y ejecución estrictamente offline. MySQL mantiene la autoridad transaccional del catálogo y PostgreSQL/pgvector sigue siendo una proyección reconstruible. El rediseño de identidad, sesiones, OAuth, cuenta, bundles propios e historial continúa integrado, aunque su validación desplegada sigue pendiente. La evaluación semántica que podría justificar la promoción de un modelo continúa sin métricas finales.</w:t>
+        <w:t>El resultado verificado en Git es un monorepo en la rama development con 149 commits visibles y HEAD 784900e. Desde el corte anterior se integraron doce commits: retirada del modelo Groq Llama 70B, refrescos del scraper con ámbitos y evidencia de ausencia, corrección de memoria, políticas transversales mediante wrappers, filtro por secuencia de letras, locales divididos por página, panel de detalle adaptable, selección explícita de ejecutable y versión, páginas públicas de error y legales y ajustes de accesibilidad y layout. Los Compose de HEAD conservan 16 servicios. El working tree posterior es amplio y todavía no integrado; sus Compose enumeran 17 servicios al añadir semantic-migrator. No se le atribuyen pruebas, despliegue, benchmark ni finalización en este informe.</w:t>
       </w:r>
     </w:p>
     <w:tbl>
@@ -174,25 +174,17 @@
           </w:tcPr>
           <w:p>
             <w:pPr>
-              <w:rPr>
-                <w:b/>
-                <w:color w:val="B87918"/>
-              </w:rPr>
+              <w:jc w:val="center"/>
             </w:pPr>
             <w:r>
               <w:rPr>
                 <w:b/>
-                <w:color w:val="B87918"/>
+                <w:color w:val="FFFFFF"/>
+                <w:sz w:val="36"/>
               </w:rPr>
-              <w:t>Conclusión principal: La salud operativa, la recuperación selectiva del scheduler y el aprovisionamiento local de modelos reducen fallos y superficie remota.</w:t>
+              <w:t>149</w:t>
             </w:r>
           </w:p>
-          <w:p>
-            <w:r>
-              <w:t>137</w:t>
-            </w:r>
-          </w:p>
-          <w:p/>
         </w:tc>
         <w:tc>
           <w:tcPr>
@@ -263,17 +255,8 @@
             <w:vAlign w:val="center"/>
           </w:tcPr>
           <w:p>
-            <w:pPr>
-              <w:spacing w:after="0"/>
-              <w:jc w:val="center"/>
-            </w:pPr>
             <w:r>
-              <w:rPr>
-                <w:b/>
-                <w:color w:val="5F6B78"/>
-                <w:sz w:val="17"/>
-              </w:rPr>
-              <w:t>commits visibles</w:t>
+              <w:t>commits visibles en HEAD</w:t>
             </w:r>
           </w:p>
         </w:tc>
@@ -290,17 +273,8 @@
             <w:vAlign w:val="center"/>
           </w:tcPr>
           <w:p>
-            <w:pPr>
-              <w:spacing w:after="0"/>
-              <w:jc w:val="center"/>
-            </w:pPr>
             <w:r>
-              <w:rPr>
-                <w:b/>
-                <w:color w:val="5F6B78"/>
-                <w:sz w:val="17"/>
-              </w:rPr>
-              <w:t>servicios en Compose</w:t>
+              <w:t>servicios en los Compose de HEAD</w:t>
             </w:r>
           </w:p>
         </w:tc>
@@ -350,7 +324,7 @@
         </w:numPr>
       </w:pPr>
       <w:r>
-        <w:t>Este informe combina cuatro fuentes: historiales de tareas de Codex vinculadas al checkout principal, conversaciones del repositorio hermano de la memoria LaTeX, la organización del proyecto en GitHub y el historial Git local hasta el commit 25235019 del 19 de agosto de 2026. También se contrastaron README.md, .github/copilot-instructions.md, OpenAPI, los dos Compose, el estado del working tree y el estado documental de la memoria LaTeX.</w:t>
+        <w:t>Este informe combina historiales de tareas de Codex vinculadas al proyecto, el repositorio hermano de la memoria LaTeX, la organización del proyecto en GitHub y el historial Git local hasta el commit 784900ef del 22 de agosto de 2026, verificado el 24 de agosto. También se contrastaron README.md, .github/copilot-instructions.md, OpenAPI, los dos Compose, el estado del working tree y el árbol documental LaTeX.</w:t>
       </w:r>
     </w:p>
     <w:p>
@@ -361,7 +335,7 @@
         </w:numPr>
       </w:pPr>
       <w:r>
-        <w:t>El apéndice conserva las 23 conversaciones previamente recuperadas y contrastadas. El 19 de agosto, la herramienta de tareas de Codex volvió a quedar sin respuesta durante una consulta de dos minutos; por ello no se añade ninguna conversación sin haberla recuperado y la cobertura nueva se limita a evidencia local verificable.</w:t>
+        <w:t>El apéndice conserva las 23 conversaciones previamente recuperadas y contrastadas. El 24 de agosto, la herramienta de tareas de Codex no respondió en tres consultas acotadas, incluidas páginas de 100 y 10 elementos con esperas superiores a dos minutos. Por ello no se añade ninguna conversación no recuperada y la cobertura nueva se limita a evidencia local verificable.</w:t>
       </w:r>
     </w:p>
     <w:p>
@@ -395,7 +369,7 @@
         </w:numPr>
       </w:pPr>
       <w:r>
-        <w:t>No se arrancó ni reinició la aplicación completa para preparar este informe. La tarea de capacidad sí dejó evidencia histórica del 5 de agosto sobre un despliegue reconstruido, servicios estables y dos ZIP reales; esos resultados se distinguen de la comprobación local de esta ejecución y de la prueba de carga k6 todavía pendiente. El 10 de agosto se ejecutó una validación Maven focalizada: Core completó 128/128 pruebas y notification-service 34/34, sin fallos. El resto del estado actual se verificó mediante Git, configuración y documentación.</w:t>
+        <w:t>No se arrancó ni reinició la aplicación completa para preparar este informe. Los resultados desplegados y suites citados en fechas anteriores siguen siendo evidencia histórica. En esta ejecución se verificaron Git, configuración, ambos Compose actuales y el árbol LaTeX; no se repitieron suites ni se declara validado el amplio working tree posterior a HEAD.</w:t>
       </w:r>
     </w:p>
     <w:p>
@@ -1472,19 +1446,10 @@
             <w:vAlign w:val="center"/>
           </w:tcPr>
           <w:p>
-            <w:pPr>
-              <w:rPr>
-                <w:sz w:val="18"/>
-              </w:rPr>
-            </w:pPr>
             <w:r>
-              <w:rPr>
-                <w:sz w:val="18"/>
-              </w:rPr>
               <w:t>10-19 ago</w:t>
             </w:r>
           </w:p>
-          <w:p/>
         </w:tc>
         <w:tc>
           <w:tcPr>
@@ -1499,9 +1464,6 @@
           </w:tcPr>
           <w:p>
             <w:r>
-              <w:rPr>
-                <w:sz w:val="18"/>
-              </w:rPr>
               <w:t>Configuración opcional y salud operativa</w:t>
             </w:r>
           </w:p>
@@ -1518,19 +1480,66 @@
             <w:vAlign w:val="center"/>
           </w:tcPr>
           <w:p>
-            <w:pPr>
-              <w:rPr>
-                <w:sz w:val="18"/>
-              </w:rPr>
-            </w:pPr>
             <w:r>
-              <w:rPr>
-                <w:sz w:val="18"/>
-              </w:rPr>
-              <w:t>OAuth/Resend opcionales y la política de salud quedan integrados; se corrige la carga de datos del Compose y se retira la descarga remota de modelos semánticos.</w:t>
+              <w:t>OAuth/Resend opcionales y salud quedan integrados; se corrige el scheduler y se retira la descarga remota de modelos.</w:t>
             </w:r>
           </w:p>
-          <w:p/>
+        </w:tc>
+      </w:tr>
+      <w:tr>
+        <w:tc>
+          <w:tcPr>
+            <w:tcW w:w="1500" w:type="dxa"/>
+            <w:tcMar>
+              <w:top w:w="80" w:type="dxa"/>
+              <w:left w:w="120" w:type="dxa"/>
+              <w:bottom w:w="80" w:type="dxa"/>
+              <w:right w:w="120" w:type="dxa"/>
+            </w:tcMar>
+            <w:vAlign w:val="center"/>
+          </w:tcPr>
+          <w:p>
+            <w:pPr/>
+            <w:r>
+              <w:t>19-24 ago</w:t>
+            </w:r>
+          </w:p>
+        </w:tc>
+        <w:tc>
+          <w:tcPr>
+            <w:tcW w:w="2100" w:type="dxa"/>
+            <w:tcMar>
+              <w:top w:w="80" w:type="dxa"/>
+              <w:left w:w="120" w:type="dxa"/>
+              <w:bottom w:w="80" w:type="dxa"/>
+              <w:right w:w="120" w:type="dxa"/>
+            </w:tcMar>
+            <w:vAlign w:val="center"/>
+          </w:tcPr>
+          <w:p>
+            <w:pPr/>
+            <w:r>
+              <w:t>Scraper, wrappers y experiencia pública</w:t>
+            </w:r>
+          </w:p>
+        </w:tc>
+        <w:tc>
+          <w:tcPr>
+            <w:tcW w:w="5760" w:type="dxa"/>
+            <w:tcMar>
+              <w:top w:w="80" w:type="dxa"/>
+              <w:left w:w="120" w:type="dxa"/>
+              <w:bottom w:w="80" w:type="dxa"/>
+              <w:right w:w="120" w:type="dxa"/>
+            </w:tcMar>
+            <w:vAlign w:val="center"/>
+          </w:tcPr>
+          <w:p>
+            <w:pPr/>
+            <w:r>
+              <w:t>Doce commits integran refrescos con evidencia de ausencia, políticas transversales, búsqueda y selección más precisas, locales modulares, páginas legales/error y mejoras de accesibilidad y layout.</w:t>
+            </w:r>
+          </w:p>
         </w:tc>
       </w:tr>
     </w:tbl>
@@ -2823,18 +2832,16 @@
     </w:p>
     <w:p>
       <w:r>
-        <w:t>Desde HEAD 9de1e09, Core integra una identidad separada para usuarios y administradores, principales por UUID, OAuth Google, tokens de un solo uso, área de cuenta, bundles propios e historial de descargas; notification-service separa Resend para identidad de SMTP para descargas. La arquitectura forma parte de development y sus suites focalizadas pasan, pero todavía requiere validación de migraciones, proveedores externos y recorridos completos en un despliegue actualizado.</w:t>
-      </w:r>
-      <w:r>
-        <w:t xml:space="preserve"> El corte del 19 de agosto confirma además: 2996cfa integró healthchecks, dependencias condicionadas y compose_health.py; a481fcf corrigió la carga de datos del Compose y el timeout del pool del scheduler; y 25235019 sustituyó la descarga desde Hugging Face por aprovisionamiento local y ejecución offline, con la migración 0006. La paridad local/GHCR y 11/11 pruebas del orquestador son evidencia estática; no demuestran recuperación dinámica, benchmark full ni activación manual completa.</w:t>
-      </w:r>
+        <w:t>La arquitectura integrada hasta HEAD 784900e mantiene MySQL como autoridad transaccional y PostgreSQL/pgvector como proyección reconstruible. A los healthchecks, recuperación del scheduler y aprovisionamiento semántico local del corte anterior se suman wrappers explícitos para HTTP interno, descargas remotas, mensajería y traducciones; ámbitos de refresco y evidencia de ausencia en el scraper; y contratos públicos para búsqueda y selección de instaladores. Los resultados históricos de suites y despliegue no se extrapolan automáticamente a estos doce commits. El working tree posterior añade cambios aún no integrados, entre ellos semantic-migrator, y permanece pendiente de validación focalizada y de integración.</w:t>
+      </w:r>
+      <w:r/>
     </w:p>
     <w:p>
       <w:pPr>
         <w:pStyle w:val="Ttulo2"/>
       </w:pPr>
       <w:r>
-        <w:t>10-19 de agosto - Configuración opcional y salud operativa</w:t>
+        <w:t>19-24 de agosto - Scraper, wrappers y experiencia pública</w:t>
       </w:r>
     </w:p>
     <w:tbl>
@@ -2998,14 +3005,8 @@
             <w:vAlign w:val="center"/>
           </w:tcPr>
           <w:p>
-            <w:pPr>
-              <w:spacing w:after="0" w:line="252" w:lineRule="auto"/>
-            </w:pPr>
             <w:r>
-              <w:rPr>
-                <w:sz w:val="17"/>
-              </w:rPr>
-              <w:t>Integrado; despliegue pendiente</w:t>
+              <w:t>Integrado en HEAD; trabajo posterior no verificado</w:t>
             </w:r>
           </w:p>
         </w:tc>
@@ -3022,10 +3023,9 @@
           </w:tcPr>
           <w:p>
             <w:r>
-              <w:t>development, HEAD 25235019 y 137 commits visibles. La política de salud ya está integrada; el ajuste de carga de datos del Compose y la retirada de descargas remotas de modelos también forman parte de HEAD.</w:t>
+              <w:t>development, HEAD 784900ef y 149 commits visibles. Doce commits nuevos están integrados. El working tree posterior modifica 163 ficheros versionados y añade otros nuevos; no se atribuye a HEAD ni a validaciones históricas.</w:t>
             </w:r>
           </w:p>
-          <w:p/>
         </w:tc>
         <w:tc>
           <w:tcPr>
@@ -3040,10 +3040,9 @@
           </w:tcPr>
           <w:p>
             <w:r>
-              <w:t>Validar migraciones V10/V11 y los flujos OAuth, Resend y cuenta sobre un despliegue actualizado; validar dinámicamente la degradación por capacidades y la recuperación ante contención del scheduler.</w:t>
+              <w:t>Separar, revisar y validar el working tree antes de integrarlo; mantener pendientes las migraciones y recorridos desplegados de identidad, proveedores y degradación operativa.</w:t>
             </w:r>
           </w:p>
-          <w:p/>
         </w:tc>
       </w:tr>
       <w:tr>
@@ -3100,10 +3099,9 @@
           </w:tcPr>
           <w:p>
             <w:r>
-              <w:t>Ambos Compose enumeran 16 servicios. La política de healthchecks y dependencias condicionadas ya está integrada. La validación histórica del 5 de agosto dejó 15 servicios activos y minio-init completado; la comprobación del 18 de agosto confirmó paridad estática y 11 pruebas del orquestador.</w:t>
+              <w:t>Los Compose de HEAD conservan 16 servicios. Los Compose del working tree actual validan y enumeran 17 por la adición de semantic-migrator. La evidencia desplegada del 5 de agosto y las 11 pruebas del orquestador son históricas.</w:t>
             </w:r>
           </w:p>
-          <w:p/>
         </w:tc>
         <w:tc>
           <w:tcPr>
@@ -3118,10 +3116,9 @@
           </w:tcPr>
           <w:p>
             <w:r>
-              <w:t>Validar el arranque y los fallos reales por capacidad, incluido el reinicio de contenedores unhealthy y la recuperación del scheduler ante agotamiento transitorio del pool; ejecutar k6 y comprobar GHCR.</w:t>
+              <w:t>Validar el nuevo semantic-migrator y la topología de 17 servicios; probar fallos reales por capacidad, recuperación y GHCR; ejecutar k6.</w:t>
             </w:r>
           </w:p>
-          <w:p/>
         </w:tc>
       </w:tr>
       <w:tr>
@@ -3183,14 +3180,8 @@
             <w:vAlign w:val="center"/>
           </w:tcPr>
           <w:p>
-            <w:pPr>
-              <w:spacing w:after="0" w:line="252" w:lineRule="auto"/>
-            </w:pPr>
             <w:r>
-              <w:rPr>
-                <w:sz w:val="17"/>
-              </w:rPr>
-              <w:t>Pipeline persistente, resolución manual, alta desde web oficial y reparación de fuentes conocidas; itch usa endpoints oficiales para tres plataformas.</w:t>
+              <w:t>HEAD integra ámbitos de refresco, evidencia de ausencia, mejora de instaladores, validación de versiones y corrección de memoria. No se verificó una ejecución global ni se repitieron suites en este corte.</w:t>
             </w:r>
           </w:p>
         </w:tc>
@@ -3206,14 +3197,8 @@
             <w:vAlign w:val="center"/>
           </w:tcPr>
           <w:p>
-            <w:pPr>
-              <w:spacing w:after="0" w:line="252" w:lineRule="auto"/>
-            </w:pPr>
             <w:r>
-              <w:rPr>
-                <w:sz w:val="17"/>
-              </w:rPr>
-              <w:t>Reconstruir y comprobar migraciones y reparación automática sobre un despliegue actualizado.</w:t>
+              <w:t>Confirmar finalización y resultados de refrescos full/unresolved y validar por separado heartbeats, retención y migraciones del working tree.</w:t>
             </w:r>
           </w:p>
         </w:tc>
@@ -3277,14 +3262,8 @@
             <w:vAlign w:val="center"/>
           </w:tcPr>
           <w:p>
-            <w:pPr>
-              <w:spacing w:after="0" w:line="252" w:lineRule="auto"/>
-            </w:pPr>
             <w:r>
-              <w:rPr>
-                <w:sz w:val="17"/>
-              </w:rPr>
-              <w:t>Filtros públicos coherentes, caché interna y caché HTTP condicionada; MySQL conserva autoridad y métricas de capacidad.</w:t>
+              <w:t>Búsqueda por secuencia de letras, panel adaptable y selección de ejecutable/versión están integrados; MySQL mantiene autoridad. El working tree cambia contratos, filtros y rutas sin integración confirmada.</w:t>
             </w:r>
           </w:p>
         </w:tc>
@@ -3300,14 +3279,8 @@
             <w:vAlign w:val="center"/>
           </w:tcPr>
           <w:p>
-            <w:pPr>
-              <w:spacing w:after="0" w:line="252" w:lineRule="auto"/>
-            </w:pPr>
             <w:r>
-              <w:rPr>
-                <w:sz w:val="17"/>
-              </w:rPr>
-              <w:t>Actualizar RF-03, README, instrucciones y memoria para retirar coincidencias mínimas.</w:t>
+              <w:t>Revisión visual sobre instancia actualizada; alinear RF-03 y validar contratos y migraciones antes de integrar el working tree.</w:t>
             </w:r>
           </w:p>
         </w:tc>
@@ -3529,14 +3502,8 @@
             <w:vAlign w:val="center"/>
           </w:tcPr>
           <w:p>
-            <w:pPr>
-              <w:spacing w:after="0" w:line="252" w:lineRule="auto"/>
-            </w:pPr>
             <w:r>
-              <w:rPr>
-                <w:sz w:val="17"/>
-              </w:rPr>
-              <w:t>Documentación</w:t>
+              <w:t>Docs.</w:t>
             </w:r>
           </w:p>
         </w:tc>
@@ -3576,10 +3543,9 @@
           </w:tcPr>
           <w:p>
             <w:r>
-              <w:t>README e instrucciones describen compose_health.py, sus estados y la degradación segura ya integrada, además del aprovisionamiento manual y offline de modelos. LaTeX sigue en HEAD 6c0649c, 33 commits y con cambios locales históricos; no se verificó ningún PDF nuevo.</w:t>
+              <w:t>La documentación de wrappers está integrada. README no cambió desde el corte anterior; copilot-instructions, Compose y numerosos documentos están modificados solo en el working tree. LaTeX permanece en 6c0649c/33 commits, con cambios locales y PDF de julio.</w:t>
             </w:r>
           </w:p>
-          <w:p/>
         </w:tc>
         <w:tc>
           <w:tcPr>
@@ -3618,14 +3584,8 @@
             <w:vAlign w:val="center"/>
           </w:tcPr>
           <w:p>
-            <w:pPr>
-              <w:spacing w:after="0" w:line="252" w:lineRule="auto"/>
-            </w:pPr>
             <w:r>
-              <w:rPr>
-                <w:sz w:val="17"/>
-              </w:rPr>
-              <w:t>Gestión</w:t>
+              <w:t>Gest.</w:t>
             </w:r>
           </w:p>
         </w:tc>
@@ -3706,6 +3666,30 @@
       </w:pPr>
     </w:p>
     <w:p>
+      <w:pPr/>
+      <w:r>
+        <w:t>El scraper incorporó ámbitos de refresco y evidencia duradera para distinguir aplicaciones disponibles, en revisión y ausencias realmente comprobadas. La migración 0016, WinstallClient, el pipeline y el catálogo coordinan refrescos completos o acotados, validación de candidatos y promoción segura de versiones. También se retiró el modelo Groq Llama 70B obsoleto. La corrección 3245f14 añadió la migración 0017 y redujo presión de memoria en ejecuciones y totales. Estas funciones forman parte de HEAD; este informe no repitió sus suites ni certifica que una ejecución global de refresco haya terminado.</w:t>
+      </w:r>
+    </w:p>
+    <w:p>
+      <w:pPr/>
+      <w:r>
+        <w:t>El commit 945d6f6 separó políticas transversales mediante wrappers: ejecución HTTP interna con token, timeout y métricas; descarga remota con validación, integridad y limpieza de parciales; handlers idempotentes y validados para mensajería; políticas HTTP en semantic-service; y catálogos de traducción medidos. La decisión arquitectónica conserva el núcleo funcional y aplica seguridad, observabilidad y resiliencia en los bordes. Su documentación quedó en docs/architecture/politicas-mediante-wrappers.md.</w:t>
+      </w:r>
+    </w:p>
+    <w:p>
+      <w:pPr/>
+      <w:r>
+        <w:t>La experiencia pública añadió búsqueda por secuencia de letras, locales divididos por página, un panel de detalle adaptable en lugar del drawer lateral fijo y selección explícita del ejecutable con su versión. Después se incorporaron páginas localizadas de error y legales, correcciones del footer, etiquetas accesibles para trabajos de descarga y ajustes de visibilidad y responsive. Son cambios integrados en Git; no se realizó una revisión visual sobre una aplicación ejecutándose.</w:t>
+      </w:r>
+    </w:p>
+    <w:p>
+      <w:pPr/>
+      <w:r>
+        <w:t>Después de HEAD existe un working tree material de 163 ficheros modificados más archivos nuevos. Incluye, entre otros, semantic-migrator, heartbeats y retención, cambios de contratos y rutas, operaciones administrativas, migraciones y reorganización de frontend y build. Ambos Compose actuales validan y enumeran 17 servicios. Como este trabajo no está integrado y no se ejecutaron sus suites, se registra como trabajo no verificado y no sustituye el estado de HEAD ni cierra pendientes.</w:t>
+      </w:r>
+    </w:p>
+    <w:p>
       <w:pPr>
         <w:pStyle w:val="Ttulo1"/>
       </w:pPr>
@@ -3803,7 +3787,7 @@
     </w:p>
     <w:p>
       <w:r>
-        <w:t>Validar en un despliegue actualizado el rediseño de identidad ya integrado: migraciones V10/V11, registro por correo, principales por UUID, caminos separados de usuario/administrador, OAuth Google, bundles propios, caducidad/consumo de tokens e invalidación de sesiones. El ajuste que hace opcionales OAuth/Resend y devuelve 503 cuando Google no está configurado ya está integrado en HEAD, pero las suites focalizadas citadas son anteriores y no sustituyen estas comprobaciones de integración. Integrar y probar aparte la política local de salud, incluidos fallos de base, descargas y semántica.</w:t>
+        <w:t>Validar en un despliegue actualizado el rediseño de identidad ya integrado: migraciones V10/V11, registro por correo, principales por UUID, caminos separados de usuario/administrador, OAuth Google, bundles propios, caducidad/consumo de tokens e invalidación de sesiones. El ajuste que hace opcionales OAuth/Resend y devuelve 503 cuando Google no está configurado ya está integrado en HEAD, pero las suites focalizadas citadas son anteriores y no sustituyen estas comprobaciones de integración. Integrar y probar aparte la política local de salud, incluidos fallos de base, descargas y semántica. Revisar además los doce commits del 19-22 de agosto con suites focalizadas y recorrido visual, y no integrar el working tree de 17 servicios hasta verificar migraciones, contratos, heartbeats, retención y operaciones.</w:t>
       </w:r>
     </w:p>
     <w:p>
@@ -5783,10 +5767,9 @@
           </w:tcPr>
           <w:p>
             <w:r>
-              <w:t>137 commits visibles; HEAD 25235019a40bf4bc7cd1cff96a8c3afa61dfcc39; rama development. La política de salud, la corrección de carga de datos del Compose y el modo semántico exclusivamente local/offline están integrados.</w:t>
+              <w:t>149 commits visibles; HEAD 784900ef000dd9a7c076be337be9bb0f28c0ddad; rama development. Doce commits posteriores al corte del 19 de agosto están integrados. El working tree posterior es material y no se considera parte de HEAD.</w:t>
             </w:r>
           </w:p>
-          <w:p/>
         </w:tc>
       </w:tr>
       <w:tr>
@@ -5826,10 +5809,9 @@
           </w:tcPr>
           <w:p>
             <w:r>
-              <w:t>Documenta compose_health.py y su integración, la corrección del scheduler y el aprovisionamiento manual de modelos semánticos sin descarga remota.</w:t>
+              <w:t>No cambió en HEAD desde el corte anterior. api/scraper/README.md y docs/architecture/politicas-mediante-wrappers.md sí documentan cambios integrados; otros ajustes README permanecen locales.</w:t>
             </w:r>
           </w:p>
-          <w:p/>
         </w:tc>
       </w:tr>
       <w:tr>
@@ -5869,10 +5851,9 @@
           </w:tcPr>
           <w:p>
             <w:r>
-              <w:t>Mantiene los comandos de validación y estado de salud ya integrados, junto con propietarios de datos, seguridad y estados públicos.</w:t>
+              <w:t>Sin cambios integrados desde 25235019. El working tree corrige nombres SCRAPER_ y rutas /api/v1/admin; se registra como no integrado.</w:t>
             </w:r>
           </w:p>
-          <w:p/>
         </w:tc>
       </w:tr>
       <w:tr>
@@ -5912,7 +5893,7 @@
           </w:tcPr>
           <w:p>
             <w:r>
-              <w:t>docker compose config --services enumeró 16 servicios en local y GHCR. La validación estática confirmó topología de salud válida y equivalente; no se arrancaron contenedores.</w:t>
+              <w:t>Los Compose de HEAD conservan 16 servicios. Los dos Compose actuales del working tree validaron con .env.example y enumeraron 17 servicios por semantic-migrator; no se arrancaron contenedores.</w:t>
             </w:r>
           </w:p>
         </w:tc>
@@ -5954,7 +5935,7 @@
           </w:tcPr>
           <w:p>
             <w:r>
-              <w:t>HEAD 6c0649c, 33 commits y cambios locales históricos en fuentes y diagramas. No se encontró ni verificó un PDF nuevo durante esta ejecución.</w:t>
+              <w:t>HEAD 6c0649c, 33 commits y cambios locales históricos en fuentes y diagramas. memoria.pdf y anexos.pdf siguen fechados en julio; no se compiló ni verificó un PDF nuevo.</w:t>
             </w:r>
           </w:p>
         </w:tc>
@@ -5995,14 +5976,8 @@
             <w:vAlign w:val="center"/>
           </w:tcPr>
           <w:p>
-            <w:pPr>
-              <w:spacing w:after="0" w:line="252" w:lineRule="auto"/>
-            </w:pPr>
             <w:r>
-              <w:rPr>
-                <w:sz w:val="18"/>
-              </w:rPr>
-              <w:t>OpenAPI valida tags repetidas con AND, publisher singular y facetas tras todos los filtros. GitHub conserva 48 requisitos; RF-03 todavía pide coincidencia total o mínima y queda como fuente desfasada.</w:t>
+              <w:t>OpenAPI cambió en HEAD para ámbitos del scraper y selección de instaladores; GitHub mantiene la referencia histórica de 48 requisitos. No se recuperaron nuevas tareas externas por la falta de respuesta de la herramienta de tareas.</w:t>
             </w:r>
           </w:p>
         </w:tc>
@@ -6069,7 +6044,7 @@
           </w:tcPr>
           <w:p>
             <w:r>
-              <w:t>Git y validación focalizada (18 ago)</w:t>
+              <w:t>Git y configuración (24 ago)</w:t>
             </w:r>
           </w:p>
         </w:tc>
@@ -6086,10 +6061,9 @@
           </w:tcPr>
           <w:p>
             <w:r>
-              <w:t>HEAD 25235019 integra la configuración opcional, la política de salud, la corrección del pool del scheduler y la retirada de descargas remotas de modelos. La verificación actual confirmó 16 servicios en ambos Compose; no se arrancó la aplicación ni se repitieron las suites.</w:t>
+              <w:t>HEAD 784900e/149 commits. Git confirma doce commits nuevos; docker compose config --services confirma 17 servicios en cada Compose del working tree. No se ejecutaron suites, benchmark, aplicación ni despliegue. La recuperación de tareas falló en tres consultas acotadas.</w:t>
             </w:r>
           </w:p>
-          <w:p/>
         </w:tc>
       </w:tr>
     </w:tbl>
@@ -6108,7 +6082,7 @@
     </w:p>
     <w:p>
       <w:r>
-        <w:t>Batch-Downloader ya no es solo un descargador por lotes. Es una plataforma de catálogo y resolución de software con trazabilidad, administración asistida, descargas progresivas, búsqueda semántica local, límites operativos explícitos y una identidad de usuario integrada. La degradación por capacidades ya está integrada; la contención temporal del pool del scheduler se recupera de forma selectiva; y los modelos semánticos deben aprovisionarse localmente y cargarse offline. El despliegue y dos ZIP reales cuentan con validación histórica, pero siguen pendientes la validación dinámica del endurecimiento operativo, el rediseño de identidad en un entorno actualizado, k6, la UX reciente, la deriva de RF-03 y LaTeX, y una evaluación semántica full elegible.</w:t>
+        <w:t>Batch-Downloader ya integra un scraper con ámbitos y evidencia de ausencia, políticas transversales mediante wrappers y una experiencia pública más precisa y accesible, además de las capacidades descritas en cortes anteriores. HEAD queda en 784900e con 149 commits. Los resultados desplegados y suites previas siguen siendo históricos; no prueban los doce commits recientes ni el amplio working tree posterior. Permanecen abiertos la validación de refrescos, la topología no integrada de 17 servicios, migraciones y recorridos de identidad, k6, la evaluación semántica full, la revisión visual reciente y la sincronización/recompilación LaTeX.</w:t>
       </w:r>
     </w:p>
     <w:p/>
@@ -6176,7 +6150,7 @@
         <w:color w:val="5F6B78"/>
         <w:sz w:val="17"/>
       </w:rPr>
-      <w:t>19 de agosto de 2026</w:t>
+      <w:t>24 de agosto de 2026</w:t>
     </w:r>
     <w:r>
       <w:rPr>

</xml_diff>

<commit_message>
Añadida ultima actualización dinámica a las páginas legales.
</commit_message>
<xml_diff>
--- a/docs/informes/Informe_cronologico_Batch-Downloader_2026-07-28.docx
+++ b/docs/informes/Informe_cronologico_Batch-Downloader_2026-07-28.docx
@@ -1,6 +1,6 @@
 
 <file path=word/document.xml><?xml version="1.0" encoding="utf-8"?>
-<w:document xmlns:wpc="http://schemas.microsoft.com/office/word/2010/wordprocessingCanvas" xmlns:cx="http://schemas.microsoft.com/office/drawing/2014/chartex" xmlns:cx1="http://schemas.microsoft.com/office/drawing/2015/9/8/chartex" xmlns:cx2="http://schemas.microsoft.com/office/drawing/2015/10/21/chartex" xmlns:cx3="http://schemas.microsoft.com/office/drawing/2016/5/9/chartex" xmlns:cx4="http://schemas.microsoft.com/office/drawing/2016/5/10/chartex" xmlns:cx5="http://schemas.microsoft.com/office/drawing/2016/5/11/chartex" xmlns:cx6="http://schemas.microsoft.com/office/drawing/2016/5/12/chartex" xmlns:cx7="http://schemas.microsoft.com/office/drawing/2016/5/13/chartex" xmlns:cx8="http://schemas.microsoft.com/office/drawing/2016/5/14/chartex" xmlns:mc="http://schemas.openxmlformats.org/markup-compatibility/2006" xmlns:aink="http://schemas.microsoft.com/office/drawing/2016/ink" xmlns:am3d="http://schemas.microsoft.com/office/drawing/2017/model3d" xmlns:o="urn:schemas-microsoft-com:office:office" xmlns:oel="http://schemas.microsoft.com/office/2019/extlst" xmlns:r="http://schemas.openxmlformats.org/officeDocument/2006/relationships" xmlns:m="http://schemas.openxmlformats.org/officeDocument/2006/math" xmlns:v="urn:schemas-microsoft-com:vml" xmlns:wp14="http://schemas.microsoft.com/office/word/2010/wordprocessingDrawing" xmlns:wp="http://schemas.openxmlformats.org/drawingml/2006/wordprocessingDrawing" xmlns:w10="urn:schemas-microsoft-com:office:word" xmlns:w="http://schemas.openxmlformats.org/wordprocessingml/2006/main" xmlns:w14="http://schemas.microsoft.com/office/word/2010/wordml" xmlns:w15="http://schemas.microsoft.com/office/word/2012/wordml" xmlns:w16cei="http://schemas.microsoft.com/office/word/2026/wordml/cei" xmlns:w16cex="http://schemas.microsoft.com/office/word/2018/wordml/cex" xmlns:w16cid="http://schemas.microsoft.com/office/word/2016/wordml/cid" xmlns:w16="http://schemas.microsoft.com/office/word/2018/wordml" xmlns:w16du="http://schemas.microsoft.com/office/word/2023/wordml/word16du" xmlns:w16sdtdh="http://schemas.microsoft.com/office/word/2020/wordml/sdtdatahash" xmlns:w16sdtfl="http://schemas.microsoft.com/office/word/2024/wordml/sdtformatlock" xmlns:w16se="http://schemas.microsoft.com/office/word/2015/wordml/symex" xmlns:wpg="http://schemas.microsoft.com/office/word/2010/wordprocessingGroup" xmlns:wpi="http://schemas.microsoft.com/office/word/2010/wordprocessingInk" xmlns:wne="http://schemas.microsoft.com/office/word/2006/wordml" xmlns:wps="http://schemas.microsoft.com/office/word/2010/wordprocessingShape" mc:Ignorable="w14 w15 w16se w16cid w16 w16cex w16sdtdh w16sdtfl w16du wp14">
+<w:document xmlns:wpc="http://schemas.microsoft.com/office/word/2010/wordprocessingCanvas" xmlns:cx="http://schemas.microsoft.com/office/drawing/2014/chartex" xmlns:cx1="http://schemas.microsoft.com/office/drawing/2015/9/8/chartex" xmlns:cx2="http://schemas.microsoft.com/office/drawing/2015/10/21/chartex" xmlns:cx3="http://schemas.microsoft.com/office/drawing/2016/5/9/chartex" xmlns:cx4="http://schemas.microsoft.com/office/drawing/2016/5/10/chartex" xmlns:cx5="http://schemas.microsoft.com/office/drawing/2016/5/11/chartex" xmlns:cx6="http://schemas.microsoft.com/office/drawing/2016/5/12/chartex" xmlns:cx7="http://schemas.microsoft.com/office/drawing/2016/5/13/chartex" xmlns:cx8="http://schemas.microsoft.com/office/drawing/2016/5/14/chartex" xmlns:mc="http://schemas.openxmlformats.org/markup-compatibility/2006" xmlns:aink="http://schemas.microsoft.com/office/drawing/2016/ink" xmlns:am3d="http://schemas.microsoft.com/office/drawing/2017/model3d" xmlns:o="urn:schemas-microsoft-com:office:office" xmlns:oel="http://schemas.microsoft.com/office/2019/extlst" xmlns:r="http://schemas.openxmlformats.org/officeDocument/2006/relationships" xmlns:m="http://schemas.openxmlformats.org/officeDocument/2006/math" xmlns:v="urn:schemas-microsoft-com:vml" xmlns:wp14="http://schemas.microsoft.com/office/word/2010/wordprocessingDrawing" xmlns:wp="http://schemas.openxmlformats.org/drawingml/2006/wordprocessingDrawing" xmlns:w10="urn:schemas-microsoft-com:office:word" xmlns:w="http://schemas.openxmlformats.org/wordprocessingml/2006/main" xmlns:w14="http://schemas.microsoft.com/office/word/2010/wordml" xmlns:w15="http://schemas.microsoft.com/office/word/2012/wordml" xmlns:w16cex="http://schemas.microsoft.com/office/word/2018/wordml/cex" xmlns:w16cid="http://schemas.microsoft.com/office/word/2016/wordml/cid" xmlns:w16="http://schemas.microsoft.com/office/word/2018/wordml" xmlns:w16du="http://schemas.microsoft.com/office/word/2023/wordml/word16du" xmlns:w16sdtdh="http://schemas.microsoft.com/office/word/2020/wordml/sdtdatahash" xmlns:w16sdtfl="http://schemas.microsoft.com/office/word/2024/wordml/sdtformatlock" xmlns:w16se="http://schemas.microsoft.com/office/word/2015/wordml/symex" xmlns:wpg="http://schemas.microsoft.com/office/word/2010/wordprocessingGroup" xmlns:wpi="http://schemas.microsoft.com/office/word/2010/wordprocessingInk" xmlns:wne="http://schemas.microsoft.com/office/word/2006/wordml" xmlns:wps="http://schemas.microsoft.com/office/word/2010/wordprocessingShape" mc:Ignorable="w14 w15 w16se w16cid w16 w16cex w16sdtdh w16sdtfl w16du wp14">
   <w:body>
     <w:p>
       <w:pPr>
@@ -95,7 +95,7 @@
         <w:jc w:val="center"/>
       </w:pPr>
       <w:r>
-        <w:t>Periodo analizado: 16 de junio - 24 de agosto de 2026</w:t>
+        <w:t>Periodo analizado: 16 de junio - 25 de agosto de 2026</w:t>
       </w:r>
     </w:p>
     <w:p>
@@ -133,7 +133,7 @@
         <w:ind w:left="259" w:right="173"/>
       </w:pPr>
       <w:r>
-        <w:t>El resultado verificado en Git es un monorepo en la rama development con 149 commits visibles y HEAD 784900e. Desde el corte anterior se integraron doce commits: retirada del modelo Groq Llama 70B, refrescos del scraper con ámbitos y evidencia de ausencia, corrección de memoria, políticas transversales mediante wrappers, filtro por secuencia de letras, locales divididos por página, panel de detalle adaptable, selección explícita de ejecutable y versión, páginas públicas de error y legales y ajustes de accesibilidad y layout. Los Compose de HEAD conservan 16 servicios. El working tree posterior es amplio y todavía no integrado; sus Compose enumeran 17 servicios al añadir semantic-migrator. No se le atribuyen pruebas, despliegue, benchmark ni finalización en este informe.</w:t>
+        <w:t>El resultado verificado en Git es un monorepo en la rama development con 152 commits visibles y HEAD 08a43bf. Desde el corte anterior se integraron tres commits. El primero incorpora el amplio trabajo antes local: separación de repositorios y workers, heartbeats y retención operativa, migraciones, semantic-migrator, contratos compartidos, carga diferida por rutas, i18n con caché y reorganización del frontend. Los dos siguientes actualizan CI y la imagen web a Node 24, corrigen contextos Docker/GHCR y activan el agente Mockito solo en los módulos que lo necesitan. Ambos Compose de HEAD enumeran ahora 17 servicios. No se ejecutaron suites, despliegue, benchmark ni aplicación completa en este informe.</w:t>
       </w:r>
     </w:p>
     <w:tbl>
@@ -182,7 +182,7 @@
                 <w:color w:val="FFFFFF"/>
                 <w:sz w:val="36"/>
               </w:rPr>
-              <w:t>149</w:t>
+              <w:t>152</w:t>
             </w:r>
           </w:p>
         </w:tc>
@@ -209,7 +209,7 @@
                 <w:color w:val="FFFFFF"/>
                 <w:sz w:val="36"/>
               </w:rPr>
-              <w:t>16</w:t>
+              <w:t>17</w:t>
             </w:r>
           </w:p>
         </w:tc>
@@ -324,7 +324,7 @@
         </w:numPr>
       </w:pPr>
       <w:r>
-        <w:t>Este informe combina historiales de tareas de Codex vinculadas al proyecto, el repositorio hermano de la memoria LaTeX, la organización del proyecto en GitHub y el historial Git local hasta el commit 784900ef del 22 de agosto de 2026, verificado el 24 de agosto. También se contrastaron README.md, .github/copilot-instructions.md, OpenAPI, los dos Compose, el estado del working tree y el árbol documental LaTeX.</w:t>
+        <w:t>Este informe combina historiales de tareas de Codex vinculadas al proyecto, el repositorio hermano de la memoria LaTeX, la organización del proyecto en GitHub y el historial Git local hasta el commit 08a43bfc del 24 de agosto de 2026, verificado el 25 de agosto. También se contrastaron README.md, .github/copilot-instructions.md, OpenAPI, los dos Compose, el estado del working tree y el árbol documental LaTeX.</w:t>
       </w:r>
     </w:p>
     <w:p>
@@ -335,7 +335,7 @@
         </w:numPr>
       </w:pPr>
       <w:r>
-        <w:t>El apéndice conserva las 23 conversaciones previamente recuperadas y contrastadas. El 24 de agosto, la herramienta de tareas de Codex no respondió en tres consultas acotadas, incluidas páginas de 100 y 10 elementos con esperas superiores a dos minutos. Por ello no se añade ninguna conversación no recuperada y la cobertura nueva se limita a evidencia local verificable.</w:t>
+        <w:t>El apéndice conserva las 23 conversaciones previamente recuperadas y contrastadas. El 25 de agosto, la herramienta de tareas de Codex volvió a quedar sin respuesta en dos consultas acotadas, de 100 y 10 elementos, con esperas prolongadas. Por ello no se añade ninguna conversación no recuperada y la cobertura nueva se limita a evidencia local verificable.</w:t>
       </w:r>
     </w:p>
     <w:p>
@@ -346,7 +346,6 @@
         </w:numPr>
       </w:pPr>
       <w:r>
-        <w:lastRenderedPageBreak/>
         <w:t>Las cifras históricas se presentan como hitos de verificación en la fecha en que se registraron; no se asume que sigan siendo idénticas hoy.</w:t>
       </w:r>
     </w:p>
@@ -369,7 +368,8 @@
         </w:numPr>
       </w:pPr>
       <w:r>
-        <w:t>No se arrancó ni reinició la aplicación completa para preparar este informe. Los resultados desplegados y suites citados en fechas anteriores siguen siendo evidencia histórica. En esta ejecución se verificaron Git, configuración, ambos Compose actuales y el árbol LaTeX; no se repitieron suites ni se declara validado el amplio working tree posterior a HEAD.</w:t>
+        <w:lastRenderedPageBreak/>
+        <w:t>No se arrancó ni reinició la aplicación completa para preparar este informe. Los resultados desplegados y suites citados en fechas anteriores siguen siendo evidencia histórica. En esta ejecución se verificaron Git, configuración, ambos Compose de HEAD y el árbol LaTeX; no se repitieron suites ni se extrapolan validaciones históricas a los tres commits recientes.</w:t>
       </w:r>
     </w:p>
     <w:p>
@@ -1301,7 +1301,6 @@
               <w:rPr>
                 <w:sz w:val="18"/>
               </w:rPr>
-              <w:lastRenderedPageBreak/>
               <w:t>5 ago</w:t>
             </w:r>
           </w:p>
@@ -1499,8 +1498,8 @@
             <w:vAlign w:val="center"/>
           </w:tcPr>
           <w:p>
-            <w:pPr/>
             <w:r>
+              <w:lastRenderedPageBreak/>
               <w:t>19-24 ago</w:t>
             </w:r>
           </w:p>
@@ -1517,7 +1516,6 @@
             <w:vAlign w:val="center"/>
           </w:tcPr>
           <w:p>
-            <w:pPr/>
             <w:r>
               <w:t>Scraper, wrappers y experiencia pública</w:t>
             </w:r>
@@ -1535,13 +1533,65 @@
             <w:vAlign w:val="center"/>
           </w:tcPr>
           <w:p>
-            <w:pPr/>
             <w:r>
               <w:t>Doce commits integran refrescos con evidencia de ausencia, políticas transversales, búsqueda y selección más precisas, locales modulares, páginas legales/error y mejoras de accesibilidad y layout.</w:t>
             </w:r>
           </w:p>
         </w:tc>
       </w:tr>
+      <w:tr>
+        <w:tc>
+          <w:tcPr>
+            <w:tcW w:w="1500" w:type="dxa"/>
+            <w:tcMar>
+              <w:top w:w="80" w:type="dxa"/>
+              <w:left w:w="120" w:type="dxa"/>
+              <w:bottom w:w="80" w:type="dxa"/>
+              <w:right w:w="120" w:type="dxa"/>
+            </w:tcMar>
+            <w:vAlign w:val="center"/>
+          </w:tcPr>
+          <w:p>
+            <w:r>
+              <w:t>24-25 ago</w:t>
+            </w:r>
+          </w:p>
+        </w:tc>
+        <w:tc>
+          <w:tcPr>
+            <w:tcW w:w="2100" w:type="dxa"/>
+            <w:tcMar>
+              <w:top w:w="80" w:type="dxa"/>
+              <w:left w:w="120" w:type="dxa"/>
+              <w:bottom w:w="80" w:type="dxa"/>
+              <w:right w:w="120" w:type="dxa"/>
+            </w:tcMar>
+            <w:vAlign w:val="center"/>
+          </w:tcPr>
+          <w:p>
+            <w:r>
+              <w:t>Modularización y operación integrada</w:t>
+            </w:r>
+          </w:p>
+        </w:tc>
+        <w:tc>
+          <w:tcPr>
+            <w:tcW w:w="5760" w:type="dxa"/>
+            <w:tcMar>
+              <w:top w:w="80" w:type="dxa"/>
+              <w:left w:w="120" w:type="dxa"/>
+              <w:bottom w:w="80" w:type="dxa"/>
+              <w:right w:w="120" w:type="dxa"/>
+            </w:tcMar>
+            <w:vAlign w:val="center"/>
+          </w:tcPr>
+          <w:p>
+            <w:r>
+              <w:t>El antiguo working tree se integra con semantic-migrator, heartbeats, retención, contratos y frontend modular; CI y web pasan a Node 24 y Mockito usa agente selectivo.</w:t>
+            </w:r>
+          </w:p>
+        </w:tc>
+      </w:tr>
     </w:tbl>
     <w:p>
       <w:pPr>
@@ -1607,11 +1657,7 @@
     </w:p>
     <w:p>
       <w:r>
-        <w:t xml:space="preserve">En paralelo nació el frontend React/Vite/TypeScript con búsqueda, filtros, tabla, panel de detalle y descarga individual. También se añadieron locales en español, una plantilla vacía para nuevos idiomas, servicios mínimos en Spring/FastAPI y un Compose global. Los primeros errores de integración - </w:t>
-      </w:r>
-      <w:r>
-        <w:lastRenderedPageBreak/>
-        <w:t>localhost dentro de Docker, proxy Nginx y accesos lazy de SQLAlchemy - se corrigieron antes de validar un smoke de cinco aplicaciones.</w:t>
+        <w:t>En paralelo nació el frontend React/Vite/TypeScript con búsqueda, filtros, tabla, panel de detalle y descarga individual. También se añadieron locales en español, una plantilla vacía para nuevos idiomas, servicios mínimos en Spring/FastAPI y un Compose global. Los primeros errores de integración - localhost dentro de Docker, proxy Nginx y accesos lazy de SQLAlchemy - se corrigieron antes de validar un smoke de cinco aplicaciones.</w:t>
       </w:r>
     </w:p>
     <w:p>
@@ -1625,6 +1671,7 @@
           <w:b/>
           <w:color w:val="123A63"/>
         </w:rPr>
+        <w:lastRenderedPageBreak/>
         <w:t xml:space="preserve">Hito técnico: </w:t>
       </w:r>
       <w:r>
@@ -1700,8 +1747,11 @@
     </w:p>
     <w:p>
       <w:r>
+        <w:t xml:space="preserve">Los deadlocks durante claim podían matar workers y aparentar que solo uno trabajaba. Se añadieron reintentos, marcadores de inicio y recuperación de leases caducados o ausentes. El panel administrativo </w:t>
+      </w:r>
+      <w:r>
         <w:lastRenderedPageBreak/>
-        <w:t>Los deadlocks durante claim podían matar workers y aparentar que solo uno trabajaba. Se añadieron reintentos, marcadores de inicio y recuperación de leases caducados o ausentes. El panel administrativo recibió acciones para reparar atascadas, reintentar fallidas y limpiar finalizadas, además de métricas y WebSocket.</w:t>
+        <w:t>recibió acciones para reparar atascadas, reintentar fallidas y limpiar finalizadas, además de métricas y WebSocket.</w:t>
       </w:r>
     </w:p>
     <w:p>
@@ -1770,12 +1820,12 @@
     </w:p>
     <w:p>
       <w:r>
+        <w:t>Core, scraper, OpenAPI, frontend, traducciones y reglas de Copilot se alinearon con la misma semántica. La antigüedad de checked_at o expires_at dejó de cambiar por sí sola la clasificación: una fuente válida sigue visible y se revalida justo antes de entregarse al worker.</w:t>
+      </w:r>
+    </w:p>
+    <w:p>
+      <w:r>
         <w:lastRenderedPageBreak/>
-        <w:t>Core, scraper, OpenAPI, frontend, traducciones y reglas de Copilot se alinearon con la misma semántica. La antigüedad de checked_at o expires_at dejó de cambiar por sí sola la clasificación: una fuente válida sigue visible y se revalida justo antes de entregarse al worker.</w:t>
-      </w:r>
-    </w:p>
-    <w:p>
-      <w:r>
         <w:t>Las pruebas de código quedaron completadas, pero la conversación terminó con una imagen antigua todavía desplegada y sin la verificación visual final de la reconstrucción. Por eso el hito se considera completado en código y posteriormente integrado, pero aquella sesión concreta fue parcial.</w:t>
       </w:r>
     </w:p>
@@ -1840,15 +1890,12 @@
     </w:p>
     <w:p>
       <w:r>
-        <w:t xml:space="preserve">La administración incorporó un banco de resolución para aplicaciones review o missing. El operador aporta una página de origen y una o varias URI opcionales para Windows, macOS y Linux; cada URI se </w:t>
-      </w:r>
+        <w:t>La administración incorporó un banco de resolución para aplicaciones review o missing. El operador aporta una página de origen y una o varias URI opcionales para Windows, macOS y Linux; cada URI se valida contra su plataforma, se cifra por separado y la cola transporta únicamente el identificador de inspección. La previsualización no modifica el catálogo y la publicación revalida y crea o reutiliza las fuentes en una sola transacción.</w:t>
+      </w:r>
+    </w:p>
+    <w:p>
       <w:r>
         <w:lastRenderedPageBreak/>
-        <w:t>valida contra su plataforma, se cifra por separado y la cola transporta únicamente el identificador de inspección. La previsualización no modifica el catálogo y la publicación revalida y crea o reutiliza las fuentes en una sola transacción.</w:t>
-      </w:r>
-    </w:p>
-    <w:p>
-      <w:r>
         <w:t>El alta de una aplicación nueva se redujo a su web oficial, con URI por sistema operativo opcionales. Un trabajo persistente extrae metadatos permitidos, genera la descripción larga, busca instaladores y presenta una previsualización editable sin revelar enlaces ejecutables. Si no queda ningún candidato fiable tras la revalidación, la aplicación se conserva como missing en lugar de publicar una descarga dudosa.</w:t>
       </w:r>
     </w:p>
@@ -1892,12 +1939,12 @@
     </w:p>
     <w:p>
       <w:r>
+        <w:t>Una nueva tarea rediseñó la selección temporal del catálogo: rejilla adaptable de 6 columnas por 3 filas, 17 iconos visibles y un hueco final +X, orden desde la incorporación más reciente, nombre en hover y retirada directa. El ancho fijo que desbordaba el fieldset se sustituyó por columnas proporcionales. La tarjeta pública de bundles también recibió cabecera, franja de miniaturas y pie simétricos.</w:t>
+      </w:r>
+    </w:p>
+    <w:p>
+      <w:r>
         <w:lastRenderedPageBreak/>
-        <w:t>Una nueva tarea rediseñó la selección temporal del catálogo: rejilla adaptable de 6 columnas por 3 filas, 17 iconos visibles y un hueco final +X, orden desde la incorporación más reciente, nombre en hover y retirada directa. El ancho fijo que desbordaba el fieldset se sustituyó por columnas proporcionales. La tarjeta pública de bundles también recibió cabecera, franja de miniaturas y pie simétricos.</w:t>
-      </w:r>
-    </w:p>
-    <w:p>
-      <w:r>
         <w:t>El contrato público de filtros se simplificó: todas las tags se combinan con AND, solo existe un editor activo y las facetas literales o semánticas se calculan tras aplicar búsqueda, estado, SO, arquitectura, tags y editor. Se retiraron tagMatchMin, tagMode público, coincidencias mínimas y el bloque de filtros activos; las URL antiguas se canonicalizan y existen controles para limpiar tags o editor. La tarea registró 87/87 pruebas frontend, 68/68 de Core, OpenAPI válido y build correcto; el cierre visual posterior llegó a 90/90 pruebas frontend, sin iniciar ni reiniciar la aplicación.</w:t>
       </w:r>
     </w:p>
@@ -2091,7 +2138,6 @@
         <w:pStyle w:val="Ttulo2"/>
       </w:pPr>
       <w:r>
-        <w:lastRenderedPageBreak/>
         <w:t>4. Integridad y rendimiento de MySQL</w:t>
       </w:r>
     </w:p>
@@ -2123,6 +2169,7 @@
         <w:rPr>
           <w:b/>
         </w:rPr>
+        <w:lastRenderedPageBreak/>
         <w:t>Solución:</w:t>
       </w:r>
       <w:r>
@@ -2387,6 +2434,7 @@
         <w:pStyle w:val="Ttulo2"/>
       </w:pPr>
       <w:r>
+        <w:lastRenderedPageBreak/>
         <w:t>9. Deriva entre código y memoria</w:t>
       </w:r>
     </w:p>
@@ -2569,6 +2617,7 @@
         <w:pStyle w:val="Ttulo2"/>
       </w:pPr>
       <w:r>
+        <w:lastRenderedPageBreak/>
         <w:t>13. Cobertura documental del código</w:t>
       </w:r>
     </w:p>
@@ -2832,9 +2881,8 @@
     </w:p>
     <w:p>
       <w:r>
-        <w:t>La arquitectura integrada hasta HEAD 784900e mantiene MySQL como autoridad transaccional y PostgreSQL/pgvector como proyección reconstruible. A los healthchecks, recuperación del scheduler y aprovisionamiento semántico local del corte anterior se suman wrappers explícitos para HTTP interno, descargas remotas, mensajería y traducciones; ámbitos de refresco y evidencia de ausencia en el scraper; y contratos públicos para búsqueda y selección de instaladores. Los resultados históricos de suites y despliegue no se extrapolan automáticamente a estos doce commits. El working tree posterior añade cambios aún no integrados, entre ellos semantic-migrator, y permanece pendiente de validación focalizada y de integración.</w:t>
-      </w:r>
-      <w:r/>
+        <w:t>La arquitectura integrada hasta HEAD 08a43bf mantiene MySQL como autoridad transaccional y PostgreSQL/pgvector como proyección reconstruible. El antiguo working tree ya forma parte de development: añade semantic-migrator, heartbeats y retención, separa repositorios y workers de gran tamaño, coordina contratos y rutas, y reorganiza el frontend con carga diferida e i18n. Los resultados históricos de suites y despliegue no se extrapolan automáticamente a estos tres commits; la integración sigue pendiente de validación focalizada y de recorrido visual.</w:t>
+      </w:r>
     </w:p>
     <w:p>
       <w:pPr>
@@ -3006,7 +3054,7 @@
           </w:tcPr>
           <w:p>
             <w:r>
-              <w:t>Integrado en HEAD; trabajo posterior no verificado</w:t>
+              <w:t>Integrado en HEAD; validación reciente pendiente</w:t>
             </w:r>
           </w:p>
         </w:tc>
@@ -3023,7 +3071,7 @@
           </w:tcPr>
           <w:p>
             <w:r>
-              <w:t>development, HEAD 784900ef y 149 commits visibles. Doce commits nuevos están integrados. El working tree posterior modifica 163 ficheros versionados y añade otros nuevos; no se atribuye a HEAD ni a validaciones históricas.</w:t>
+              <w:t>development, HEAD 08a43bfc y 152 commits visibles. Tres commits nuevos integran el antiguo working tree, corrigen CI/Docker y acotan el agente Mockito. El árbol de trabajo está limpio antes de editar este informe.</w:t>
             </w:r>
           </w:p>
         </w:tc>
@@ -3040,7 +3088,7 @@
           </w:tcPr>
           <w:p>
             <w:r>
-              <w:t>Separar, revisar y validar el working tree antes de integrarlo; mantener pendientes las migraciones y recorridos desplegados de identidad, proveedores y degradación operativa.</w:t>
+              <w:t>Ejecutar suites focalizadas y recorridos de migraciones, heartbeats, retención, contratos y frontend; no extrapolar las validaciones históricas.</w:t>
             </w:r>
           </w:p>
         </w:tc>
@@ -3082,7 +3130,7 @@
           </w:tcPr>
           <w:p>
             <w:r>
-              <w:t>Validado históricamente; endurecimiento local</w:t>
+              <w:t>Topología integrada; validación estática actual</w:t>
             </w:r>
           </w:p>
         </w:tc>
@@ -3099,7 +3147,7 @@
           </w:tcPr>
           <w:p>
             <w:r>
-              <w:t>Los Compose de HEAD conservan 16 servicios. Los Compose del working tree actual validan y enumeran 17 por la adición de semantic-migrator. La evidencia desplegada del 5 de agosto y las 11 pruebas del orquestador son históricas.</w:t>
+              <w:t>Ambos Compose de HEAD validan con .env.example y enumeran 17 servicios, incluido semantic-migrator. La evidencia desplegada del 5 de agosto y las 11 pruebas del orquestador siguen siendo históricas.</w:t>
             </w:r>
           </w:p>
         </w:tc>
@@ -3116,7 +3164,7 @@
           </w:tcPr>
           <w:p>
             <w:r>
-              <w:t>Validar el nuevo semantic-migrator y la topología de 17 servicios; probar fallos reales por capacidad, recuperación y GHCR; ejecutar k6.</w:t>
+              <w:t>Validar semantic-migrator y la topología de 17 servicios en un entorno controlado; probar fallos reales por capacidad, recuperación y GHCR; ejecutar k6.</w:t>
             </w:r>
           </w:p>
         </w:tc>
@@ -3181,7 +3229,7 @@
           </w:tcPr>
           <w:p>
             <w:r>
-              <w:t>HEAD integra ámbitos de refresco, evidencia de ausencia, mejora de instaladores, validación de versiones y corrección de memoria. No se verificó una ejecución global ni se repitieron suites en este corte.</w:t>
+              <w:t>HEAD integra ámbitos de refresco, evidencia de ausencia, mejora de instaladores, heartbeats, retención y migraciones del pipeline. No se verificó una ejecución global ni se repitieron suites en este corte.</w:t>
             </w:r>
           </w:p>
         </w:tc>
@@ -3198,7 +3246,7 @@
           </w:tcPr>
           <w:p>
             <w:r>
-              <w:t>Confirmar finalización y resultados de refrescos full/unresolved y validar por separado heartbeats, retención y migraciones del working tree.</w:t>
+              <w:t>Confirmar finalización y resultados de refrescos full/unresolved y validar heartbeats, retención y migraciones integradas.</w:t>
             </w:r>
           </w:p>
         </w:tc>
@@ -3263,7 +3311,7 @@
           </w:tcPr>
           <w:p>
             <w:r>
-              <w:t>Búsqueda por secuencia de letras, panel adaptable y selección de ejecutable/versión están integrados; MySQL mantiene autoridad. El working tree cambia contratos, filtros y rutas sin integración confirmada.</w:t>
+              <w:t>La búsqueda, el panel adaptable, la selección de ejecutable/versión y la reorganización de repositorios y rutas están integrados; MySQL mantiene autoridad.</w:t>
             </w:r>
           </w:p>
         </w:tc>
@@ -3280,7 +3328,7 @@
           </w:tcPr>
           <w:p>
             <w:r>
-              <w:t>Revisión visual sobre instancia actualizada; alinear RF-03 y validar contratos y migraciones antes de integrar el working tree.</w:t>
+              <w:t>Revisión visual sobre instancia actualizada; alinear RF-03 y validar contratos y migraciones.</w:t>
             </w:r>
           </w:p>
         </w:tc>
@@ -3543,7 +3591,7 @@
           </w:tcPr>
           <w:p>
             <w:r>
-              <w:t>La documentación de wrappers está integrada. README no cambió desde el corte anterior; copilot-instructions, Compose y numerosos documentos están modificados solo en el working tree. LaTeX permanece en 6c0649c/33 commits, con cambios locales y PDF de julio.</w:t>
+              <w:t>La documentación de wrappers y las instrucciones corregidas están integradas. README principal no cambió desde el corte anterior. LaTeX permanece en 6c0649c/33 commits, con cambios locales y PDF de julio.</w:t>
             </w:r>
           </w:p>
         </w:tc>
@@ -3666,27 +3714,49 @@
       </w:pPr>
     </w:p>
     <w:p>
-      <w:pPr/>
-      <w:r>
-        <w:t>El scraper incorporó ámbitos de refresco y evidencia duradera para distinguir aplicaciones disponibles, en revisión y ausencias realmente comprobadas. La migración 0016, WinstallClient, el pipeline y el catálogo coordinan refrescos completos o acotados, validación de candidatos y promoción segura de versiones. También se retiró el modelo Groq Llama 70B obsoleto. La corrección 3245f14 añadió la migración 0017 y redujo presión de memoria en ejecuciones y totales. Estas funciones forman parte de HEAD; este informe no repitió sus suites ni certifica que una ejecución global de refresco haya terminado.</w:t>
-      </w:r>
-    </w:p>
-    <w:p>
-      <w:pPr/>
+      <w:r>
+        <w:t>El scraper incorporó ámbitos de refresco y evidencia duradera para distinguir aplicaciones disponibles, en revisión y ausencias realmente comprobadas. La migración 0016, WinstallClient, el pipeline y el catálogo coordinan refrescos completos o acotados, validación de candidatos y promoción segura de versiones. También se retiró el modelo Groq Llama 70B obsoleto. La corrección 3245f14 añadió la migración 0017 y redujo presión de memoria en ejecuciones y totales. Estas funciones forman parte de HEAD; este inf</w:t>
+      </w:r>
+      <w:r>
+        <w:t>orme no repitió sus suites ni certifica que una ejecución global de refresco haya terminado.</w:t>
+      </w:r>
+    </w:p>
+    <w:p>
       <w:r>
         <w:t>El commit 945d6f6 separó políticas transversales mediante wrappers: ejecución HTTP interna con token, timeout y métricas; descarga remota con validación, integridad y limpieza de parciales; handlers idempotentes y validados para mensajería; políticas HTTP en semantic-service; y catálogos de traducción medidos. La decisión arquitectónica conserva el núcleo funcional y aplica seguridad, observabilidad y resiliencia en los bordes. Su documentación quedó en docs/architecture/politicas-mediante-wrappers.md.</w:t>
       </w:r>
     </w:p>
     <w:p>
-      <w:pPr/>
       <w:r>
         <w:t>La experiencia pública añadió búsqueda por secuencia de letras, locales divididos por página, un panel de detalle adaptable en lugar del drawer lateral fijo y selección explícita del ejecutable con su versión. Después se incorporaron páginas localizadas de error y legales, correcciones del footer, etiquetas accesibles para trabajos de descarga y ajustes de visibilidad y responsive. Son cambios integrados en Git; no se realizó una revisión visual sobre una aplicación ejecutándose.</w:t>
       </w:r>
     </w:p>
     <w:p>
-      <w:pPr/>
-      <w:r>
-        <w:t>Después de HEAD existe un working tree material de 163 ficheros modificados más archivos nuevos. Incluye, entre otros, semantic-migrator, heartbeats y retención, cambios de contratos y rutas, operaciones administrativas, migraciones y reorganización de frontend y build. Ambos Compose actuales validan y enumeran 17 servicios. Como este trabajo no está integrado y no se ejecutaron sus suites, se registra como trabajo no verificado y no sustituye el estado de HEAD ni cierra pendientes.</w:t>
+      <w:r>
+        <w:t>El trabajo que el corte anterior registraba como working tree no integrado quedó incorporado en 246597c. Incluye semantic-migrator, heartbeats y retención, cambios de contratos y rutas, operaciones administrativas, migraciones y reorganización de frontend y build. Ambos Compose de HEAD validan estáticamente y enumeran 17 servicios. Como esta ejecución no corrió sus suites ni un despliegue, la integración en Git no se presenta como validación funcional ni cierra pendientes.</w:t>
+      </w:r>
+    </w:p>
+    <w:p>
+      <w:pPr>
+        <w:pStyle w:val="Ttulo2"/>
+      </w:pPr>
+      <w:r>
+        <w:t>24-25 de agosto - Modularización, operación y toolchain integrados</w:t>
+      </w:r>
+    </w:p>
+    <w:p>
+      <w:r>
+        <w:t>El commit 246597c integró el amplio trabajo que el corte anterior separaba como no verificado. El scraper quedó dividido en workers y políticas más acotadas, con heartbeats, retención y migraciones; Core separó repositorios y añadió purgas operativas; download-worker y notification-service incorporaron heartbeats y limpieza de inbox; semantic-service separó almacenamiento, evaluación, entrenamiento y administración, y añadió semantic-migrator como paso explícito previo a los consumidores.</w:t>
+      </w:r>
+    </w:p>
+    <w:p>
+      <w:r>
+        <w:t>El mismo commit reorganizó el frontend en páginas, clientes de dominio y rutas con carga diferida, añadió un proveedor i18n con mensajes empaquetados, caché local y recuperación remota, y coordinó OpenAPI, AsyncAPI y contratos Java para tokens de notificación y estado de workers. Esta integración es un hecho de Git; sus validaciones funcionales no se repitieron en este corte.</w:t>
+      </w:r>
+    </w:p>
+    <w:p>
+      <w:r>
+        <w:t>Los commits 16c7f69 y 08a43bf actualizaron CI y la imagen de construcción web a Node 24, corrigieron los contextos Docker usados por GHCR y configuraron el agente Mockito solo en los módulos que declaran la dependencia. Ambos Compose validan estáticamente y enumeran 17 servicios. No se arrancó la aplicación ni se afirma despliegue, benchmark o PDF nuevo.</w:t>
       </w:r>
     </w:p>
     <w:p>
@@ -5767,7 +5837,7 @@
           </w:tcPr>
           <w:p>
             <w:r>
-              <w:t>149 commits visibles; HEAD 784900ef000dd9a7c076be337be9bb0f28c0ddad; rama development. Doce commits posteriores al corte del 19 de agosto están integrados. El working tree posterior es material y no se considera parte de HEAD.</w:t>
+              <w:t>152 commits visibles; HEAD 08a43bfc2988ceb2ec790a126cf56592718de94a; rama development. Tres commits posteriores al corte del 24 de agosto están integrados; el working tree estaba limpio antes de editar el informe.</w:t>
             </w:r>
           </w:p>
         </w:tc>
@@ -5809,7 +5879,7 @@
           </w:tcPr>
           <w:p>
             <w:r>
-              <w:t>No cambió en HEAD desde el corte anterior. api/scraper/README.md y docs/architecture/politicas-mediante-wrappers.md sí documentan cambios integrados; otros ajustes README permanecen locales.</w:t>
+              <w:t>README principal no cambió desde el corte anterior. api/scraper/README.md cambió en 246597c junto con la integración de la arquitectura modular.</w:t>
             </w:r>
           </w:p>
         </w:tc>
@@ -5851,7 +5921,7 @@
           </w:tcPr>
           <w:p>
             <w:r>
-              <w:t>Sin cambios integrados desde 25235019. El working tree corrige nombres SCRAPER_ y rutas /api/v1/admin; se registra como no integrado.</w:t>
+              <w:t>246597c corrige nombres SCRAPER_ y rutas /api/v1/admin; los cambios ya están integrados en HEAD.</w:t>
             </w:r>
           </w:p>
         </w:tc>
@@ -5893,7 +5963,7 @@
           </w:tcPr>
           <w:p>
             <w:r>
-              <w:t>Los Compose de HEAD conservan 16 servicios. Los dos Compose actuales del working tree validaron con .env.example y enumeraron 17 servicios por semantic-migrator; no se arrancaron contenedores.</w:t>
+              <w:t>Ambos Compose de HEAD validaron con .env.example y enumeraron 17 servicios, incluido semantic-migrator; no se arrancaron contenedores.</w:t>
             </w:r>
           </w:p>
         </w:tc>
@@ -5977,7 +6047,7 @@
           </w:tcPr>
           <w:p>
             <w:r>
-              <w:t>OpenAPI cambió en HEAD para ámbitos del scraper y selección de instaladores; GitHub mantiene la referencia histórica de 48 requisitos. No se recuperaron nuevas tareas externas por la falta de respuesta de la herramienta de tareas.</w:t>
+              <w:t>OpenAPI y contratos compartidos cambiaron en 246597c. GitHub mantiene la referencia histórica de 48 requisitos. No se recuperaron nuevas tareas externas porque la herramienta de tareas no respondió.</w:t>
             </w:r>
           </w:p>
         </w:tc>
@@ -6044,7 +6114,7 @@
           </w:tcPr>
           <w:p>
             <w:r>
-              <w:t>Git y configuración (24 ago)</w:t>
+              <w:t>Git y configuración (25 ago)</w:t>
             </w:r>
           </w:p>
         </w:tc>
@@ -6061,7 +6131,7 @@
           </w:tcPr>
           <w:p>
             <w:r>
-              <w:t>HEAD 784900e/149 commits. Git confirma doce commits nuevos; docker compose config --services confirma 17 servicios en cada Compose del working tree. No se ejecutaron suites, benchmark, aplicación ni despliegue. La recuperación de tareas falló en tres consultas acotadas.</w:t>
+              <w:t>HEAD 08a43bf/152 commits. Git confirma tres commits nuevos; docker compose config --services confirma 17 servicios en cada Compose de HEAD. No se ejecutaron suites, benchmark, aplicación ni despliegue. La recuperación de tareas quedó sin respuesta en dos consultas acotadas.</w:t>
             </w:r>
           </w:p>
         </w:tc>
@@ -6082,7 +6152,7 @@
     </w:p>
     <w:p>
       <w:r>
-        <w:t>Batch-Downloader ya integra un scraper con ámbitos y evidencia de ausencia, políticas transversales mediante wrappers y una experiencia pública más precisa y accesible, además de las capacidades descritas en cortes anteriores. HEAD queda en 784900e con 149 commits. Los resultados desplegados y suites previas siguen siendo históricos; no prueban los doce commits recientes ni el amplio working tree posterior. Permanecen abiertos la validación de refrescos, la topología no integrada de 17 servicios, migraciones y recorridos de identidad, k6, la evaluación semántica full, la revisión visual reciente y la sincronización/recompilación LaTeX.</w:t>
+        <w:t>Batch-Downloader ya integra un scraper con ámbitos y evidencia de ausencia, políticas transversales mediante wrappers y una experiencia pública más precisa y accesible, además de las capacidades descritas en cortes anteriores. HEAD queda en 08a43bf con 152 commits. Los resultados desplegados y suites previas siguen siendo históricos; no prueban los tres commits recientes. Permanecen abiertos la validación focalizada de la topología integrada de 17 servicios, migraciones, heartbeats y retención; los recorridos de identidad y frontend; k6; la evaluación semántica full; la revisión visual reciente; y la sincronización/recompilación LaTeX.</w:t>
       </w:r>
     </w:p>
     <w:p/>
@@ -6104,7 +6174,7 @@
 </file>
 
 <file path=word/endnotes.xml><?xml version="1.0" encoding="utf-8"?>
-<w:endnotes xmlns:wpc="http://schemas.microsoft.com/office/word/2010/wordprocessingCanvas" xmlns:cx="http://schemas.microsoft.com/office/drawing/2014/chartex" xmlns:cx1="http://schemas.microsoft.com/office/drawing/2015/9/8/chartex" xmlns:cx2="http://schemas.microsoft.com/office/drawing/2015/10/21/chartex" xmlns:cx3="http://schemas.microsoft.com/office/drawing/2016/5/9/chartex" xmlns:cx4="http://schemas.microsoft.com/office/drawing/2016/5/10/chartex" xmlns:cx5="http://schemas.microsoft.com/office/drawing/2016/5/11/chartex" xmlns:cx6="http://schemas.microsoft.com/office/drawing/2016/5/12/chartex" xmlns:cx7="http://schemas.microsoft.com/office/drawing/2016/5/13/chartex" xmlns:cx8="http://schemas.microsoft.com/office/drawing/2016/5/14/chartex" xmlns:mc="http://schemas.openxmlformats.org/markup-compatibility/2006" xmlns:aink="http://schemas.microsoft.com/office/drawing/2016/ink" xmlns:am3d="http://schemas.microsoft.com/office/drawing/2017/model3d" xmlns:o="urn:schemas-microsoft-com:office:office" xmlns:oel="http://schemas.microsoft.com/office/2019/extlst" xmlns:r="http://schemas.openxmlformats.org/officeDocument/2006/relationships" xmlns:m="http://schemas.openxmlformats.org/officeDocument/2006/math" xmlns:v="urn:schemas-microsoft-com:vml" xmlns:wp14="http://schemas.microsoft.com/office/word/2010/wordprocessingDrawing" xmlns:wp="http://schemas.openxmlformats.org/drawingml/2006/wordprocessingDrawing" xmlns:w10="urn:schemas-microsoft-com:office:word" xmlns:w="http://schemas.openxmlformats.org/wordprocessingml/2006/main" xmlns:w14="http://schemas.microsoft.com/office/word/2010/wordml" xmlns:w15="http://schemas.microsoft.com/office/word/2012/wordml" xmlns:w16cei="http://schemas.microsoft.com/office/word/2026/wordml/cei" xmlns:w16cex="http://schemas.microsoft.com/office/word/2018/wordml/cex" xmlns:w16cid="http://schemas.microsoft.com/office/word/2016/wordml/cid" xmlns:w16="http://schemas.microsoft.com/office/word/2018/wordml" xmlns:w16du="http://schemas.microsoft.com/office/word/2023/wordml/word16du" xmlns:w16sdtdh="http://schemas.microsoft.com/office/word/2020/wordml/sdtdatahash" xmlns:w16sdtfl="http://schemas.microsoft.com/office/word/2024/wordml/sdtformatlock" xmlns:w16se="http://schemas.microsoft.com/office/word/2015/wordml/symex" xmlns:wpg="http://schemas.microsoft.com/office/word/2010/wordprocessingGroup" xmlns:wpi="http://schemas.microsoft.com/office/word/2010/wordprocessingInk" xmlns:wne="http://schemas.microsoft.com/office/word/2006/wordml" xmlns:wps="http://schemas.microsoft.com/office/word/2010/wordprocessingShape" mc:Ignorable="w14 w15 w16se w16cid w16 w16cex w16sdtdh w16sdtfl w16du wp14">
+<w:endnotes xmlns:wpc="http://schemas.microsoft.com/office/word/2010/wordprocessingCanvas" xmlns:cx="http://schemas.microsoft.com/office/drawing/2014/chartex" xmlns:cx1="http://schemas.microsoft.com/office/drawing/2015/9/8/chartex" xmlns:cx2="http://schemas.microsoft.com/office/drawing/2015/10/21/chartex" xmlns:cx3="http://schemas.microsoft.com/office/drawing/2016/5/9/chartex" xmlns:cx4="http://schemas.microsoft.com/office/drawing/2016/5/10/chartex" xmlns:cx5="http://schemas.microsoft.com/office/drawing/2016/5/11/chartex" xmlns:cx6="http://schemas.microsoft.com/office/drawing/2016/5/12/chartex" xmlns:cx7="http://schemas.microsoft.com/office/drawing/2016/5/13/chartex" xmlns:cx8="http://schemas.microsoft.com/office/drawing/2016/5/14/chartex" xmlns:mc="http://schemas.openxmlformats.org/markup-compatibility/2006" xmlns:aink="http://schemas.microsoft.com/office/drawing/2016/ink" xmlns:am3d="http://schemas.microsoft.com/office/drawing/2017/model3d" xmlns:o="urn:schemas-microsoft-com:office:office" xmlns:oel="http://schemas.microsoft.com/office/2019/extlst" xmlns:r="http://schemas.openxmlformats.org/officeDocument/2006/relationships" xmlns:m="http://schemas.openxmlformats.org/officeDocument/2006/math" xmlns:v="urn:schemas-microsoft-com:vml" xmlns:wp14="http://schemas.microsoft.com/office/word/2010/wordprocessingDrawing" xmlns:wp="http://schemas.openxmlformats.org/drawingml/2006/wordprocessingDrawing" xmlns:w10="urn:schemas-microsoft-com:office:word" xmlns:w="http://schemas.openxmlformats.org/wordprocessingml/2006/main" xmlns:w14="http://schemas.microsoft.com/office/word/2010/wordml" xmlns:w15="http://schemas.microsoft.com/office/word/2012/wordml" xmlns:w16cex="http://schemas.microsoft.com/office/word/2018/wordml/cex" xmlns:w16cid="http://schemas.microsoft.com/office/word/2016/wordml/cid" xmlns:w16="http://schemas.microsoft.com/office/word/2018/wordml" xmlns:w16du="http://schemas.microsoft.com/office/word/2023/wordml/word16du" xmlns:w16sdtdh="http://schemas.microsoft.com/office/word/2020/wordml/sdtdatahash" xmlns:w16sdtfl="http://schemas.microsoft.com/office/word/2024/wordml/sdtformatlock" xmlns:w16se="http://schemas.microsoft.com/office/word/2015/wordml/symex" xmlns:wpg="http://schemas.microsoft.com/office/word/2010/wordprocessingGroup" xmlns:wpi="http://schemas.microsoft.com/office/word/2010/wordprocessingInk" xmlns:wne="http://schemas.microsoft.com/office/word/2006/wordml" xmlns:wps="http://schemas.microsoft.com/office/word/2010/wordprocessingShape" mc:Ignorable="w14 w15 w16se w16cid w16 w16cex w16sdtdh w16sdtfl w16du wp14">
   <w:endnote w:type="separator" w:id="-1">
     <w:p>
       <w:pPr>
@@ -6129,7 +6199,7 @@
 </file>
 
 <file path=word/footer1.xml><?xml version="1.0" encoding="utf-8"?>
-<w:ftr xmlns:wpc="http://schemas.microsoft.com/office/word/2010/wordprocessingCanvas" xmlns:cx="http://schemas.microsoft.com/office/drawing/2014/chartex" xmlns:cx1="http://schemas.microsoft.com/office/drawing/2015/9/8/chartex" xmlns:cx2="http://schemas.microsoft.com/office/drawing/2015/10/21/chartex" xmlns:cx3="http://schemas.microsoft.com/office/drawing/2016/5/9/chartex" xmlns:cx4="http://schemas.microsoft.com/office/drawing/2016/5/10/chartex" xmlns:cx5="http://schemas.microsoft.com/office/drawing/2016/5/11/chartex" xmlns:cx6="http://schemas.microsoft.com/office/drawing/2016/5/12/chartex" xmlns:cx7="http://schemas.microsoft.com/office/drawing/2016/5/13/chartex" xmlns:cx8="http://schemas.microsoft.com/office/drawing/2016/5/14/chartex" xmlns:mc="http://schemas.openxmlformats.org/markup-compatibility/2006" xmlns:aink="http://schemas.microsoft.com/office/drawing/2016/ink" xmlns:am3d="http://schemas.microsoft.com/office/drawing/2017/model3d" xmlns:o="urn:schemas-microsoft-com:office:office" xmlns:oel="http://schemas.microsoft.com/office/2019/extlst" xmlns:r="http://schemas.openxmlformats.org/officeDocument/2006/relationships" xmlns:m="http://schemas.openxmlformats.org/officeDocument/2006/math" xmlns:v="urn:schemas-microsoft-com:vml" xmlns:wp14="http://schemas.microsoft.com/office/word/2010/wordprocessingDrawing" xmlns:wp="http://schemas.openxmlformats.org/drawingml/2006/wordprocessingDrawing" xmlns:w10="urn:schemas-microsoft-com:office:word" xmlns:w="http://schemas.openxmlformats.org/wordprocessingml/2006/main" xmlns:w14="http://schemas.microsoft.com/office/word/2010/wordml" xmlns:w15="http://schemas.microsoft.com/office/word/2012/wordml" xmlns:w16cei="http://schemas.microsoft.com/office/word/2026/wordml/cei" xmlns:w16cex="http://schemas.microsoft.com/office/word/2018/wordml/cex" xmlns:w16cid="http://schemas.microsoft.com/office/word/2016/wordml/cid" xmlns:w16="http://schemas.microsoft.com/office/word/2018/wordml" xmlns:w16du="http://schemas.microsoft.com/office/word/2023/wordml/word16du" xmlns:w16sdtdh="http://schemas.microsoft.com/office/word/2020/wordml/sdtdatahash" xmlns:w16sdtfl="http://schemas.microsoft.com/office/word/2024/wordml/sdtformatlock" xmlns:w16se="http://schemas.microsoft.com/office/word/2015/wordml/symex" xmlns:wpg="http://schemas.microsoft.com/office/word/2010/wordprocessingGroup" xmlns:wpi="http://schemas.microsoft.com/office/word/2010/wordprocessingInk" xmlns:wne="http://schemas.microsoft.com/office/word/2006/wordml" xmlns:wps="http://schemas.microsoft.com/office/word/2010/wordprocessingShape" mc:Ignorable="w14 w15 w16se w16cid w16 w16cex w16sdtdh w16sdtfl w16du wp14">
+<w:ftr xmlns:wpc="http://schemas.microsoft.com/office/word/2010/wordprocessingCanvas" xmlns:cx="http://schemas.microsoft.com/office/drawing/2014/chartex" xmlns:cx1="http://schemas.microsoft.com/office/drawing/2015/9/8/chartex" xmlns:cx2="http://schemas.microsoft.com/office/drawing/2015/10/21/chartex" xmlns:cx3="http://schemas.microsoft.com/office/drawing/2016/5/9/chartex" xmlns:cx4="http://schemas.microsoft.com/office/drawing/2016/5/10/chartex" xmlns:cx5="http://schemas.microsoft.com/office/drawing/2016/5/11/chartex" xmlns:cx6="http://schemas.microsoft.com/office/drawing/2016/5/12/chartex" xmlns:cx7="http://schemas.microsoft.com/office/drawing/2016/5/13/chartex" xmlns:cx8="http://schemas.microsoft.com/office/drawing/2016/5/14/chartex" xmlns:mc="http://schemas.openxmlformats.org/markup-compatibility/2006" xmlns:aink="http://schemas.microsoft.com/office/drawing/2016/ink" xmlns:am3d="http://schemas.microsoft.com/office/drawing/2017/model3d" xmlns:o="urn:schemas-microsoft-com:office:office" xmlns:oel="http://schemas.microsoft.com/office/2019/extlst" xmlns:r="http://schemas.openxmlformats.org/officeDocument/2006/relationships" xmlns:m="http://schemas.openxmlformats.org/officeDocument/2006/math" xmlns:v="urn:schemas-microsoft-com:vml" xmlns:wp14="http://schemas.microsoft.com/office/word/2010/wordprocessingDrawing" xmlns:wp="http://schemas.openxmlformats.org/drawingml/2006/wordprocessingDrawing" xmlns:w10="urn:schemas-microsoft-com:office:word" xmlns:w="http://schemas.openxmlformats.org/wordprocessingml/2006/main" xmlns:w14="http://schemas.microsoft.com/office/word/2010/wordml" xmlns:w15="http://schemas.microsoft.com/office/word/2012/wordml" xmlns:w16cex="http://schemas.microsoft.com/office/word/2018/wordml/cex" xmlns:w16cid="http://schemas.microsoft.com/office/word/2016/wordml/cid" xmlns:w16="http://schemas.microsoft.com/office/word/2018/wordml" xmlns:w16du="http://schemas.microsoft.com/office/word/2023/wordml/word16du" xmlns:w16sdtdh="http://schemas.microsoft.com/office/word/2020/wordml/sdtdatahash" xmlns:w16sdtfl="http://schemas.microsoft.com/office/word/2024/wordml/sdtformatlock" xmlns:w16se="http://schemas.microsoft.com/office/word/2015/wordml/symex" xmlns:wpg="http://schemas.microsoft.com/office/word/2010/wordprocessingGroup" xmlns:wpi="http://schemas.microsoft.com/office/word/2010/wordprocessingInk" xmlns:wne="http://schemas.microsoft.com/office/word/2006/wordml" xmlns:wps="http://schemas.microsoft.com/office/word/2010/wordprocessingShape" mc:Ignorable="w14 w15 w16se w16cid w16 w16cex w16sdtdh w16sdtfl w16du wp14">
   <w:p>
     <w:pPr>
       <w:pStyle w:val="Piedepgina"/>
@@ -6139,7 +6209,7 @@
 </file>
 
 <file path=word/footer2.xml><?xml version="1.0" encoding="utf-8"?>
-<w:ftr xmlns:wpc="http://schemas.microsoft.com/office/word/2010/wordprocessingCanvas" xmlns:cx="http://schemas.microsoft.com/office/drawing/2014/chartex" xmlns:cx1="http://schemas.microsoft.com/office/drawing/2015/9/8/chartex" xmlns:cx2="http://schemas.microsoft.com/office/drawing/2015/10/21/chartex" xmlns:cx3="http://schemas.microsoft.com/office/drawing/2016/5/9/chartex" xmlns:cx4="http://schemas.microsoft.com/office/drawing/2016/5/10/chartex" xmlns:cx5="http://schemas.microsoft.com/office/drawing/2016/5/11/chartex" xmlns:cx6="http://schemas.microsoft.com/office/drawing/2016/5/12/chartex" xmlns:cx7="http://schemas.microsoft.com/office/drawing/2016/5/13/chartex" xmlns:cx8="http://schemas.microsoft.com/office/drawing/2016/5/14/chartex" xmlns:mc="http://schemas.openxmlformats.org/markup-compatibility/2006" xmlns:aink="http://schemas.microsoft.com/office/drawing/2016/ink" xmlns:am3d="http://schemas.microsoft.com/office/drawing/2017/model3d" xmlns:o="urn:schemas-microsoft-com:office:office" xmlns:oel="http://schemas.microsoft.com/office/2019/extlst" xmlns:r="http://schemas.openxmlformats.org/officeDocument/2006/relationships" xmlns:m="http://schemas.openxmlformats.org/officeDocument/2006/math" xmlns:v="urn:schemas-microsoft-com:vml" xmlns:wp14="http://schemas.microsoft.com/office/word/2010/wordprocessingDrawing" xmlns:wp="http://schemas.openxmlformats.org/drawingml/2006/wordprocessingDrawing" xmlns:w10="urn:schemas-microsoft-com:office:word" xmlns:w="http://schemas.openxmlformats.org/wordprocessingml/2006/main" xmlns:w14="http://schemas.microsoft.com/office/word/2010/wordml" xmlns:w15="http://schemas.microsoft.com/office/word/2012/wordml" xmlns:w16cei="http://schemas.microsoft.com/office/word/2026/wordml/cei" xmlns:w16cex="http://schemas.microsoft.com/office/word/2018/wordml/cex" xmlns:w16cid="http://schemas.microsoft.com/office/word/2016/wordml/cid" xmlns:w16="http://schemas.microsoft.com/office/word/2018/wordml" xmlns:w16du="http://schemas.microsoft.com/office/word/2023/wordml/word16du" xmlns:w16sdtdh="http://schemas.microsoft.com/office/word/2020/wordml/sdtdatahash" xmlns:w16sdtfl="http://schemas.microsoft.com/office/word/2024/wordml/sdtformatlock" xmlns:w16se="http://schemas.microsoft.com/office/word/2015/wordml/symex" xmlns:wpg="http://schemas.microsoft.com/office/word/2010/wordprocessingGroup" xmlns:wpi="http://schemas.microsoft.com/office/word/2010/wordprocessingInk" xmlns:wne="http://schemas.microsoft.com/office/word/2006/wordml" xmlns:wps="http://schemas.microsoft.com/office/word/2010/wordprocessingShape" mc:Ignorable="w14 w15 w16se w16cid w16 w16cex w16sdtdh w16sdtfl w16du wp14">
+<w:ftr xmlns:wpc="http://schemas.microsoft.com/office/word/2010/wordprocessingCanvas" xmlns:cx="http://schemas.microsoft.com/office/drawing/2014/chartex" xmlns:cx1="http://schemas.microsoft.com/office/drawing/2015/9/8/chartex" xmlns:cx2="http://schemas.microsoft.com/office/drawing/2015/10/21/chartex" xmlns:cx3="http://schemas.microsoft.com/office/drawing/2016/5/9/chartex" xmlns:cx4="http://schemas.microsoft.com/office/drawing/2016/5/10/chartex" xmlns:cx5="http://schemas.microsoft.com/office/drawing/2016/5/11/chartex" xmlns:cx6="http://schemas.microsoft.com/office/drawing/2016/5/12/chartex" xmlns:cx7="http://schemas.microsoft.com/office/drawing/2016/5/13/chartex" xmlns:cx8="http://schemas.microsoft.com/office/drawing/2016/5/14/chartex" xmlns:mc="http://schemas.openxmlformats.org/markup-compatibility/2006" xmlns:aink="http://schemas.microsoft.com/office/drawing/2016/ink" xmlns:am3d="http://schemas.microsoft.com/office/drawing/2017/model3d" xmlns:o="urn:schemas-microsoft-com:office:office" xmlns:oel="http://schemas.microsoft.com/office/2019/extlst" xmlns:r="http://schemas.openxmlformats.org/officeDocument/2006/relationships" xmlns:m="http://schemas.openxmlformats.org/officeDocument/2006/math" xmlns:v="urn:schemas-microsoft-com:vml" xmlns:wp14="http://schemas.microsoft.com/office/word/2010/wordprocessingDrawing" xmlns:wp="http://schemas.openxmlformats.org/drawingml/2006/wordprocessingDrawing" xmlns:w10="urn:schemas-microsoft-com:office:word" xmlns:w="http://schemas.openxmlformats.org/wordprocessingml/2006/main" xmlns:w14="http://schemas.microsoft.com/office/word/2010/wordml" xmlns:w15="http://schemas.microsoft.com/office/word/2012/wordml" xmlns:w16cex="http://schemas.microsoft.com/office/word/2018/wordml/cex" xmlns:w16cid="http://schemas.microsoft.com/office/word/2016/wordml/cid" xmlns:w16="http://schemas.microsoft.com/office/word/2018/wordml" xmlns:w16du="http://schemas.microsoft.com/office/word/2023/wordml/word16du" xmlns:w16sdtdh="http://schemas.microsoft.com/office/word/2020/wordml/sdtdatahash" xmlns:w16sdtfl="http://schemas.microsoft.com/office/word/2024/wordml/sdtformatlock" xmlns:w16se="http://schemas.microsoft.com/office/word/2015/wordml/symex" xmlns:wpg="http://schemas.microsoft.com/office/word/2010/wordprocessingGroup" xmlns:wpi="http://schemas.microsoft.com/office/word/2010/wordprocessingInk" xmlns:wne="http://schemas.microsoft.com/office/word/2006/wordml" xmlns:wps="http://schemas.microsoft.com/office/word/2010/wordprocessingShape" mc:Ignorable="w14 w15 w16se w16cid w16 w16cex w16sdtdh w16sdtfl w16du wp14">
   <w:p>
     <w:pPr>
       <w:pStyle w:val="Piedepgina"/>
@@ -6150,7 +6220,7 @@
         <w:color w:val="5F6B78"/>
         <w:sz w:val="17"/>
       </w:rPr>
-      <w:t>24 de agosto de 2026</w:t>
+      <w:t>25 de agosto de 2026</w:t>
     </w:r>
     <w:r>
       <w:rPr>
@@ -6199,7 +6269,7 @@
 </file>
 
 <file path=word/footer3.xml><?xml version="1.0" encoding="utf-8"?>
-<w:ftr xmlns:wpc="http://schemas.microsoft.com/office/word/2010/wordprocessingCanvas" xmlns:cx="http://schemas.microsoft.com/office/drawing/2014/chartex" xmlns:cx1="http://schemas.microsoft.com/office/drawing/2015/9/8/chartex" xmlns:cx2="http://schemas.microsoft.com/office/drawing/2015/10/21/chartex" xmlns:cx3="http://schemas.microsoft.com/office/drawing/2016/5/9/chartex" xmlns:cx4="http://schemas.microsoft.com/office/drawing/2016/5/10/chartex" xmlns:cx5="http://schemas.microsoft.com/office/drawing/2016/5/11/chartex" xmlns:cx6="http://schemas.microsoft.com/office/drawing/2016/5/12/chartex" xmlns:cx7="http://schemas.microsoft.com/office/drawing/2016/5/13/chartex" xmlns:cx8="http://schemas.microsoft.com/office/drawing/2016/5/14/chartex" xmlns:mc="http://schemas.openxmlformats.org/markup-compatibility/2006" xmlns:aink="http://schemas.microsoft.com/office/drawing/2016/ink" xmlns:am3d="http://schemas.microsoft.com/office/drawing/2017/model3d" xmlns:o="urn:schemas-microsoft-com:office:office" xmlns:oel="http://schemas.microsoft.com/office/2019/extlst" xmlns:r="http://schemas.openxmlformats.org/officeDocument/2006/relationships" xmlns:m="http://schemas.openxmlformats.org/officeDocument/2006/math" xmlns:v="urn:schemas-microsoft-com:vml" xmlns:wp14="http://schemas.microsoft.com/office/word/2010/wordprocessingDrawing" xmlns:wp="http://schemas.openxmlformats.org/drawingml/2006/wordprocessingDrawing" xmlns:w10="urn:schemas-microsoft-com:office:word" xmlns:w="http://schemas.openxmlformats.org/wordprocessingml/2006/main" xmlns:w14="http://schemas.microsoft.com/office/word/2010/wordml" xmlns:w15="http://schemas.microsoft.com/office/word/2012/wordml" xmlns:w16cei="http://schemas.microsoft.com/office/word/2026/wordml/cei" xmlns:w16cex="http://schemas.microsoft.com/office/word/2018/wordml/cex" xmlns:w16cid="http://schemas.microsoft.com/office/word/2016/wordml/cid" xmlns:w16="http://schemas.microsoft.com/office/word/2018/wordml" xmlns:w16du="http://schemas.microsoft.com/office/word/2023/wordml/word16du" xmlns:w16sdtdh="http://schemas.microsoft.com/office/word/2020/wordml/sdtdatahash" xmlns:w16sdtfl="http://schemas.microsoft.com/office/word/2024/wordml/sdtformatlock" xmlns:w16se="http://schemas.microsoft.com/office/word/2015/wordml/symex" xmlns:wpg="http://schemas.microsoft.com/office/word/2010/wordprocessingGroup" xmlns:wpi="http://schemas.microsoft.com/office/word/2010/wordprocessingInk" xmlns:wne="http://schemas.microsoft.com/office/word/2006/wordml" xmlns:wps="http://schemas.microsoft.com/office/word/2010/wordprocessingShape" mc:Ignorable="w14 w15 w16se w16cid w16 w16cex w16sdtdh w16sdtfl w16du wp14">
+<w:ftr xmlns:wpc="http://schemas.microsoft.com/office/word/2010/wordprocessingCanvas" xmlns:cx="http://schemas.microsoft.com/office/drawing/2014/chartex" xmlns:cx1="http://schemas.microsoft.com/office/drawing/2015/9/8/chartex" xmlns:cx2="http://schemas.microsoft.com/office/drawing/2015/10/21/chartex" xmlns:cx3="http://schemas.microsoft.com/office/drawing/2016/5/9/chartex" xmlns:cx4="http://schemas.microsoft.com/office/drawing/2016/5/10/chartex" xmlns:cx5="http://schemas.microsoft.com/office/drawing/2016/5/11/chartex" xmlns:cx6="http://schemas.microsoft.com/office/drawing/2016/5/12/chartex" xmlns:cx7="http://schemas.microsoft.com/office/drawing/2016/5/13/chartex" xmlns:cx8="http://schemas.microsoft.com/office/drawing/2016/5/14/chartex" xmlns:mc="http://schemas.openxmlformats.org/markup-compatibility/2006" xmlns:aink="http://schemas.microsoft.com/office/drawing/2016/ink" xmlns:am3d="http://schemas.microsoft.com/office/drawing/2017/model3d" xmlns:o="urn:schemas-microsoft-com:office:office" xmlns:oel="http://schemas.microsoft.com/office/2019/extlst" xmlns:r="http://schemas.openxmlformats.org/officeDocument/2006/relationships" xmlns:m="http://schemas.openxmlformats.org/officeDocument/2006/math" xmlns:v="urn:schemas-microsoft-com:vml" xmlns:wp14="http://schemas.microsoft.com/office/word/2010/wordprocessingDrawing" xmlns:wp="http://schemas.openxmlformats.org/drawingml/2006/wordprocessingDrawing" xmlns:w10="urn:schemas-microsoft-com:office:word" xmlns:w="http://schemas.openxmlformats.org/wordprocessingml/2006/main" xmlns:w14="http://schemas.microsoft.com/office/word/2010/wordml" xmlns:w15="http://schemas.microsoft.com/office/word/2012/wordml" xmlns:w16cex="http://schemas.microsoft.com/office/word/2018/wordml/cex" xmlns:w16cid="http://schemas.microsoft.com/office/word/2016/wordml/cid" xmlns:w16="http://schemas.microsoft.com/office/word/2018/wordml" xmlns:w16du="http://schemas.microsoft.com/office/word/2023/wordml/word16du" xmlns:w16sdtdh="http://schemas.microsoft.com/office/word/2020/wordml/sdtdatahash" xmlns:w16sdtfl="http://schemas.microsoft.com/office/word/2024/wordml/sdtformatlock" xmlns:w16se="http://schemas.microsoft.com/office/word/2015/wordml/symex" xmlns:wpg="http://schemas.microsoft.com/office/word/2010/wordprocessingGroup" xmlns:wpi="http://schemas.microsoft.com/office/word/2010/wordprocessingInk" xmlns:wne="http://schemas.microsoft.com/office/word/2006/wordml" xmlns:wps="http://schemas.microsoft.com/office/word/2010/wordprocessingShape" mc:Ignorable="w14 w15 w16se w16cid w16 w16cex w16sdtdh w16sdtfl w16du wp14">
   <w:p>
     <w:pPr>
       <w:pStyle w:val="Piedepgina"/>
@@ -6209,7 +6279,7 @@
 </file>
 
 <file path=word/footnotes.xml><?xml version="1.0" encoding="utf-8"?>
-<w:footnotes xmlns:wpc="http://schemas.microsoft.com/office/word/2010/wordprocessingCanvas" xmlns:cx="http://schemas.microsoft.com/office/drawing/2014/chartex" xmlns:cx1="http://schemas.microsoft.com/office/drawing/2015/9/8/chartex" xmlns:cx2="http://schemas.microsoft.com/office/drawing/2015/10/21/chartex" xmlns:cx3="http://schemas.microsoft.com/office/drawing/2016/5/9/chartex" xmlns:cx4="http://schemas.microsoft.com/office/drawing/2016/5/10/chartex" xmlns:cx5="http://schemas.microsoft.com/office/drawing/2016/5/11/chartex" xmlns:cx6="http://schemas.microsoft.com/office/drawing/2016/5/12/chartex" xmlns:cx7="http://schemas.microsoft.com/office/drawing/2016/5/13/chartex" xmlns:cx8="http://schemas.microsoft.com/office/drawing/2016/5/14/chartex" xmlns:mc="http://schemas.openxmlformats.org/markup-compatibility/2006" xmlns:aink="http://schemas.microsoft.com/office/drawing/2016/ink" xmlns:am3d="http://schemas.microsoft.com/office/drawing/2017/model3d" xmlns:o="urn:schemas-microsoft-com:office:office" xmlns:oel="http://schemas.microsoft.com/office/2019/extlst" xmlns:r="http://schemas.openxmlformats.org/officeDocument/2006/relationships" xmlns:m="http://schemas.openxmlformats.org/officeDocument/2006/math" xmlns:v="urn:schemas-microsoft-com:vml" xmlns:wp14="http://schemas.microsoft.com/office/word/2010/wordprocessingDrawing" xmlns:wp="http://schemas.openxmlformats.org/drawingml/2006/wordprocessingDrawing" xmlns:w10="urn:schemas-microsoft-com:office:word" xmlns:w="http://schemas.openxmlformats.org/wordprocessingml/2006/main" xmlns:w14="http://schemas.microsoft.com/office/word/2010/wordml" xmlns:w15="http://schemas.microsoft.com/office/word/2012/wordml" xmlns:w16cei="http://schemas.microsoft.com/office/word/2026/wordml/cei" xmlns:w16cex="http://schemas.microsoft.com/office/word/2018/wordml/cex" xmlns:w16cid="http://schemas.microsoft.com/office/word/2016/wordml/cid" xmlns:w16="http://schemas.microsoft.com/office/word/2018/wordml" xmlns:w16du="http://schemas.microsoft.com/office/word/2023/wordml/word16du" xmlns:w16sdtdh="http://schemas.microsoft.com/office/word/2020/wordml/sdtdatahash" xmlns:w16sdtfl="http://schemas.microsoft.com/office/word/2024/wordml/sdtformatlock" xmlns:w16se="http://schemas.microsoft.com/office/word/2015/wordml/symex" xmlns:wpg="http://schemas.microsoft.com/office/word/2010/wordprocessingGroup" xmlns:wpi="http://schemas.microsoft.com/office/word/2010/wordprocessingInk" xmlns:wne="http://schemas.microsoft.com/office/word/2006/wordml" xmlns:wps="http://schemas.microsoft.com/office/word/2010/wordprocessingShape" mc:Ignorable="w14 w15 w16se w16cid w16 w16cex w16sdtdh w16sdtfl w16du wp14">
+<w:footnotes xmlns:wpc="http://schemas.microsoft.com/office/word/2010/wordprocessingCanvas" xmlns:cx="http://schemas.microsoft.com/office/drawing/2014/chartex" xmlns:cx1="http://schemas.microsoft.com/office/drawing/2015/9/8/chartex" xmlns:cx2="http://schemas.microsoft.com/office/drawing/2015/10/21/chartex" xmlns:cx3="http://schemas.microsoft.com/office/drawing/2016/5/9/chartex" xmlns:cx4="http://schemas.microsoft.com/office/drawing/2016/5/10/chartex" xmlns:cx5="http://schemas.microsoft.com/office/drawing/2016/5/11/chartex" xmlns:cx6="http://schemas.microsoft.com/office/drawing/2016/5/12/chartex" xmlns:cx7="http://schemas.microsoft.com/office/drawing/2016/5/13/chartex" xmlns:cx8="http://schemas.microsoft.com/office/drawing/2016/5/14/chartex" xmlns:mc="http://schemas.openxmlformats.org/markup-compatibility/2006" xmlns:aink="http://schemas.microsoft.com/office/drawing/2016/ink" xmlns:am3d="http://schemas.microsoft.com/office/drawing/2017/model3d" xmlns:o="urn:schemas-microsoft-com:office:office" xmlns:oel="http://schemas.microsoft.com/office/2019/extlst" xmlns:r="http://schemas.openxmlformats.org/officeDocument/2006/relationships" xmlns:m="http://schemas.openxmlformats.org/officeDocument/2006/math" xmlns:v="urn:schemas-microsoft-com:vml" xmlns:wp14="http://schemas.microsoft.com/office/word/2010/wordprocessingDrawing" xmlns:wp="http://schemas.openxmlformats.org/drawingml/2006/wordprocessingDrawing" xmlns:w10="urn:schemas-microsoft-com:office:word" xmlns:w="http://schemas.openxmlformats.org/wordprocessingml/2006/main" xmlns:w14="http://schemas.microsoft.com/office/word/2010/wordml" xmlns:w15="http://schemas.microsoft.com/office/word/2012/wordml" xmlns:w16cex="http://schemas.microsoft.com/office/word/2018/wordml/cex" xmlns:w16cid="http://schemas.microsoft.com/office/word/2016/wordml/cid" xmlns:w16="http://schemas.microsoft.com/office/word/2018/wordml" xmlns:w16du="http://schemas.microsoft.com/office/word/2023/wordml/word16du" xmlns:w16sdtdh="http://schemas.microsoft.com/office/word/2020/wordml/sdtdatahash" xmlns:w16sdtfl="http://schemas.microsoft.com/office/word/2024/wordml/sdtformatlock" xmlns:w16se="http://schemas.microsoft.com/office/word/2015/wordml/symex" xmlns:wpg="http://schemas.microsoft.com/office/word/2010/wordprocessingGroup" xmlns:wpi="http://schemas.microsoft.com/office/word/2010/wordprocessingInk" xmlns:wne="http://schemas.microsoft.com/office/word/2006/wordml" xmlns:wps="http://schemas.microsoft.com/office/word/2010/wordprocessingShape" mc:Ignorable="w14 w15 w16se w16cid w16 w16cex w16sdtdh w16sdtfl w16du wp14">
   <w:footnote w:type="separator" w:id="-1">
     <w:p>
       <w:pPr>
@@ -6234,7 +6304,7 @@
 </file>
 
 <file path=word/header1.xml><?xml version="1.0" encoding="utf-8"?>
-<w:hdr xmlns:wpc="http://schemas.microsoft.com/office/word/2010/wordprocessingCanvas" xmlns:cx="http://schemas.microsoft.com/office/drawing/2014/chartex" xmlns:cx1="http://schemas.microsoft.com/office/drawing/2015/9/8/chartex" xmlns:cx2="http://schemas.microsoft.com/office/drawing/2015/10/21/chartex" xmlns:cx3="http://schemas.microsoft.com/office/drawing/2016/5/9/chartex" xmlns:cx4="http://schemas.microsoft.com/office/drawing/2016/5/10/chartex" xmlns:cx5="http://schemas.microsoft.com/office/drawing/2016/5/11/chartex" xmlns:cx6="http://schemas.microsoft.com/office/drawing/2016/5/12/chartex" xmlns:cx7="http://schemas.microsoft.com/office/drawing/2016/5/13/chartex" xmlns:cx8="http://schemas.microsoft.com/office/drawing/2016/5/14/chartex" xmlns:mc="http://schemas.openxmlformats.org/markup-compatibility/2006" xmlns:aink="http://schemas.microsoft.com/office/drawing/2016/ink" xmlns:am3d="http://schemas.microsoft.com/office/drawing/2017/model3d" xmlns:o="urn:schemas-microsoft-com:office:office" xmlns:oel="http://schemas.microsoft.com/office/2019/extlst" xmlns:r="http://schemas.openxmlformats.org/officeDocument/2006/relationships" xmlns:m="http://schemas.openxmlformats.org/officeDocument/2006/math" xmlns:v="urn:schemas-microsoft-com:vml" xmlns:wp14="http://schemas.microsoft.com/office/word/2010/wordprocessingDrawing" xmlns:wp="http://schemas.openxmlformats.org/drawingml/2006/wordprocessingDrawing" xmlns:w10="urn:schemas-microsoft-com:office:word" xmlns:w="http://schemas.openxmlformats.org/wordprocessingml/2006/main" xmlns:w14="http://schemas.microsoft.com/office/word/2010/wordml" xmlns:w15="http://schemas.microsoft.com/office/word/2012/wordml" xmlns:w16cei="http://schemas.microsoft.com/office/word/2026/wordml/cei" xmlns:w16cex="http://schemas.microsoft.com/office/word/2018/wordml/cex" xmlns:w16cid="http://schemas.microsoft.com/office/word/2016/wordml/cid" xmlns:w16="http://schemas.microsoft.com/office/word/2018/wordml" xmlns:w16du="http://schemas.microsoft.com/office/word/2023/wordml/word16du" xmlns:w16sdtdh="http://schemas.microsoft.com/office/word/2020/wordml/sdtdatahash" xmlns:w16sdtfl="http://schemas.microsoft.com/office/word/2024/wordml/sdtformatlock" xmlns:w16se="http://schemas.microsoft.com/office/word/2015/wordml/symex" xmlns:wpg="http://schemas.microsoft.com/office/word/2010/wordprocessingGroup" xmlns:wpi="http://schemas.microsoft.com/office/word/2010/wordprocessingInk" xmlns:wne="http://schemas.microsoft.com/office/word/2006/wordml" xmlns:wps="http://schemas.microsoft.com/office/word/2010/wordprocessingShape" mc:Ignorable="w14 w15 w16se w16cid w16 w16cex w16sdtdh w16sdtfl w16du wp14">
+<w:hdr xmlns:wpc="http://schemas.microsoft.com/office/word/2010/wordprocessingCanvas" xmlns:cx="http://schemas.microsoft.com/office/drawing/2014/chartex" xmlns:cx1="http://schemas.microsoft.com/office/drawing/2015/9/8/chartex" xmlns:cx2="http://schemas.microsoft.com/office/drawing/2015/10/21/chartex" xmlns:cx3="http://schemas.microsoft.com/office/drawing/2016/5/9/chartex" xmlns:cx4="http://schemas.microsoft.com/office/drawing/2016/5/10/chartex" xmlns:cx5="http://schemas.microsoft.com/office/drawing/2016/5/11/chartex" xmlns:cx6="http://schemas.microsoft.com/office/drawing/2016/5/12/chartex" xmlns:cx7="http://schemas.microsoft.com/office/drawing/2016/5/13/chartex" xmlns:cx8="http://schemas.microsoft.com/office/drawing/2016/5/14/chartex" xmlns:mc="http://schemas.openxmlformats.org/markup-compatibility/2006" xmlns:aink="http://schemas.microsoft.com/office/drawing/2016/ink" xmlns:am3d="http://schemas.microsoft.com/office/drawing/2017/model3d" xmlns:o="urn:schemas-microsoft-com:office:office" xmlns:oel="http://schemas.microsoft.com/office/2019/extlst" xmlns:r="http://schemas.openxmlformats.org/officeDocument/2006/relationships" xmlns:m="http://schemas.openxmlformats.org/officeDocument/2006/math" xmlns:v="urn:schemas-microsoft-com:vml" xmlns:wp14="http://schemas.microsoft.com/office/word/2010/wordprocessingDrawing" xmlns:wp="http://schemas.openxmlformats.org/drawingml/2006/wordprocessingDrawing" xmlns:w10="urn:schemas-microsoft-com:office:word" xmlns:w="http://schemas.openxmlformats.org/wordprocessingml/2006/main" xmlns:w14="http://schemas.microsoft.com/office/word/2010/wordml" xmlns:w15="http://schemas.microsoft.com/office/word/2012/wordml" xmlns:w16cex="http://schemas.microsoft.com/office/word/2018/wordml/cex" xmlns:w16cid="http://schemas.microsoft.com/office/word/2016/wordml/cid" xmlns:w16="http://schemas.microsoft.com/office/word/2018/wordml" xmlns:w16du="http://schemas.microsoft.com/office/word/2023/wordml/word16du" xmlns:w16sdtdh="http://schemas.microsoft.com/office/word/2020/wordml/sdtdatahash" xmlns:w16sdtfl="http://schemas.microsoft.com/office/word/2024/wordml/sdtformatlock" xmlns:w16se="http://schemas.microsoft.com/office/word/2015/wordml/symex" xmlns:wpg="http://schemas.microsoft.com/office/word/2010/wordprocessingGroup" xmlns:wpi="http://schemas.microsoft.com/office/word/2010/wordprocessingInk" xmlns:wne="http://schemas.microsoft.com/office/word/2006/wordml" xmlns:wps="http://schemas.microsoft.com/office/word/2010/wordprocessingShape" mc:Ignorable="w14 w15 w16se w16cid w16 w16cex w16sdtdh w16sdtfl w16du wp14">
   <w:p>
     <w:pPr>
       <w:pStyle w:val="Encabezado"/>
@@ -6244,7 +6314,7 @@
 </file>
 
 <file path=word/header2.xml><?xml version="1.0" encoding="utf-8"?>
-<w:hdr xmlns:wpc="http://schemas.microsoft.com/office/word/2010/wordprocessingCanvas" xmlns:cx="http://schemas.microsoft.com/office/drawing/2014/chartex" xmlns:cx1="http://schemas.microsoft.com/office/drawing/2015/9/8/chartex" xmlns:cx2="http://schemas.microsoft.com/office/drawing/2015/10/21/chartex" xmlns:cx3="http://schemas.microsoft.com/office/drawing/2016/5/9/chartex" xmlns:cx4="http://schemas.microsoft.com/office/drawing/2016/5/10/chartex" xmlns:cx5="http://schemas.microsoft.com/office/drawing/2016/5/11/chartex" xmlns:cx6="http://schemas.microsoft.com/office/drawing/2016/5/12/chartex" xmlns:cx7="http://schemas.microsoft.com/office/drawing/2016/5/13/chartex" xmlns:cx8="http://schemas.microsoft.com/office/drawing/2016/5/14/chartex" xmlns:mc="http://schemas.openxmlformats.org/markup-compatibility/2006" xmlns:aink="http://schemas.microsoft.com/office/drawing/2016/ink" xmlns:am3d="http://schemas.microsoft.com/office/drawing/2017/model3d" xmlns:o="urn:schemas-microsoft-com:office:office" xmlns:oel="http://schemas.microsoft.com/office/2019/extlst" xmlns:r="http://schemas.openxmlformats.org/officeDocument/2006/relationships" xmlns:m="http://schemas.openxmlformats.org/officeDocument/2006/math" xmlns:v="urn:schemas-microsoft-com:vml" xmlns:wp14="http://schemas.microsoft.com/office/word/2010/wordprocessingDrawing" xmlns:wp="http://schemas.openxmlformats.org/drawingml/2006/wordprocessingDrawing" xmlns:w10="urn:schemas-microsoft-com:office:word" xmlns:w="http://schemas.openxmlformats.org/wordprocessingml/2006/main" xmlns:w14="http://schemas.microsoft.com/office/word/2010/wordml" xmlns:w15="http://schemas.microsoft.com/office/word/2012/wordml" xmlns:w16cei="http://schemas.microsoft.com/office/word/2026/wordml/cei" xmlns:w16cex="http://schemas.microsoft.com/office/word/2018/wordml/cex" xmlns:w16cid="http://schemas.microsoft.com/office/word/2016/wordml/cid" xmlns:w16="http://schemas.microsoft.com/office/word/2018/wordml" xmlns:w16du="http://schemas.microsoft.com/office/word/2023/wordml/word16du" xmlns:w16sdtdh="http://schemas.microsoft.com/office/word/2020/wordml/sdtdatahash" xmlns:w16sdtfl="http://schemas.microsoft.com/office/word/2024/wordml/sdtformatlock" xmlns:w16se="http://schemas.microsoft.com/office/word/2015/wordml/symex" xmlns:wpg="http://schemas.microsoft.com/office/word/2010/wordprocessingGroup" xmlns:wpi="http://schemas.microsoft.com/office/word/2010/wordprocessingInk" xmlns:wne="http://schemas.microsoft.com/office/word/2006/wordml" xmlns:wps="http://schemas.microsoft.com/office/word/2010/wordprocessingShape" mc:Ignorable="w14 w15 w16se w16cid w16 w16cex w16sdtdh w16sdtfl w16du wp14">
+<w:hdr xmlns:wpc="http://schemas.microsoft.com/office/word/2010/wordprocessingCanvas" xmlns:cx="http://schemas.microsoft.com/office/drawing/2014/chartex" xmlns:cx1="http://schemas.microsoft.com/office/drawing/2015/9/8/chartex" xmlns:cx2="http://schemas.microsoft.com/office/drawing/2015/10/21/chartex" xmlns:cx3="http://schemas.microsoft.com/office/drawing/2016/5/9/chartex" xmlns:cx4="http://schemas.microsoft.com/office/drawing/2016/5/10/chartex" xmlns:cx5="http://schemas.microsoft.com/office/drawing/2016/5/11/chartex" xmlns:cx6="http://schemas.microsoft.com/office/drawing/2016/5/12/chartex" xmlns:cx7="http://schemas.microsoft.com/office/drawing/2016/5/13/chartex" xmlns:cx8="http://schemas.microsoft.com/office/drawing/2016/5/14/chartex" xmlns:mc="http://schemas.openxmlformats.org/markup-compatibility/2006" xmlns:aink="http://schemas.microsoft.com/office/drawing/2016/ink" xmlns:am3d="http://schemas.microsoft.com/office/drawing/2017/model3d" xmlns:o="urn:schemas-microsoft-com:office:office" xmlns:oel="http://schemas.microsoft.com/office/2019/extlst" xmlns:r="http://schemas.openxmlformats.org/officeDocument/2006/relationships" xmlns:m="http://schemas.openxmlformats.org/officeDocument/2006/math" xmlns:v="urn:schemas-microsoft-com:vml" xmlns:wp14="http://schemas.microsoft.com/office/word/2010/wordprocessingDrawing" xmlns:wp="http://schemas.openxmlformats.org/drawingml/2006/wordprocessingDrawing" xmlns:w10="urn:schemas-microsoft-com:office:word" xmlns:w="http://schemas.openxmlformats.org/wordprocessingml/2006/main" xmlns:w14="http://schemas.microsoft.com/office/word/2010/wordml" xmlns:w15="http://schemas.microsoft.com/office/word/2012/wordml" xmlns:w16cex="http://schemas.microsoft.com/office/word/2018/wordml/cex" xmlns:w16cid="http://schemas.microsoft.com/office/word/2016/wordml/cid" xmlns:w16="http://schemas.microsoft.com/office/word/2018/wordml" xmlns:w16du="http://schemas.microsoft.com/office/word/2023/wordml/word16du" xmlns:w16sdtdh="http://schemas.microsoft.com/office/word/2020/wordml/sdtdatahash" xmlns:w16sdtfl="http://schemas.microsoft.com/office/word/2024/wordml/sdtformatlock" xmlns:w16se="http://schemas.microsoft.com/office/word/2015/wordml/symex" xmlns:wpg="http://schemas.microsoft.com/office/word/2010/wordprocessingGroup" xmlns:wpi="http://schemas.microsoft.com/office/word/2010/wordprocessingInk" xmlns:wne="http://schemas.microsoft.com/office/word/2006/wordml" xmlns:wps="http://schemas.microsoft.com/office/word/2010/wordprocessingShape" mc:Ignorable="w14 w15 w16se w16cid w16 w16cex w16sdtdh w16sdtfl w16du wp14">
   <w:p>
     <w:pPr>
       <w:pStyle w:val="Encabezado"/>
@@ -6266,7 +6336,7 @@
 </file>
 
 <file path=word/header3.xml><?xml version="1.0" encoding="utf-8"?>
-<w:hdr xmlns:wpc="http://schemas.microsoft.com/office/word/2010/wordprocessingCanvas" xmlns:cx="http://schemas.microsoft.com/office/drawing/2014/chartex" xmlns:cx1="http://schemas.microsoft.com/office/drawing/2015/9/8/chartex" xmlns:cx2="http://schemas.microsoft.com/office/drawing/2015/10/21/chartex" xmlns:cx3="http://schemas.microsoft.com/office/drawing/2016/5/9/chartex" xmlns:cx4="http://schemas.microsoft.com/office/drawing/2016/5/10/chartex" xmlns:cx5="http://schemas.microsoft.com/office/drawing/2016/5/11/chartex" xmlns:cx6="http://schemas.microsoft.com/office/drawing/2016/5/12/chartex" xmlns:cx7="http://schemas.microsoft.com/office/drawing/2016/5/13/chartex" xmlns:cx8="http://schemas.microsoft.com/office/drawing/2016/5/14/chartex" xmlns:mc="http://schemas.openxmlformats.org/markup-compatibility/2006" xmlns:aink="http://schemas.microsoft.com/office/drawing/2016/ink" xmlns:am3d="http://schemas.microsoft.com/office/drawing/2017/model3d" xmlns:o="urn:schemas-microsoft-com:office:office" xmlns:oel="http://schemas.microsoft.com/office/2019/extlst" xmlns:r="http://schemas.openxmlformats.org/officeDocument/2006/relationships" xmlns:m="http://schemas.openxmlformats.org/officeDocument/2006/math" xmlns:v="urn:schemas-microsoft-com:vml" xmlns:wp14="http://schemas.microsoft.com/office/word/2010/wordprocessingDrawing" xmlns:wp="http://schemas.openxmlformats.org/drawingml/2006/wordprocessingDrawing" xmlns:w10="urn:schemas-microsoft-com:office:word" xmlns:w="http://schemas.openxmlformats.org/wordprocessingml/2006/main" xmlns:w14="http://schemas.microsoft.com/office/word/2010/wordml" xmlns:w15="http://schemas.microsoft.com/office/word/2012/wordml" xmlns:w16cei="http://schemas.microsoft.com/office/word/2026/wordml/cei" xmlns:w16cex="http://schemas.microsoft.com/office/word/2018/wordml/cex" xmlns:w16cid="http://schemas.microsoft.com/office/word/2016/wordml/cid" xmlns:w16="http://schemas.microsoft.com/office/word/2018/wordml" xmlns:w16du="http://schemas.microsoft.com/office/word/2023/wordml/word16du" xmlns:w16sdtdh="http://schemas.microsoft.com/office/word/2020/wordml/sdtdatahash" xmlns:w16sdtfl="http://schemas.microsoft.com/office/word/2024/wordml/sdtformatlock" xmlns:w16se="http://schemas.microsoft.com/office/word/2015/wordml/symex" xmlns:wpg="http://schemas.microsoft.com/office/word/2010/wordprocessingGroup" xmlns:wpi="http://schemas.microsoft.com/office/word/2010/wordprocessingInk" xmlns:wne="http://schemas.microsoft.com/office/word/2006/wordml" xmlns:wps="http://schemas.microsoft.com/office/word/2010/wordprocessingShape" mc:Ignorable="w14 w15 w16se w16cid w16 w16cex w16sdtdh w16sdtfl w16du wp14">
+<w:hdr xmlns:wpc="http://schemas.microsoft.com/office/word/2010/wordprocessingCanvas" xmlns:cx="http://schemas.microsoft.com/office/drawing/2014/chartex" xmlns:cx1="http://schemas.microsoft.com/office/drawing/2015/9/8/chartex" xmlns:cx2="http://schemas.microsoft.com/office/drawing/2015/10/21/chartex" xmlns:cx3="http://schemas.microsoft.com/office/drawing/2016/5/9/chartex" xmlns:cx4="http://schemas.microsoft.com/office/drawing/2016/5/10/chartex" xmlns:cx5="http://schemas.microsoft.com/office/drawing/2016/5/11/chartex" xmlns:cx6="http://schemas.microsoft.com/office/drawing/2016/5/12/chartex" xmlns:cx7="http://schemas.microsoft.com/office/drawing/2016/5/13/chartex" xmlns:cx8="http://schemas.microsoft.com/office/drawing/2016/5/14/chartex" xmlns:mc="http://schemas.openxmlformats.org/markup-compatibility/2006" xmlns:aink="http://schemas.microsoft.com/office/drawing/2016/ink" xmlns:am3d="http://schemas.microsoft.com/office/drawing/2017/model3d" xmlns:o="urn:schemas-microsoft-com:office:office" xmlns:oel="http://schemas.microsoft.com/office/2019/extlst" xmlns:r="http://schemas.openxmlformats.org/officeDocument/2006/relationships" xmlns:m="http://schemas.openxmlformats.org/officeDocument/2006/math" xmlns:v="urn:schemas-microsoft-com:vml" xmlns:wp14="http://schemas.microsoft.com/office/word/2010/wordprocessingDrawing" xmlns:wp="http://schemas.openxmlformats.org/drawingml/2006/wordprocessingDrawing" xmlns:w10="urn:schemas-microsoft-com:office:word" xmlns:w="http://schemas.openxmlformats.org/wordprocessingml/2006/main" xmlns:w14="http://schemas.microsoft.com/office/word/2010/wordml" xmlns:w15="http://schemas.microsoft.com/office/word/2012/wordml" xmlns:w16cex="http://schemas.microsoft.com/office/word/2018/wordml/cex" xmlns:w16cid="http://schemas.microsoft.com/office/word/2016/wordml/cid" xmlns:w16="http://schemas.microsoft.com/office/word/2018/wordml" xmlns:w16du="http://schemas.microsoft.com/office/word/2023/wordml/word16du" xmlns:w16sdtdh="http://schemas.microsoft.com/office/word/2020/wordml/sdtdatahash" xmlns:w16sdtfl="http://schemas.microsoft.com/office/word/2024/wordml/sdtformatlock" xmlns:w16se="http://schemas.microsoft.com/office/word/2015/wordml/symex" xmlns:wpg="http://schemas.microsoft.com/office/word/2010/wordprocessingGroup" xmlns:wpi="http://schemas.microsoft.com/office/word/2010/wordprocessingInk" xmlns:wne="http://schemas.microsoft.com/office/word/2006/wordml" xmlns:wps="http://schemas.microsoft.com/office/word/2010/wordprocessingShape" mc:Ignorable="w14 w15 w16se w16cid w16 w16cex w16sdtdh w16sdtfl w16du wp14">
   <w:p>
     <w:pPr>
       <w:pStyle w:val="Encabezado"/>
@@ -6276,7 +6346,7 @@
 </file>
 
 <file path=word/numbering.xml><?xml version="1.0" encoding="utf-8"?>
-<w:numbering xmlns:wpc="http://schemas.microsoft.com/office/word/2010/wordprocessingCanvas" xmlns:cx="http://schemas.microsoft.com/office/drawing/2014/chartex" xmlns:cx1="http://schemas.microsoft.com/office/drawing/2015/9/8/chartex" xmlns:cx2="http://schemas.microsoft.com/office/drawing/2015/10/21/chartex" xmlns:cx3="http://schemas.microsoft.com/office/drawing/2016/5/9/chartex" xmlns:cx4="http://schemas.microsoft.com/office/drawing/2016/5/10/chartex" xmlns:cx5="http://schemas.microsoft.com/office/drawing/2016/5/11/chartex" xmlns:cx6="http://schemas.microsoft.com/office/drawing/2016/5/12/chartex" xmlns:cx7="http://schemas.microsoft.com/office/drawing/2016/5/13/chartex" xmlns:cx8="http://schemas.microsoft.com/office/drawing/2016/5/14/chartex" xmlns:mc="http://schemas.openxmlformats.org/markup-compatibility/2006" xmlns:aink="http://schemas.microsoft.com/office/drawing/2016/ink" xmlns:am3d="http://schemas.microsoft.com/office/drawing/2017/model3d" xmlns:o="urn:schemas-microsoft-com:office:office" xmlns:oel="http://schemas.microsoft.com/office/2019/extlst" xmlns:r="http://schemas.openxmlformats.org/officeDocument/2006/relationships" xmlns:m="http://schemas.openxmlformats.org/officeDocument/2006/math" xmlns:v="urn:schemas-microsoft-com:vml" xmlns:wp14="http://schemas.microsoft.com/office/word/2010/wordprocessingDrawing" xmlns:wp="http://schemas.openxmlformats.org/drawingml/2006/wordprocessingDrawing" xmlns:w10="urn:schemas-microsoft-com:office:word" xmlns:w="http://schemas.openxmlformats.org/wordprocessingml/2006/main" xmlns:w14="http://schemas.microsoft.com/office/word/2010/wordml" xmlns:w15="http://schemas.microsoft.com/office/word/2012/wordml" xmlns:w16cei="http://schemas.microsoft.com/office/word/2026/wordml/cei" xmlns:w16cex="http://schemas.microsoft.com/office/word/2018/wordml/cex" xmlns:w16cid="http://schemas.microsoft.com/office/word/2016/wordml/cid" xmlns:w16="http://schemas.microsoft.com/office/word/2018/wordml" xmlns:w16du="http://schemas.microsoft.com/office/word/2023/wordml/word16du" xmlns:w16sdtdh="http://schemas.microsoft.com/office/word/2020/wordml/sdtdatahash" xmlns:w16sdtfl="http://schemas.microsoft.com/office/word/2024/wordml/sdtformatlock" xmlns:w16se="http://schemas.microsoft.com/office/word/2015/wordml/symex" xmlns:wpg="http://schemas.microsoft.com/office/word/2010/wordprocessingGroup" xmlns:wpi="http://schemas.microsoft.com/office/word/2010/wordprocessingInk" xmlns:wne="http://schemas.microsoft.com/office/word/2006/wordml" xmlns:wps="http://schemas.microsoft.com/office/word/2010/wordprocessingShape" mc:Ignorable="w14 w15 w16se w16cid w16 w16cex w16sdtdh w16sdtfl w16du wp14">
+<w:numbering xmlns:wpc="http://schemas.microsoft.com/office/word/2010/wordprocessingCanvas" xmlns:cx="http://schemas.microsoft.com/office/drawing/2014/chartex" xmlns:cx1="http://schemas.microsoft.com/office/drawing/2015/9/8/chartex" xmlns:cx2="http://schemas.microsoft.com/office/drawing/2015/10/21/chartex" xmlns:cx3="http://schemas.microsoft.com/office/drawing/2016/5/9/chartex" xmlns:cx4="http://schemas.microsoft.com/office/drawing/2016/5/10/chartex" xmlns:cx5="http://schemas.microsoft.com/office/drawing/2016/5/11/chartex" xmlns:cx6="http://schemas.microsoft.com/office/drawing/2016/5/12/chartex" xmlns:cx7="http://schemas.microsoft.com/office/drawing/2016/5/13/chartex" xmlns:cx8="http://schemas.microsoft.com/office/drawing/2016/5/14/chartex" xmlns:mc="http://schemas.openxmlformats.org/markup-compatibility/2006" xmlns:aink="http://schemas.microsoft.com/office/drawing/2016/ink" xmlns:am3d="http://schemas.microsoft.com/office/drawing/2017/model3d" xmlns:o="urn:schemas-microsoft-com:office:office" xmlns:oel="http://schemas.microsoft.com/office/2019/extlst" xmlns:r="http://schemas.openxmlformats.org/officeDocument/2006/relationships" xmlns:m="http://schemas.openxmlformats.org/officeDocument/2006/math" xmlns:v="urn:schemas-microsoft-com:vml" xmlns:wp14="http://schemas.microsoft.com/office/word/2010/wordprocessingDrawing" xmlns:wp="http://schemas.openxmlformats.org/drawingml/2006/wordprocessingDrawing" xmlns:w10="urn:schemas-microsoft-com:office:word" xmlns:w="http://schemas.openxmlformats.org/wordprocessingml/2006/main" xmlns:w14="http://schemas.microsoft.com/office/word/2010/wordml" xmlns:w15="http://schemas.microsoft.com/office/word/2012/wordml" xmlns:w16cex="http://schemas.microsoft.com/office/word/2018/wordml/cex" xmlns:w16cid="http://schemas.microsoft.com/office/word/2016/wordml/cid" xmlns:w16="http://schemas.microsoft.com/office/word/2018/wordml" xmlns:w16du="http://schemas.microsoft.com/office/word/2023/wordml/word16du" xmlns:w16sdtdh="http://schemas.microsoft.com/office/word/2020/wordml/sdtdatahash" xmlns:w16sdtfl="http://schemas.microsoft.com/office/word/2024/wordml/sdtformatlock" xmlns:w16se="http://schemas.microsoft.com/office/word/2015/wordml/symex" xmlns:wpg="http://schemas.microsoft.com/office/word/2010/wordprocessingGroup" xmlns:wpi="http://schemas.microsoft.com/office/word/2010/wordprocessingInk" xmlns:wne="http://schemas.microsoft.com/office/word/2006/wordml" xmlns:wps="http://schemas.microsoft.com/office/word/2010/wordprocessingShape" mc:Ignorable="w14 w15 w16se w16cid w16 w16cex w16sdtdh w16sdtfl w16du wp14">
   <w:abstractNum w:abstractNumId="0" w15:restartNumberingAfterBreak="0">
     <w:nsid w:val="FFFFFF7C"/>
     <w:multiLevelType w:val="singleLevel"/>

</xml_diff>

<commit_message>
feat: Add MinIO policies and initialization scripts for download worker
- Introduced core and worker policies for MinIO access control.
- Created init.sh script to render policies and initialize MinIO with necessary configurations.
- Added Prometheus alert rules for monitoring download worker metrics.
- Updated database schema to include new fields for download job metadata.
- Implemented ArtifactCapacity class to manage storage quotas and reservations.
- Developed HostLimitedRemoteDownloader and RetryingRemoteDownloader for managing download concurrency and retries.
- Added RabbitQueueMetrics for monitoring RabbitMQ queue depth and consumers.
- Created unit tests for ArtifactCapacity and download concurrency policies.
- Defined JSON schema for download job deferred events.
</commit_message>
<xml_diff>
--- a/docs/informes/Informe_cronologico_Batch-Downloader_2026-07-28.docx
+++ b/docs/informes/Informe_cronologico_Batch-Downloader_2026-07-28.docx
@@ -133,7 +133,7 @@
         <w:ind w:left="259" w:right="173"/>
       </w:pPr>
       <w:r>
-        <w:t>El resultado verificado en Git es un monorepo en la rama development con 152 commits visibles y HEAD 08a43bf. Desde el corte anterior se integraron tres commits. El primero incorpora el amplio trabajo antes local: separación de repositorios y workers, heartbeats y retención operativa, migraciones, semantic-migrator, contratos compartidos, carga diferida por rutas, i18n con caché y reorganización del frontend. Los dos siguientes actualizan CI y la imagen web a Node 24, corrigen contextos Docker/GHCR y activan el agente Mockito solo en los módulos que lo necesitan. Ambos Compose de HEAD enumeran ahora 17 servicios. No se ejecutaron suites, despliegue, benchmark ni aplicación completa en este informe.</w:t>
+        <w:t>El resultado verificado en Git es un monorepo en la rama development con 154 commits visibles y HEAD 9c9c48c. Desde el corte anterior se integraron dos commits: la fecha automática de actualización de las páginas legales y la ampliación del flujo de descargas con elementos manuales. El working tree contiene además una implementación local amplia de capacidad, retención, reintentos y reservas de almacenamiento, todavía no integrada ni validada como conjunto.</w:t>
       </w:r>
     </w:p>
     <w:tbl>
@@ -173,16 +173,8 @@
             <w:vAlign w:val="center"/>
           </w:tcPr>
           <w:p>
-            <w:pPr>
-              <w:jc w:val="center"/>
-            </w:pPr>
-            <w:r>
-              <w:rPr>
-                <w:b/>
-                <w:color w:val="FFFFFF"/>
-                <w:sz w:val="36"/>
-              </w:rPr>
-              <w:t>152</w:t>
+            <w:r>
+              <w:t>154</w:t>
             </w:r>
           </w:p>
         </w:tc>
@@ -3760,6 +3752,32 @@
       </w:r>
     </w:p>
     <w:p>
+      <w:pPr/>
+      <w:r>
+        <w:t>La tarea de mejora para un VPS de 8 vCore y 24 GB propuso separar resolución, descarga y empaquetado, limitar jobs y hosts, reservar espacio temporal, retener ZIPs y exponer métricas de capacidad. La implementación quedó en el working tree y la tarea terminó por límite de uso; por tanto, sus cambios, migración V14, políticas de reintento y script k6 se registran como trabajo local no verificado, no como entrega completa.</w:t>
+      </w:r>
+    </w:p>
+    <w:p>
+      <w:pPr/>
+      <w:r>
+        <w:t>El commit 9c9c48c amplió el manejo de descargas para conservar elementos manuales cuando algunas aplicaciones no tienen un instalador descargable. El cambio está integrado en Git, pero no se repitieron suites ni un recorrido de descarga sobre el checkout actual.</w:t>
+      </w:r>
+    </w:p>
+    <w:p>
+      <w:pPr/>
+      <w:r>
+        <w:t>El commit 6c227d8 añadió a Términos y Privacidad una tarjeta accesible de “Última actualización”. La fecha se obtiene automáticamente del último commit que modificó el catálogo legal, o de la modificación local como fallback; TypeScript, la prueba específica y el build de producción pasaron, con una entrada pública de 94,19 KiB gzip frente al límite de 112 KiB. Este resultado queda confirmado a nivel de frontend, sin arrancar la aplicación.</w:t>
+      </w:r>
+    </w:p>
+    <w:p>
+      <w:pPr>
+        <w:pStyle w:val="Ttulo2"/>
+      </w:pPr>
+      <w:r>
+        <w:t>25 de agosto - Descargas manuales, fecha legal y capacidad propuesta</w:t>
+      </w:r>
+    </w:p>
+    <w:p>
       <w:pPr>
         <w:pStyle w:val="Ttulo1"/>
       </w:pPr>
@@ -3775,7 +3793,7 @@
         </w:numPr>
       </w:pPr>
       <w:r>
-        <w:t>Ejecutar y documentar la prueba de carga tst/load/capacity.js sobre un entorno controlado, verificando límites de conexiones, admisión, 429/503, concurrencia, disco temporal, outbox, SSE y limpieza de MinIO. La existencia del script y de pruebas unitarias no constituye un resultado de capacidad.</w:t>
+        <w:t>Ejecutar y documentar la prueba de carga tst/load/capacity.js y validar por separado la implementación local de capacidad de descargas: admisión, reservas de disco y MinIO, reintentos, límites por host, cancelación, SSE, outbox y limpieza. La existencia del script y de cambios locales no constituye un resultado de capacidad.</w:t>
       </w:r>
     </w:p>
     <w:p>
@@ -5710,6 +5728,70 @@
           </w:p>
         </w:tc>
       </w:tr>
+      <w:tr>
+        <w:tc>
+          <w:tcPr>
+            <w:tcW w:type="dxa" w:w="1200"/>
+          </w:tcPr>
+          <w:p>
+            <w:r>
+              <w:t>25 de agosto</w:t>
+            </w:r>
+          </w:p>
+        </w:tc>
+        <w:tc>
+          <w:tcPr>
+            <w:tcW w:type="dxa" w:w="4200"/>
+          </w:tcPr>
+          <w:p>
+            <w:r>
+              <w:t>Planificar mejora de descargas</w:t>
+            </w:r>
+          </w:p>
+        </w:tc>
+        <w:tc>
+          <w:tcPr>
+            <w:tcW w:type="dxa" w:w="3960"/>
+          </w:tcPr>
+          <w:p>
+            <w:r>
+              <w:t>01a039fb-dc5d-73b3-94ee-778e811dd448</w:t>
+            </w:r>
+          </w:p>
+        </w:tc>
+      </w:tr>
+      <w:tr>
+        <w:tc>
+          <w:tcPr>
+            <w:tcW w:type="dxa" w:w="1200"/>
+          </w:tcPr>
+          <w:p>
+            <w:r>
+              <w:t>25 de agosto</w:t>
+            </w:r>
+          </w:p>
+        </w:tc>
+        <w:tc>
+          <w:tcPr>
+            <w:tcW w:type="dxa" w:w="4200"/>
+          </w:tcPr>
+          <w:p>
+            <w:r>
+              <w:t>Añadir fecha de actualización</w:t>
+            </w:r>
+          </w:p>
+        </w:tc>
+        <w:tc>
+          <w:tcPr>
+            <w:tcW w:type="dxa" w:w="3960"/>
+          </w:tcPr>
+          <w:p>
+            <w:r>
+              <w:t>01a03964-eda9-7552-a6df-aef0c3ff35e7</w:t>
+            </w:r>
+          </w:p>
+        </w:tc>
+      </w:tr>
     </w:tbl>
     <w:p>
       <w:pPr>
@@ -6152,7 +6234,7 @@
     </w:p>
     <w:p>
       <w:r>
-        <w:t>Batch-Downloader ya integra un scraper con ámbitos y evidencia de ausencia, políticas transversales mediante wrappers y una experiencia pública más precisa y accesible, además de las capacidades descritas en cortes anteriores. HEAD queda en 08a43bf con 152 commits. Los resultados desplegados y suites previas siguen siendo históricos; no prueban los tres commits recientes. Permanecen abiertos la validación focalizada de la topología integrada de 17 servicios, migraciones, heartbeats y retención; los recorridos de identidad y frontend; k6; la evaluación semántica full; la revisión visual reciente; y la sincronización/recompilación LaTeX.</w:t>
+        <w:t>Batch-Downloader ya integra un scraper con ámbitos y evidencia de ausencia, políticas transversales mediante wrappers, una experiencia pública más precisa y accesible y el flujo de descargas manuales. HEAD queda en 9c9c48c con 154 commits. La fecha automática de las páginas legales está integrada y validada con build y prueba específica. El trabajo local de capacidad y almacenamiento, aunque material, sigue pendiente de validación e integración; tampoco se afirma benchmark, despliegue ni PDF nuevo.</w:t>
       </w:r>
     </w:p>
     <w:p/>

</xml_diff>

<commit_message>
refactor: Update VSCode settings to include JVM arguments for improved performance
</commit_message>
<xml_diff>
--- a/docs/informes/Informe_cronologico_Batch-Downloader_2026-07-28.docx
+++ b/docs/informes/Informe_cronologico_Batch-Downloader_2026-07-28.docx
@@ -174,7 +174,7 @@
           </w:tcPr>
           <w:p>
             <w:r>
-              <w:t>154</w:t>
+              <w:t>160</w:t>
             </w:r>
           </w:p>
         </w:tc>
@@ -191,16 +191,7 @@
             <w:vAlign w:val="center"/>
           </w:tcPr>
           <w:p>
-            <w:pPr>
-              <w:spacing w:after="0"/>
-              <w:jc w:val="center"/>
-            </w:pPr>
-            <w:r>
-              <w:rPr>
-                <w:b/>
-                <w:color w:val="FFFFFF"/>
-                <w:sz w:val="36"/>
-              </w:rPr>
+            <w:r>
               <w:t>17</w:t>
             </w:r>
           </w:p>
@@ -218,17 +209,8 @@
             <w:vAlign w:val="center"/>
           </w:tcPr>
           <w:p>
-            <w:pPr>
-              <w:spacing w:after="0"/>
-              <w:jc w:val="center"/>
-            </w:pPr>
-            <w:r>
-              <w:rPr>
-                <w:b/>
-                <w:color w:val="FFFFFF"/>
-                <w:sz w:val="36"/>
-              </w:rPr>
-              <w:t>48</w:t>
+            <w:r>
+              <w:t>requisitos organizados como issues</w:t>
             </w:r>
           </w:p>
         </w:tc>
@@ -3779,6 +3761,38 @@
     </w:p>
     <w:p>
       <w:pPr>
+        <w:pStyle w:val="Ttulo2"/>
+      </w:pPr>
+      <w:r>
+        <w:t>26-27 de agosto - Fusión, CI reproducible y almacenamiento de descargas</w:t>
+      </w:r>
+    </w:p>
+    <w:p>
+      <w:pPr/>
+      <w:r>
+        <w:t>El desarrollo fue fusionado en origin/main mediante el PR #50. La revisión dejó cerradas 21 issues con criterios esenciales cubiertos y mantuvo abiertas 27 por requisitos explícitos aún pendientes o evidencia insuficiente. El cierre se apoyó en validaciones locales y en los workflows remotos, no en el arranque de la aplicación.</w:t>
+      </w:r>
+    </w:p>
+    <w:p>
+      <w:pPr/>
+      <w:r>
+        <w:t>El commit 52ef2ff corrigió el workflow Publish GHCR: los Dockerfiles de scraper y semantic-service pasan a resolverse desde la raíz del checkout, después de que los contextos de subdirectorio provocaran fallos de Buildx. Los dos builds corregidos completaron la comprobación y la ejecución cache-only; Quality gate y los siete jobs de publicación GHCR quedaron correctos.</w:t>
+      </w:r>
+    </w:p>
+    <w:p>
+      <w:pPr/>
+      <w:r>
+        <w:t>La integración de 3f7616a añadió políticas separadas de MinIO para Core y worker, inicialización del bucket, limpieza de subidas incompletas y alertas de descargas. El flujo conserva Core como autoridad: el worker descarga y empaqueta en servidor, MinIO almacena el ZIP y Core entrega una URL firmada; la conversación de infraestructura confirma esta decisión como arquitectura preferida, pero no constituye una prueba de capacidad.</w:t>
+      </w:r>
+    </w:p>
+    <w:p>
+      <w:pPr/>
+      <w:r>
+        <w:t>Se verificaron sin iniciar la aplicación 276 pruebas Java (1 omitida), 244 del scraper, 31 del servicio semántico y 178 del frontend, además de typecheck, build frontend, Compose, política de salud y los dos builds Docker afectados. Estos resultados son evidencia focalizada del corte; no demuestran por sí solos capacidad para 1.000 usuarios ni 50 trabajos simultáneos.</w:t>
+      </w:r>
+    </w:p>
+    <w:p>
+      <w:pPr>
         <w:pStyle w:val="Ttulo1"/>
       </w:pPr>
       <w:r>
@@ -3837,7 +3851,7 @@
         </w:numPr>
       </w:pPr>
       <w:r>
-        <w:t>Actualizar el requisito RF-03 y su issue de GitHub: todavía permiten elegir coincidencia total o mínima, decisión sustituida por tags siempre combinadas con AND y un único editor en el catálogo público. Sincronizar también README, instrucciones de agentes y memoria cuando describan el contrato de filtros.</w:t>
+        <w:t>Actualizar el requisito RF-03 y su issue de GitHub: todavía permiten elegir coincidencia total o mínima, decisión sustituida por tags siempre combinadas con AND y un único editor en el catálogo público. Sincronizar también README, instrucciones de agentes y memoria cuando describan un estado anterior.</w:t>
       </w:r>
     </w:p>
     <w:p>
@@ -5792,6 +5806,70 @@
           </w:p>
         </w:tc>
       </w:tr>
+      <w:tr>
+        <w:tc>
+          <w:tcPr>
+            <w:tcW w:type="dxa" w:w="1200"/>
+          </w:tcPr>
+          <w:p>
+            <w:r>
+              <w:t>26-08-2026</w:t>
+            </w:r>
+          </w:p>
+        </w:tc>
+        <w:tc>
+          <w:tcPr>
+            <w:tcW w:type="dxa" w:w="4200"/>
+          </w:tcPr>
+          <w:p>
+            <w:r>
+              <w:t>Optimizar servidor VPS</w:t>
+            </w:r>
+          </w:p>
+        </w:tc>
+        <w:tc>
+          <w:tcPr>
+            <w:tcW w:type="dxa" w:w="3960"/>
+          </w:tcPr>
+          <w:p>
+            <w:r>
+              <w:t>6a883c06-e634-83ed-82a2-0539f28b9eb9</w:t>
+            </w:r>
+          </w:p>
+        </w:tc>
+      </w:tr>
+      <w:tr>
+        <w:tc>
+          <w:tcPr>
+            <w:tcW w:type="dxa" w:w="1200"/>
+          </w:tcPr>
+          <w:p>
+            <w:r>
+              <w:t>26-08-2026</w:t>
+            </w:r>
+          </w:p>
+        </w:tc>
+        <w:tc>
+          <w:tcPr>
+            <w:tcW w:type="dxa" w:w="4200"/>
+          </w:tcPr>
+          <w:p>
+            <w:r>
+              <w:t>Crea PR development a main</w:t>
+            </w:r>
+          </w:p>
+        </w:tc>
+        <w:tc>
+          <w:tcPr>
+            <w:tcW w:type="dxa" w:w="3960"/>
+          </w:tcPr>
+          <w:p>
+            <w:r>
+              <w:t>01a03f19-1e6f-7c21-9c67-d4dcc5e7b70b</w:t>
+            </w:r>
+          </w:p>
+        </w:tc>
+      </w:tr>
     </w:tbl>
     <w:p>
       <w:pPr>
@@ -6218,6 +6296,28 @@
           </w:p>
         </w:tc>
       </w:tr>
+      <w:tr>
+        <w:tc>
+          <w:tcPr>
+            <w:tcW w:type="dxa" w:w="2200"/>
+          </w:tcPr>
+          <w:p>
+            <w:r>
+              <w:t>Corte 27-08-2026</w:t>
+            </w:r>
+          </w:p>
+        </w:tc>
+        <w:tc>
+          <w:tcPr>
+            <w:tcW w:type="dxa" w:w="7160"/>
+          </w:tcPr>
+          <w:p>
+            <w:r>
+              <w:t>HEAD local development 52ef2ff/160 commits; origin/main fusiona PR #50. Los workflows GHCR y Quality gate fueron correctos; las suites focalizadas registraron 276 Java, 244 scraper, 31 semánticas y 178 frontend. Compose/health/build Docker correctos; no se inició la aplicación. LaTeX sigue en 6c0649c/33 commits con cambios locales y sin PDF nuevo verificado.</w:t>
+            </w:r>
+          </w:p>
+        </w:tc>
+      </w:tr>
     </w:tbl>
     <w:p>
       <w:pPr>
@@ -6234,7 +6334,7 @@
     </w:p>
     <w:p>
       <w:r>
-        <w:t>Batch-Downloader ya integra un scraper con ámbitos y evidencia de ausencia, políticas transversales mediante wrappers, una experiencia pública más precisa y accesible y el flujo de descargas manuales. HEAD queda en 9c9c48c con 154 commits. La fecha automática de las páginas legales está integrada y validada con build y prueba específica. El trabajo local de capacidad y almacenamiento, aunque material, sigue pendiente de validación e integración; tampoco se afirma benchmark, despliegue ni PDF nuevo.</w:t>
+        <w:t>Batch-Downloader ya integra un scraper con ámbitos y evidencia de ausencia, políticas transversales mediante wrappers, una experiencia pública más precisa y accesible y el flujo de descargas manuales. El checkout local de development queda en 52ef2ff con 160 commits; origin/main contiene la fusión de PR #50. Ambos Compose mantienen 17 servicios de aplicación y perfiles auxiliares documentados. La fecha automática de las páginas legales, las políticas de MinIO y la entrega firmada del ZIP están integradas; la carga y la validación de despliegue siguen pendientes.</w:t>
       </w:r>
     </w:p>
     <w:p/>

</xml_diff>

<commit_message>
Añadido manejo para cuando el mensaje de entrada para la IA semántica es demasiado corto, entonces cambiar el warning que aparece por uno que indique que no está roto, simplemente necesita más contexto.
</commit_message>
<xml_diff>
--- a/docs/informes/Informe_cronologico_Batch-Downloader_2026-07-28.docx
+++ b/docs/informes/Informe_cronologico_Batch-Downloader_2026-07-28.docx
@@ -11,41 +11,6 @@
         <w:rPr>
           <w:noProof/>
         </w:rPr>
-        <w:drawing>
-          <wp:inline distT="0" distB="0" distL="0" distR="0" wp14:anchorId="4D4AB4FE" wp14:editId="460E535B">
-            <wp:extent cx="4251960" cy="1135557"/>
-            <wp:effectExtent l="0" t="0" r="0" b="0"/>
-            <wp:docPr id="1" name="Picture 1" descr="Logotipo de Batch-Downloader con cajas y el nombre del proyecto" title="Batch-Downloader"/>
-            <wp:cNvGraphicFramePr>
-              <a:graphicFrameLocks xmlns:a="http://schemas.openxmlformats.org/drawingml/2006/main" noChangeAspect="1"/>
-            </wp:cNvGraphicFramePr>
-            <a:graphic xmlns:a="http://schemas.openxmlformats.org/drawingml/2006/main">
-              <a:graphicData uri="http://schemas.openxmlformats.org/drawingml/2006/picture">
-                <pic:pic xmlns:pic="http://schemas.openxmlformats.org/drawingml/2006/picture">
-                  <pic:nvPicPr>
-                    <pic:cNvPr id="0" name="BatchDownloaderI.png"/>
-                    <pic:cNvPicPr/>
-                  </pic:nvPicPr>
-                  <pic:blipFill>
-                    <a:blip r:embed="rId8"/>
-                    <a:stretch>
-                      <a:fillRect/>
-                    </a:stretch>
-                  </pic:blipFill>
-                  <pic:spPr>
-                    <a:xfrm>
-                      <a:off x="0" y="0"/>
-                      <a:ext cx="4251960" cy="1135557"/>
-                    </a:xfrm>
-                    <a:prstGeom prst="rect">
-                      <a:avLst/>
-                    </a:prstGeom>
-                  </pic:spPr>
-                </pic:pic>
-              </a:graphicData>
-            </a:graphic>
-          </wp:inline>
-        </w:drawing>
       </w:r>
     </w:p>
     <w:p>
@@ -108,16 +73,13 @@
       </w:r>
     </w:p>
     <w:p>
-      <w:r>
-        <w:br w:type="page"/>
-      </w:r>
+      <w:r/>
     </w:p>
     <w:p>
       <w:pPr>
         <w:pStyle w:val="Ttulo1"/>
       </w:pPr>
       <w:r>
-        <w:lastRenderedPageBreak/>
         <w:t>Resumen ejecutivo</w:t>
       </w:r>
     </w:p>
@@ -342,7 +304,6 @@
         </w:numPr>
       </w:pPr>
       <w:r>
-        <w:lastRenderedPageBreak/>
         <w:t>No se arrancó ni reinició la aplicación completa para preparar este informe. Los resultados desplegados y suites citados en fechas anteriores siguen siendo evidencia histórica. En esta ejecución se verificaron Git, configuración, ambos Compose de HEAD y el árbol LaTeX; no se repitieron suites ni se extrapolan validaciones históricas a los tres commits recientes.</w:t>
       </w:r>
     </w:p>
@@ -1473,7 +1434,6 @@
           </w:tcPr>
           <w:p>
             <w:r>
-              <w:lastRenderedPageBreak/>
               <w:t>19-24 ago</w:t>
             </w:r>
           </w:p>
@@ -1645,7 +1605,6 @@
           <w:b/>
           <w:color w:val="123A63"/>
         </w:rPr>
-        <w:lastRenderedPageBreak/>
         <w:t xml:space="preserve">Hito técnico: </w:t>
       </w:r>
       <w:r>
@@ -1724,7 +1683,6 @@
         <w:t xml:space="preserve">Los deadlocks durante claim podían matar workers y aparentar que solo uno trabajaba. Se añadieron reintentos, marcadores de inicio y recuperación de leases caducados o ausentes. El panel administrativo </w:t>
       </w:r>
       <w:r>
-        <w:lastRenderedPageBreak/>
         <w:t>recibió acciones para reparar atascadas, reintentar fallidas y limpiar finalizadas, además de métricas y WebSocket.</w:t>
       </w:r>
     </w:p>
@@ -1799,7 +1757,6 @@
     </w:p>
     <w:p>
       <w:r>
-        <w:lastRenderedPageBreak/>
         <w:t>Las pruebas de código quedaron completadas, pero la conversación terminó con una imagen antigua todavía desplegada y sin la verificación visual final de la reconstrucción. Por eso el hito se considera completado en código y posteriormente integrado, pero aquella sesión concreta fue parcial.</w:t>
       </w:r>
     </w:p>
@@ -1869,7 +1826,6 @@
     </w:p>
     <w:p>
       <w:r>
-        <w:lastRenderedPageBreak/>
         <w:t>El alta de una aplicación nueva se redujo a su web oficial, con URI por sistema operativo opcionales. Un trabajo persistente extrae metadatos permitidos, genera la descripción larga, busca instaladores y presenta una previsualización editable sin revelar enlaces ejecutables. Si no queda ningún candidato fiable tras la revalidación, la aplicación se conserva como missing en lugar de publicar una descarga dudosa.</w:t>
       </w:r>
     </w:p>
@@ -1918,7 +1874,6 @@
     </w:p>
     <w:p>
       <w:r>
-        <w:lastRenderedPageBreak/>
         <w:t>El contrato público de filtros se simplificó: todas las tags se combinan con AND, solo existe un editor activo y las facetas literales o semánticas se calculan tras aplicar búsqueda, estado, SO, arquitectura, tags y editor. Se retiraron tagMatchMin, tagMode público, coincidencias mínimas y el bloque de filtros activos; las URL antiguas se canonicalizan y existen controles para limpiar tags o editor. La tarea registró 87/87 pruebas frontend, 68/68 de Core, OpenAPI válido y build correcto; el cierre visual posterior llegó a 90/90 pruebas frontend, sin iniciar ni reiniciar la aplicación.</w:t>
       </w:r>
     </w:p>
@@ -2143,7 +2098,6 @@
         <w:rPr>
           <w:b/>
         </w:rPr>
-        <w:lastRenderedPageBreak/>
         <w:t>Solución:</w:t>
       </w:r>
       <w:r>
@@ -2408,7 +2362,6 @@
         <w:pStyle w:val="Ttulo2"/>
       </w:pPr>
       <w:r>
-        <w:lastRenderedPageBreak/>
         <w:t>9. Deriva entre código y memoria</w:t>
       </w:r>
     </w:p>
@@ -2591,7 +2544,6 @@
         <w:pStyle w:val="Ttulo2"/>
       </w:pPr>
       <w:r>
-        <w:lastRenderedPageBreak/>
         <w:t>13. Cobertura documental del código</w:t>
       </w:r>
     </w:p>
@@ -3796,6 +3748,22 @@
         <w:pStyle w:val="Ttulo1"/>
       </w:pPr>
       <w:r>
+        <w:t>1 de septiembre - Configuración del entorno de desarrollo</w:t>
+      </w:r>
+    </w:p>
+    <w:p>
+      <w:pPr>
+        <w:pStyle w:val="Ttulo1"/>
+      </w:pPr>
+      <w:r>
+        <w:t>El commit 3ba1028 incorporó argumentos JVM para el servidor de lenguaje Java de VS Code (ParallelGC, límite de 4 GiB y desactivación del mapeo de memoria ZIP). Es una mejora de configuración integrada; no se presenta como benchmark ni como cambio del runtime desplegado.</w:t>
+      </w:r>
+    </w:p>
+    <w:p>
+      <w:pPr>
+        <w:pStyle w:val="Ttulo1"/>
+      </w:pPr>
+      <w:r>
         <w:t>Pendientes y riesgos abiertos</w:t>
       </w:r>
     </w:p>
@@ -6303,7 +6271,7 @@
           </w:tcPr>
           <w:p>
             <w:r>
-              <w:t>Corte 27-08-2026</w:t>
+              <w:t>Corte 01-09-2026</w:t>
             </w:r>
           </w:p>
         </w:tc>
@@ -6313,7 +6281,7 @@
           </w:tcPr>
           <w:p>
             <w:r>
-              <w:t>HEAD local development 52ef2ff/160 commits; origin/main fusiona PR #50. Los workflows GHCR y Quality gate fueron correctos; las suites focalizadas registraron 276 Java, 244 scraper, 31 semánticas y 178 frontend. Compose/health/build Docker correctos; no se inició la aplicación. LaTeX sigue en 6c0649c/33 commits con cambios locales y sin PDF nuevo verificado.</w:t>
+              <w:t>HEAD local development 3ba1028/161 commits; origin/main fusiona PR #50. Los workflows GHCR y Quality gate fueron correctos; las suites focalizadas registraron 276 Java, 244 scraper, 31 semánticas y 178 frontend. Compose/health/build Docker correctos; no se inició la aplicación. LaTeX sigue en 6c0649c/33 commits con cambios locales y sin PDF nuevo verificado.</w:t>
             </w:r>
           </w:p>
         </w:tc>
@@ -6334,7 +6302,7 @@
     </w:p>
     <w:p>
       <w:r>
-        <w:t>Batch-Downloader ya integra un scraper con ámbitos y evidencia de ausencia, políticas transversales mediante wrappers, una experiencia pública más precisa y accesible y el flujo de descargas manuales. El checkout local de development queda en 52ef2ff con 160 commits; origin/main contiene la fusión de PR #50. Ambos Compose mantienen 17 servicios de aplicación y perfiles auxiliares documentados. La fecha automática de las páginas legales, las políticas de MinIO y la entrega firmada del ZIP están integradas; la carga y la validación de despliegue siguen pendientes.</w:t>
+        <w:t>Batch-Downloader ya integra un scraper con ámbitos y evidencia de ausencia, políticas transversales mediante wrappers, una experiencia pública más precisa y accesible y el flujo de descargas manuales. El checkout local de development queda en 3ba1028 con 161 commits; origin/main contiene la fusión de PR #50. Ambos Compose mantienen 17 servicios de aplicación y perfiles auxiliares documentados. La fecha automática de las páginas legales, las políticas de MinIO y la entrega firmada del ZIP están integradas; la carga y la validación de despliegue siguen pendientes.</w:t>
       </w:r>
     </w:p>
     <w:p/>

</xml_diff>

<commit_message>
docs: Update project evolution report with recent commits and analysis period extension
</commit_message>
<xml_diff>
--- a/docs/informes/Informe_cronologico_Batch-Downloader_2026-07-28.docx
+++ b/docs/informes/Informe_cronologico_Batch-Downloader_2026-07-28.docx
@@ -60,7 +60,7 @@
         <w:jc w:val="center"/>
       </w:pPr>
       <w:r>
-        <w:t>Periodo analizado: 16 de junio - 25 de agosto de 2026</w:t>
+        <w:t>Periodo analizado: 16 de junio - 2 de septiembre de 2026</w:t>
       </w:r>
     </w:p>
     <w:p>
@@ -69,7 +69,7 @@
         <w:jc w:val="center"/>
       </w:pPr>
       <w:r>
-        <w:t>Elaborado a partir de 23 conversaciones recuperadas, el historial Git y la evidencia local verificada</w:t>
+        <w:t>Elaborado a partir de las conversaciones recuperadas, el historial Git y la evidencia local verificada hasta el 2 de septiembre de 2026</w:t>
       </w:r>
     </w:p>
     <w:p>
@@ -95,7 +95,7 @@
         <w:ind w:left="259" w:right="173"/>
       </w:pPr>
       <w:r>
-        <w:t>El resultado verificado en Git es un monorepo en la rama development con 154 commits visibles y HEAD 9c9c48c. Desde el corte anterior se integraron dos commits: la fecha automática de actualización de las páginas legales y la ampliación del flujo de descargas con elementos manuales. El working tree contiene además una implementación local amplia de capacidad, retención, reintentos y reservas de almacenamiento, todavía no integrada ni validada como conjunto.</w:t>
+        <w:t>El resultado verificado en Git es un monorepo en la rama development con 165 commits visibles y HEAD e8f79f5. Desde el corte anterior se integraron cuatro commits: configuración JVM, cambios de autenticación/OAuth, retirada de la integración Google y prioridad de revisión del catálogo. Hay además cambios locales de una corrección de búsqueda semántica que todavía no están integrados.</w:t>
       </w:r>
     </w:p>
     <w:tbl>
@@ -136,7 +136,7 @@
           </w:tcPr>
           <w:p>
             <w:r>
-              <w:t>160</w:t>
+              <w:t>165</w:t>
             </w:r>
           </w:p>
         </w:tc>
@@ -3633,6 +3633,48 @@
           </w:p>
         </w:tc>
       </w:tr>
+      <w:tr>
+        <w:tc>
+          <w:tcPr>
+            <w:tcW w:type="dxa" w:w="1250"/>
+          </w:tcPr>
+          <w:p>
+            <w:r>
+              <w:t>1-2 sep</w:t>
+            </w:r>
+          </w:p>
+        </w:tc>
+        <w:tc>
+          <w:tcPr>
+            <w:tcW w:type="dxa" w:w="1250"/>
+          </w:tcPr>
+          <w:p>
+            <w:r>
+              <w:t>Catálogo, autenticación y búsqueda IA</w:t>
+            </w:r>
+          </w:p>
+        </w:tc>
+        <w:tc>
+          <w:tcPr>
+            <w:tcW w:type="dxa" w:w="3250"/>
+          </w:tcPr>
+          <w:p>
+            <w:r>
+              <w:t>Cuatro commits integrados; corrección semántica local con 6/6 y frontend 31/31, no integrada.</w:t>
+            </w:r>
+          </w:p>
+        </w:tc>
+        <w:tc>
+          <w:tcPr>
+            <w:tcW w:type="dxa" w:w="3610"/>
+          </w:tcPr>
+          <w:p>
+            <w:r>
+              <w:t>Integrar y revalidar la corrección; investigar el incidente temporal con métricas y ejecución repetible.</w:t>
+            </w:r>
+          </w:p>
+        </w:tc>
+      </w:tr>
     </w:tbl>
     <w:p>
       <w:pPr>
@@ -3757,6 +3799,26 @@
       </w:pPr>
       <w:r>
         <w:t>El commit 3ba1028 incorporó argumentos JVM para el servidor de lenguaje Java de VS Code (ParallelGC, límite de 4 GiB y desactivación del mapeo de memoria ZIP). Es una mejora de configuración integrada; no se presenta como benchmark ni como cambio del runtime desplegado.</w:t>
+      </w:r>
+    </w:p>
+    <w:p>
+      <w:pPr>
+        <w:pStyle w:val="Ttulo2"/>
+      </w:pPr>
+      <w:r>
+        <w:t>1-2 de septiembre - Catálogo, autenticación y descripciones IA</w:t>
+      </w:r>
+    </w:p>
+    <w:p>
+      <w:pPr/>
+      <w:r>
+        <w:t>HEAD avanzó desde 3ba1028/161 commits hasta e8f79f5/165 commits. Los cambios integrados incluyen la prioridad catalog_review_priority para ordenar e indexar el catálogo, una refactorización de autenticación/OAuth y la retirada explícita de la integración Google por coste de mantenimiento. Son cambios confirmados en Git; no se presenta ninguno como prueba de despliegue o benchmark.</w:t>
+      </w:r>
+    </w:p>
+    <w:p>
+      <w:pPr/>
+      <w:r>
+        <w:t>La tarea «Revisa la cola de descripciones IA» investigó un incidente temporal en el que el catálogo dejó de mostrar nuevas aplicaciones al alcanzar aproximadamente 5,5 mil registros. Los logs adjuntos muestran recuperación posterior y respuestas saludables, pero no permiten atribuir con certeza una causa única ni demostrar una ejecución global estable. La tarea dejó una corrección local para la búsqueda semántica: Core normaliza dos formas de rechazo por consulta demasiado corta a semantic_query_too_short y el frontend conserva el fallback literal con un aviso más preciso. La validación local fue 6/6 pruebas de SemanticSearchClient, 31/31 pruebas frontend, typecheck y build de producción (94,72 KiB gzip); estos cambios permanecen no integrados en el working tree.</w:t>
       </w:r>
     </w:p>
     <w:p>
@@ -5849,7 +5911,7 @@
         <w:pStyle w:val="Ttulo1"/>
       </w:pPr>
       <w:r>
-        <w:t>Apéndice B. Evidencia complementaria</w:t>
+        <w:t>Batch-Downloader integra un scraper con ámbitos y evidencia de ausencia, políticas transversales mediante wrappers, una experiencia pública más precisa y accesible y el flujo de descargas manuales. El checkout local de development queda en e8f79f5 con 165 commits; origin/main contiene la fusión de PR #50. Ambos Compose mantienen 17 servicios de aplicación y perfiles auxiliares documentados. Los cambios recientes de autenticación/OAuth y prioridad del catálogo están integrados; la corrección de consultas semánticas cortas y el incidente temporal del catálogo quedan como trabajo local/evidencia histórica no integrada. La carga, la validación de despliegue y la recompilación LaTeX siguen pendientes.</w:t>
       </w:r>
     </w:p>
     <w:tbl>
@@ -6282,6 +6344,28 @@
           <w:p>
             <w:r>
               <w:t>HEAD local development 3ba1028/161 commits; origin/main fusiona PR #50. Los workflows GHCR y Quality gate fueron correctos; las suites focalizadas registraron 276 Java, 244 scraper, 31 semánticas y 178 frontend. Compose/health/build Docker correctos; no se inició la aplicación. LaTeX sigue en 6c0649c/33 commits con cambios locales y sin PDF nuevo verificado.</w:t>
+            </w:r>
+          </w:p>
+        </w:tc>
+      </w:tr>
+      <w:tr>
+        <w:tc>
+          <w:tcPr>
+            <w:tcW w:type="dxa" w:w="2200"/>
+          </w:tcPr>
+          <w:p>
+            <w:r>
+              <w:t>Corte 02-09-2026</w:t>
+            </w:r>
+          </w:p>
+        </w:tc>
+        <w:tc>
+          <w:tcPr>
+            <w:tcW w:type="dxa" w:w="7160"/>
+          </w:tcPr>
+          <w:p>
+            <w:r>
+              <w:t>HEAD local development e8f79f5/165 commits. Cuatro commits posteriores al corte anterior están integrados. Se recuperó una tarea nueva sobre el catálogo y la cola IA; la corrección semántica validada localmente no está integrada. LaTeX sigue en 6c0649c/33 commits con cambios locales y sin PDF nuevo verificado.</w:t>
             </w:r>
           </w:p>
         </w:tc>

</xml_diff>

<commit_message>
Refactor searcher worker to handle selected scope without remote catalog; improve error handling for incomplete installer details; enhance version preference logic for downloads. Update validator to use specific user agent for SourceForge partial downloads. Add tests for local target resolution, installer compatibility, and database pool behavior under load. Update documentation to reflect recent changes and improvements in the Batch-Downloader project.
</commit_message>
<xml_diff>
--- a/docs/informes/Informe_cronologico_Batch-Downloader_2026-07-28.docx
+++ b/docs/informes/Informe_cronologico_Batch-Downloader_2026-07-28.docx
@@ -95,7 +95,7 @@
         <w:ind w:left="259" w:right="173"/>
       </w:pPr>
       <w:r>
-        <w:t>El resultado verificado en Git es un monorepo en la rama development con 165 commits visibles y HEAD e8f79f5. Desde el corte anterior se integraron cuatro commits: configuración JVM, cambios de autenticación/OAuth, retirada de la integración Google y prioridad de revisión del catálogo. Hay además cambios locales de una corrección de búsqueda semántica que todavía no están integrados.</w:t>
+        <w:t>El resultado verificado en Git es un monorepo en la rama development con 167 commits visibles y HEAD 5834478. Desde el corte anterior se integraron dos commits: la actualización del informe y la revisión de la política de contraseñas/verificación en backend, frontend, contratos y traducciones. Hay además cambios locales de una corrección del incidente de ordenación del catálogo que todavía no están integrados.</w:t>
       </w:r>
     </w:p>
     <w:tbl>
@@ -304,7 +304,7 @@
         </w:numPr>
       </w:pPr>
       <w:r>
-        <w:t>No se arrancó ni reinició la aplicación completa para preparar este informe. Los resultados desplegados y suites citados en fechas anteriores siguen siendo evidencia histórica. En esta ejecución se verificaron Git, configuración, ambos Compose de HEAD y el árbol LaTeX; no se repitieron suites ni se extrapolan validaciones históricas a los tres commits recientes.</w:t>
+        <w:t>No se arrancó ni reinició la aplicación completa para preparar este informe. Los resultados desplegados y suites citados en fechas anteriores siguen siendo evidencia histórica. En esta ejecución se verificaron Git, configuración, ambos Compose de HEAD y el árbol LaTeX; la corrección local del catálogo conserva validaciones focalizadas de su tarea de origen, pero no se reejecutaron aquí ni se extrapolan a un benchmark global.</w:t>
       </w:r>
     </w:p>
     <w:p>
@@ -3818,7 +3818,21 @@
     <w:p>
       <w:pPr/>
       <w:r>
-        <w:t>La tarea «Revisa la cola de descripciones IA» investigó un incidente temporal en el que el catálogo dejó de mostrar nuevas aplicaciones al alcanzar aproximadamente 5,5 mil registros. Los logs adjuntos muestran recuperación posterior y respuestas saludables, pero no permiten atribuir con certeza una causa única ni demostrar una ejecución global estable. La tarea dejó una corrección local para la búsqueda semántica: Core normaliza dos formas de rechazo por consulta demasiado corta a semantic_query_too_short y el frontend conserva el fallback literal con un aviso más preciso. La validación local fue 6/6 pruebas de SemanticSearchClient, 31/31 pruebas frontend, typecheck y build de producción (94,72 KiB gzip); estos cambios permanecen no integrados en el working tree.</w:t>
+        <w:t>La tarea "Revisa la cola de descripciones IA" investigó un incidente temporal en el que el catálogo dejó de mostrar nuevas aplicaciones al alcanzar aproximadamente 5,5 mil registros. La causa operativa identificada fue MySQL 1038 (Out of sort memory) al ordenar filas anchas con descripciones; la corrección local añade prioridad indexada, ordena primero IDs y carga después las fichas completas, además de optimizar el orden por descargas. La tarea reportó 100/100 peticiones concurrentes correctas, cero nuevos 1038/500, 5.786 aplicaciones visibles, migraciones Alembic 0019 y Flyway 15 aplicadas, 248 pruebas Python, 2 integraciones MySQL y 18 pruebas Java; permanece sin commit y sin revalidación en este informe. La misma tarea dejó una corrección local para consultas semánticas cortas: 6/6 pruebas de SemanticSearchClient, 31/31 frontend, typecheck y build de 94,72 KiB gzip; también permanece no integrada.</w:t>
+      </w:r>
+    </w:p>
+    <w:p>
+      <w:pPr>
+        <w:pStyle w:val="Ttulo1"/>
+      </w:pPr>
+      <w:r>
+        <w:t>3 de septiembre - Ordenación del catálogo y política de contraseñas</w:t>
+      </w:r>
+    </w:p>
+    <w:p>
+      <w:pPr/>
+      <w:r>
+        <w:t>5834478 integra ajustes de política de contraseñas y verificación en AuthRateLimiter, IdentityController, PasswordPolicy, AdminBootstrap, frontend de cuenta, traducciones y OpenAPI. No se repitieron aquí las suites. En paralelo, la tarea de cola IA dejó una corrección local del ordenamiento MySQL con evidencia focalizada de estabilidad; sigue pendiente integrar y validar el cambio en el checkout.</w:t>
       </w:r>
     </w:p>
     <w:p>
@@ -5911,7 +5925,7 @@
         <w:pStyle w:val="Ttulo1"/>
       </w:pPr>
       <w:r>
-        <w:t>Batch-Downloader integra un scraper con ámbitos y evidencia de ausencia, políticas transversales mediante wrappers, una experiencia pública más precisa y accesible y el flujo de descargas manuales. El checkout local de development queda en e8f79f5 con 165 commits; origin/main contiene la fusión de PR #50. Ambos Compose mantienen 17 servicios de aplicación y perfiles auxiliares documentados. Los cambios recientes de autenticación/OAuth y prioridad del catálogo están integrados; la corrección de consultas semánticas cortas y el incidente temporal del catálogo quedan como trabajo local/evidencia histórica no integrada. La carga, la validación de despliegue y la recompilación LaTeX siguen pendientes.</w:t>
+        <w:t>Batch-Downloader integra un scraper con ámbitos y evidencia de ausencia, políticas transversales mediante wrappers, una experiencia pública más precisa y accesible, el flujo de descargas manuales y la actualización de política de contraseñas/verificación de 5834478. El checkout local de development queda en 5834478 con 167 commits; origin/main contiene la fusión de PR #50. Ambos Compose mantienen 17 servicios de aplicación y perfiles auxiliares documentados. La corrección del incidente de memoria de ordenación y la corrección de consultas semánticas cortas quedan como trabajo local no integrado, aunque la primera tiene validación focalizada reportada. La carga, la validación de despliegue y la recompilación LaTeX siguen pendientes.</w:t>
       </w:r>
     </w:p>
     <w:tbl>
@@ -6386,7 +6400,7 @@
     </w:p>
     <w:p>
       <w:r>
-        <w:t>Batch-Downloader ya integra un scraper con ámbitos y evidencia de ausencia, políticas transversales mediante wrappers, una experiencia pública más precisa y accesible y el flujo de descargas manuales. El checkout local de development queda en 3ba1028 con 161 commits; origin/main contiene la fusión de PR #50. Ambos Compose mantienen 17 servicios de aplicación y perfiles auxiliares documentados. La fecha automática de las páginas legales, las políticas de MinIO y la entrega firmada del ZIP están integradas; la carga y la validación de despliegue siguen pendientes.</w:t>
+        <w:t>Batch-Downloader ya integra un scraper con ámbitos y evidencia de ausencia, políticas transversales mediante wrappers, una experiencia pública más precisa y accesible, el flujo de descargas manuales y la política de contraseñas/verificación actualizada. El checkout local de development queda en 5834478 con 167 commits; origin/main contiene la fusión de PR #50. Ambos Compose mantienen 17 servicios de aplicación y perfiles auxiliares documentados. La fecha automática de las páginas legales, las políticas de MinIO y la entrega firmada del ZIP están integradas; la corrección local del ordenamiento del catálogo tiene pruebas focalizadas pero no está integrada. La carga y la validación de despliegue siguen pendientes.</w:t>
       </w:r>
     </w:p>
     <w:p/>

</xml_diff>